<commit_message>
Deploying to gh-pages from @ Morrison-Lab/mds@e59c002b352eaf91d33442f69514ad4496770659 🚀
</commit_message>
<xml_diff>
--- a/proof-writing.docx
+++ b/proof-writing.docx
@@ -15,7 +15,7 @@
         <w:pStyle w:val="Date"/>
       </w:pPr>
       <w:r>
-        <w:t xml:space="preserve">Last modified: 2026-10-05 22:39:57 (PDT)</w:t>
+        <w:t xml:space="preserve">Last modified: 2026-10-05 23:02:44 (PDT)</w:t>
       </w:r>
     </w:p>
     <w:p>
@@ -3211,13 +3211,312 @@
       </w:r>
     </w:p>
     <w:bookmarkEnd w:id="21"/>
-    <w:bookmarkStart w:id="23" w:name="sec-further-reading"/>
+    <w:bookmarkStart w:id="27" w:name="sec-proof-by-induction"/>
     <w:p>
       <w:pPr>
         <w:pStyle w:val="Heading2"/>
       </w:pPr>
       <w:r>
-        <w:t xml:space="preserve">5 Further reading</w:t>
+        <w:t xml:space="preserve">5 Proof by induction</w:t>
+      </w:r>
+    </w:p>
+    <w:p>
+      <w:pPr>
+        <w:pStyle w:val="FirstParagraph"/>
+      </w:pPr>
+      <w:r>
+        <w:t xml:space="preserve">Many proofs in these notes show that a statement holds</w:t>
+      </w:r>
+      <w:r>
+        <w:t xml:space="preserve"> </w:t>
+      </w:r>
+      <w:r>
+        <w:t xml:space="preserve">for every</w:t>
+      </w:r>
+      <w:r>
+        <w:t xml:space="preserve"> </w:t>
+      </w:r>
+      <w:hyperlink r:id="rId22">
+        <w:r>
+          <w:rPr>
+            <w:rStyle w:val="Hyperlink"/>
+          </w:rPr>
+          <w:t xml:space="preserve">natural number</w:t>
+        </w:r>
+      </w:hyperlink>
+      <w:r>
+        <w:t xml:space="preserve"> </w:t>
+      </w:r>
+      <m:oMath>
+        <m:r>
+          <m:t>n</m:t>
+        </m:r>
+      </m:oMath>
+      <w:r>
+        <w:t xml:space="preserve">,</w:t>
+      </w:r>
+      <w:r>
+        <w:t xml:space="preserve"> </w:t>
+      </w:r>
+      <w:r>
+        <w:t xml:space="preserve">or for every integer</w:t>
+      </w:r>
+      <w:r>
+        <w:t xml:space="preserve"> </w:t>
+      </w:r>
+      <m:oMath>
+        <m:r>
+          <m:t>n</m:t>
+        </m:r>
+      </m:oMath>
+      <w:r>
+        <w:t xml:space="preserve"> </w:t>
+      </w:r>
+      <w:r>
+        <w:t xml:space="preserve">from some starting value on.</w:t>
+      </w:r>
+      <w:r>
+        <w:t xml:space="preserve"> </w:t>
+      </w:r>
+      <w:r>
+        <w:t xml:space="preserve">Checking the statement one</w:t>
+      </w:r>
+      <w:r>
+        <w:t xml:space="preserve"> </w:t>
+      </w:r>
+      <m:oMath>
+        <m:r>
+          <m:t>n</m:t>
+        </m:r>
+      </m:oMath>
+      <w:r>
+        <w:t xml:space="preserve"> </w:t>
+      </w:r>
+      <w:r>
+        <w:t xml:space="preserve">at a time would never finish;</w:t>
+      </w:r>
+      <w:r>
+        <w:t xml:space="preserve"> </w:t>
+      </w:r>
+      <w:r>
+        <w:t xml:space="preserve">induction proves it for all of them with two arguments.</w:t>
+      </w:r>
+    </w:p>
+    <w:bookmarkStart w:id="23" w:name="def-proof-by-induction"/>
+    <w:p>
+      <w:pPr>
+        <w:pStyle w:val="BodyText"/>
+      </w:pPr>
+      <w:r>
+        <w:rPr>
+          <w:b/>
+          <w:bCs/>
+        </w:rPr>
+        <w:t xml:space="preserve">Definition 2 (Proof by induction)</w:t>
+      </w:r>
+      <w:r>
+        <w:t xml:space="preserve"> </w:t>
+      </w:r>
+      <w:r>
+        <w:t xml:space="preserve">Let</w:t>
+      </w:r>
+      <w:r>
+        <w:t xml:space="preserve"> </w:t>
+      </w:r>
+      <m:oMath>
+        <m:sSub>
+          <m:e>
+            <m:r>
+              <m:t>n</m:t>
+            </m:r>
+          </m:e>
+          <m:sub>
+            <m:r>
+              <m:t>0</m:t>
+            </m:r>
+          </m:sub>
+        </m:sSub>
+      </m:oMath>
+      <w:r>
+        <w:t xml:space="preserve"> </w:t>
+      </w:r>
+      <w:r>
+        <w:t xml:space="preserve">be an integer,</w:t>
+      </w:r>
+      <w:r>
+        <w:t xml:space="preserve"> </w:t>
+      </w:r>
+      <w:r>
+        <w:t xml:space="preserve">and for each integer</w:t>
+      </w:r>
+      <w:r>
+        <w:t xml:space="preserve"> </w:t>
+      </w:r>
+      <m:oMath>
+        <m:r>
+          <m:t>n</m:t>
+        </m:r>
+        <m:r>
+          <m:rPr>
+            <m:sty m:val="p"/>
+          </m:rPr>
+          <m:t>≥</m:t>
+        </m:r>
+        <m:sSub>
+          <m:e>
+            <m:r>
+              <m:t>n</m:t>
+            </m:r>
+          </m:e>
+          <m:sub>
+            <m:r>
+              <m:t>0</m:t>
+            </m:r>
+          </m:sub>
+        </m:sSub>
+      </m:oMath>
+      <w:r>
+        <w:t xml:space="preserve"> </w:t>
+      </w:r>
+      <w:r>
+        <w:t xml:space="preserve">let</w:t>
+      </w:r>
+      <w:r>
+        <w:t xml:space="preserve"> </w:t>
+      </w:r>
+      <m:oMath>
+        <m:r>
+          <m:t>P</m:t>
+        </m:r>
+        <m:r>
+          <m:rPr>
+            <m:sty m:val="p"/>
+          </m:rPr>
+          <m:t>(</m:t>
+        </m:r>
+        <m:r>
+          <m:t>n</m:t>
+        </m:r>
+        <m:r>
+          <m:rPr>
+            <m:sty m:val="p"/>
+          </m:rPr>
+          <m:t>)</m:t>
+        </m:r>
+      </m:oMath>
+      <w:r>
+        <w:t xml:space="preserve"> </w:t>
+      </w:r>
+      <w:r>
+        <w:t xml:space="preserve">be a statement about</w:t>
+      </w:r>
+      <w:r>
+        <w:t xml:space="preserve"> </w:t>
+      </w:r>
+      <m:oMath>
+        <m:r>
+          <m:t>n</m:t>
+        </m:r>
+      </m:oMath>
+      <w:r>
+        <w:t xml:space="preserve">.</w:t>
+      </w:r>
+      <w:r>
+        <w:t xml:space="preserve"> </w:t>
+      </w:r>
+      <w:r>
+        <w:t xml:space="preserve">A</w:t>
+      </w:r>
+      <w:r>
+        <w:t xml:space="preserve"> </w:t>
+      </w:r>
+      <w:r>
+        <w:rPr>
+          <w:b/>
+          <w:bCs/>
+        </w:rPr>
+        <w:t xml:space="preserve">proof by induction</w:t>
+      </w:r>
+      <w:r>
+        <w:t xml:space="preserve"> </w:t>
+      </w:r>
+      <w:r>
+        <w:t xml:space="preserve">on</w:t>
+      </w:r>
+      <w:r>
+        <w:t xml:space="preserve"> </w:t>
+      </w:r>
+      <m:oMath>
+        <m:r>
+          <m:t>n</m:t>
+        </m:r>
+      </m:oMath>
+      <w:r>
+        <w:t xml:space="preserve"> </w:t>
+      </w:r>
+      <w:r>
+        <w:t xml:space="preserve">shows that</w:t>
+      </w:r>
+      <w:r>
+        <w:t xml:space="preserve"> </w:t>
+      </w:r>
+      <m:oMath>
+        <m:r>
+          <m:t>P</m:t>
+        </m:r>
+        <m:r>
+          <m:rPr>
+            <m:sty m:val="p"/>
+          </m:rPr>
+          <m:t>(</m:t>
+        </m:r>
+        <m:r>
+          <m:t>n</m:t>
+        </m:r>
+        <m:r>
+          <m:rPr>
+            <m:sty m:val="p"/>
+          </m:rPr>
+          <m:t>)</m:t>
+        </m:r>
+      </m:oMath>
+      <w:r>
+        <w:t xml:space="preserve"> </w:t>
+      </w:r>
+      <w:r>
+        <w:t xml:space="preserve">holds for every integer</w:t>
+      </w:r>
+      <w:r>
+        <w:t xml:space="preserve"> </w:t>
+      </w:r>
+      <m:oMath>
+        <m:r>
+          <m:t>n</m:t>
+        </m:r>
+        <m:r>
+          <m:rPr>
+            <m:sty m:val="p"/>
+          </m:rPr>
+          <m:t>≥</m:t>
+        </m:r>
+        <m:sSub>
+          <m:e>
+            <m:r>
+              <m:t>n</m:t>
+            </m:r>
+          </m:e>
+          <m:sub>
+            <m:r>
+              <m:t>0</m:t>
+            </m:r>
+          </m:sub>
+        </m:sSub>
+      </m:oMath>
+      <w:r>
+        <w:t xml:space="preserve"> </w:t>
+      </w:r>
+      <w:r>
+        <w:t xml:space="preserve">by showing two things:</w:t>
       </w:r>
     </w:p>
     <w:p>
@@ -3229,6 +3528,2920 @@
         </w:numPr>
       </w:pPr>
       <w:r>
+        <w:rPr>
+          <w:b/>
+          <w:bCs/>
+        </w:rPr>
+        <w:t xml:space="preserve">Base case:</w:t>
+      </w:r>
+      <w:r>
+        <w:t xml:space="preserve"> </w:t>
+      </w:r>
+      <m:oMath>
+        <m:r>
+          <m:t>P</m:t>
+        </m:r>
+        <m:r>
+          <m:rPr>
+            <m:sty m:val="p"/>
+          </m:rPr>
+          <m:t>(</m:t>
+        </m:r>
+        <m:sSub>
+          <m:e>
+            <m:r>
+              <m:t>n</m:t>
+            </m:r>
+          </m:e>
+          <m:sub>
+            <m:r>
+              <m:t>0</m:t>
+            </m:r>
+          </m:sub>
+        </m:sSub>
+        <m:r>
+          <m:rPr>
+            <m:sty m:val="p"/>
+          </m:rPr>
+          <m:t>)</m:t>
+        </m:r>
+      </m:oMath>
+      <w:r>
+        <w:t xml:space="preserve"> </w:t>
+      </w:r>
+      <w:r>
+        <w:t xml:space="preserve">holds.</w:t>
+      </w:r>
+    </w:p>
+    <w:p>
+      <w:pPr>
+        <w:pStyle w:val="Compact"/>
+        <w:numPr>
+          <w:ilvl w:val="0"/>
+          <w:numId w:val="1003"/>
+        </w:numPr>
+      </w:pPr>
+      <w:r>
+        <w:rPr>
+          <w:b/>
+          <w:bCs/>
+        </w:rPr>
+        <w:t xml:space="preserve">Inductive step:</w:t>
+      </w:r>
+      <w:r>
+        <w:t xml:space="preserve"> </w:t>
+      </w:r>
+      <w:r>
+        <w:t xml:space="preserve">for every integer</w:t>
+      </w:r>
+      <w:r>
+        <w:t xml:space="preserve"> </w:t>
+      </w:r>
+      <m:oMath>
+        <m:r>
+          <m:t>n</m:t>
+        </m:r>
+        <m:r>
+          <m:rPr>
+            <m:sty m:val="p"/>
+          </m:rPr>
+          <m:t>&gt;</m:t>
+        </m:r>
+        <m:sSub>
+          <m:e>
+            <m:r>
+              <m:t>n</m:t>
+            </m:r>
+          </m:e>
+          <m:sub>
+            <m:r>
+              <m:t>0</m:t>
+            </m:r>
+          </m:sub>
+        </m:sSub>
+      </m:oMath>
+      <w:r>
+        <w:t xml:space="preserve">,</w:t>
+      </w:r>
+      <w:r>
+        <w:t xml:space="preserve"> </w:t>
+      </w:r>
+      <w:r>
+        <w:t xml:space="preserve">if</w:t>
+      </w:r>
+      <w:r>
+        <w:t xml:space="preserve"> </w:t>
+      </w:r>
+      <m:oMath>
+        <m:r>
+          <m:t>P</m:t>
+        </m:r>
+        <m:r>
+          <m:rPr>
+            <m:sty m:val="p"/>
+          </m:rPr>
+          <m:t>(</m:t>
+        </m:r>
+        <m:r>
+          <m:t>n</m:t>
+        </m:r>
+        <m:r>
+          <m:rPr>
+            <m:sty m:val="p"/>
+          </m:rPr>
+          <m:t>−</m:t>
+        </m:r>
+        <m:r>
+          <m:t>1</m:t>
+        </m:r>
+        <m:r>
+          <m:rPr>
+            <m:sty m:val="p"/>
+          </m:rPr>
+          <m:t>)</m:t>
+        </m:r>
+      </m:oMath>
+      <w:r>
+        <w:t xml:space="preserve"> </w:t>
+      </w:r>
+      <w:r>
+        <w:t xml:space="preserve">holds, then</w:t>
+      </w:r>
+      <w:r>
+        <w:t xml:space="preserve"> </w:t>
+      </w:r>
+      <m:oMath>
+        <m:r>
+          <m:t>P</m:t>
+        </m:r>
+        <m:r>
+          <m:rPr>
+            <m:sty m:val="p"/>
+          </m:rPr>
+          <m:t>(</m:t>
+        </m:r>
+        <m:r>
+          <m:t>n</m:t>
+        </m:r>
+        <m:r>
+          <m:rPr>
+            <m:sty m:val="p"/>
+          </m:rPr>
+          <m:t>)</m:t>
+        </m:r>
+      </m:oMath>
+      <w:r>
+        <w:t xml:space="preserve"> </w:t>
+      </w:r>
+      <w:r>
+        <w:t xml:space="preserve">holds.</w:t>
+      </w:r>
+    </w:p>
+    <w:p>
+      <w:pPr>
+        <w:pStyle w:val="FirstParagraph"/>
+      </w:pPr>
+      <w:r>
+        <w:t xml:space="preserve">In the inductive step,</w:t>
+      </w:r>
+      <w:r>
+        <w:t xml:space="preserve"> </w:t>
+      </w:r>
+      <w:r>
+        <w:t xml:space="preserve">the assumption that</w:t>
+      </w:r>
+      <w:r>
+        <w:t xml:space="preserve"> </w:t>
+      </w:r>
+      <m:oMath>
+        <m:r>
+          <m:t>P</m:t>
+        </m:r>
+        <m:r>
+          <m:rPr>
+            <m:sty m:val="p"/>
+          </m:rPr>
+          <m:t>(</m:t>
+        </m:r>
+        <m:r>
+          <m:t>n</m:t>
+        </m:r>
+        <m:r>
+          <m:rPr>
+            <m:sty m:val="p"/>
+          </m:rPr>
+          <m:t>−</m:t>
+        </m:r>
+        <m:r>
+          <m:t>1</m:t>
+        </m:r>
+        <m:r>
+          <m:rPr>
+            <m:sty m:val="p"/>
+          </m:rPr>
+          <m:t>)</m:t>
+        </m:r>
+      </m:oMath>
+      <w:r>
+        <w:t xml:space="preserve"> </w:t>
+      </w:r>
+      <w:r>
+        <w:t xml:space="preserve">holds</w:t>
+      </w:r>
+      <w:r>
+        <w:t xml:space="preserve"> </w:t>
+      </w:r>
+      <w:r>
+        <w:t xml:space="preserve">is called the</w:t>
+      </w:r>
+      <w:r>
+        <w:t xml:space="preserve"> </w:t>
+      </w:r>
+      <w:r>
+        <w:rPr>
+          <w:b/>
+          <w:bCs/>
+        </w:rPr>
+        <w:t xml:space="preserve">induction hypothesis</w:t>
+      </w:r>
+      <w:r>
+        <w:t xml:space="preserve">.</w:t>
+      </w:r>
+    </w:p>
+    <w:bookmarkEnd w:id="23"/>
+    <w:bookmarkStart w:id="24" w:name="rem-induction-why"/>
+    <w:p>
+      <w:pPr>
+        <w:pStyle w:val="BodyText"/>
+      </w:pPr>
+      <w:r>
+        <w:rPr>
+          <w:i/>
+          <w:iCs/>
+        </w:rPr>
+        <w:t xml:space="preserve">Remark 1</w:t>
+      </w:r>
+      <w:r>
+        <w:t xml:space="preserve"> (Why the two steps suffice). </w:t>
+      </w:r>
+      <w:r>
+        <w:t xml:space="preserve">The base case gives</w:t>
+      </w:r>
+      <w:r>
+        <w:t xml:space="preserve"> </w:t>
+      </w:r>
+      <m:oMath>
+        <m:r>
+          <m:t>P</m:t>
+        </m:r>
+        <m:r>
+          <m:rPr>
+            <m:sty m:val="p"/>
+          </m:rPr>
+          <m:t>(</m:t>
+        </m:r>
+        <m:sSub>
+          <m:e>
+            <m:r>
+              <m:t>n</m:t>
+            </m:r>
+          </m:e>
+          <m:sub>
+            <m:r>
+              <m:t>0</m:t>
+            </m:r>
+          </m:sub>
+        </m:sSub>
+        <m:r>
+          <m:rPr>
+            <m:sty m:val="p"/>
+          </m:rPr>
+          <m:t>)</m:t>
+        </m:r>
+      </m:oMath>
+      <w:r>
+        <w:t xml:space="preserve">.</w:t>
+      </w:r>
+      <w:r>
+        <w:t xml:space="preserve"> </w:t>
+      </w:r>
+      <w:r>
+        <w:t xml:space="preserve">The inductive step with</w:t>
+      </w:r>
+      <w:r>
+        <w:t xml:space="preserve"> </w:t>
+      </w:r>
+      <m:oMath>
+        <m:r>
+          <m:t>n</m:t>
+        </m:r>
+        <m:r>
+          <m:rPr>
+            <m:sty m:val="p"/>
+          </m:rPr>
+          <m:t>=</m:t>
+        </m:r>
+        <m:sSub>
+          <m:e>
+            <m:r>
+              <m:t>n</m:t>
+            </m:r>
+          </m:e>
+          <m:sub>
+            <m:r>
+              <m:t>0</m:t>
+            </m:r>
+          </m:sub>
+        </m:sSub>
+        <m:r>
+          <m:rPr>
+            <m:sty m:val="p"/>
+          </m:rPr>
+          <m:t>+</m:t>
+        </m:r>
+        <m:r>
+          <m:t>1</m:t>
+        </m:r>
+      </m:oMath>
+      <w:r>
+        <w:t xml:space="preserve"> </w:t>
+      </w:r>
+      <w:r>
+        <w:t xml:space="preserve">then gives</w:t>
+      </w:r>
+      <w:r>
+        <w:t xml:space="preserve"> </w:t>
+      </w:r>
+      <m:oMath>
+        <m:r>
+          <m:t>P</m:t>
+        </m:r>
+        <m:r>
+          <m:rPr>
+            <m:sty m:val="p"/>
+          </m:rPr>
+          <m:t>(</m:t>
+        </m:r>
+        <m:sSub>
+          <m:e>
+            <m:r>
+              <m:t>n</m:t>
+            </m:r>
+          </m:e>
+          <m:sub>
+            <m:r>
+              <m:t>0</m:t>
+            </m:r>
+          </m:sub>
+        </m:sSub>
+        <m:r>
+          <m:rPr>
+            <m:sty m:val="p"/>
+          </m:rPr>
+          <m:t>+</m:t>
+        </m:r>
+        <m:r>
+          <m:t>1</m:t>
+        </m:r>
+        <m:r>
+          <m:rPr>
+            <m:sty m:val="p"/>
+          </m:rPr>
+          <m:t>)</m:t>
+        </m:r>
+      </m:oMath>
+      <w:r>
+        <w:t xml:space="preserve">,</w:t>
+      </w:r>
+      <w:r>
+        <w:t xml:space="preserve"> </w:t>
+      </w:r>
+      <w:r>
+        <w:t xml:space="preserve">with</w:t>
+      </w:r>
+      <w:r>
+        <w:t xml:space="preserve"> </w:t>
+      </w:r>
+      <m:oMath>
+        <m:r>
+          <m:t>n</m:t>
+        </m:r>
+        <m:r>
+          <m:rPr>
+            <m:sty m:val="p"/>
+          </m:rPr>
+          <m:t>=</m:t>
+        </m:r>
+        <m:sSub>
+          <m:e>
+            <m:r>
+              <m:t>n</m:t>
+            </m:r>
+          </m:e>
+          <m:sub>
+            <m:r>
+              <m:t>0</m:t>
+            </m:r>
+          </m:sub>
+        </m:sSub>
+        <m:r>
+          <m:rPr>
+            <m:sty m:val="p"/>
+          </m:rPr>
+          <m:t>+</m:t>
+        </m:r>
+        <m:r>
+          <m:t>2</m:t>
+        </m:r>
+      </m:oMath>
+      <w:r>
+        <w:t xml:space="preserve"> </w:t>
+      </w:r>
+      <w:r>
+        <w:t xml:space="preserve">it gives</w:t>
+      </w:r>
+      <w:r>
+        <w:t xml:space="preserve"> </w:t>
+      </w:r>
+      <m:oMath>
+        <m:r>
+          <m:t>P</m:t>
+        </m:r>
+        <m:r>
+          <m:rPr>
+            <m:sty m:val="p"/>
+          </m:rPr>
+          <m:t>(</m:t>
+        </m:r>
+        <m:sSub>
+          <m:e>
+            <m:r>
+              <m:t>n</m:t>
+            </m:r>
+          </m:e>
+          <m:sub>
+            <m:r>
+              <m:t>0</m:t>
+            </m:r>
+          </m:sub>
+        </m:sSub>
+        <m:r>
+          <m:rPr>
+            <m:sty m:val="p"/>
+          </m:rPr>
+          <m:t>+</m:t>
+        </m:r>
+        <m:r>
+          <m:t>2</m:t>
+        </m:r>
+        <m:r>
+          <m:rPr>
+            <m:sty m:val="p"/>
+          </m:rPr>
+          <m:t>)</m:t>
+        </m:r>
+      </m:oMath>
+      <w:r>
+        <w:t xml:space="preserve">,</w:t>
+      </w:r>
+      <w:r>
+        <w:t xml:space="preserve"> </w:t>
+      </w:r>
+      <w:r>
+        <w:t xml:space="preserve">and so on:</w:t>
+      </w:r>
+      <w:r>
+        <w:t xml:space="preserve"> </w:t>
+      </w:r>
+      <w:r>
+        <w:t xml:space="preserve">each integer</w:t>
+      </w:r>
+      <w:r>
+        <w:t xml:space="preserve"> </w:t>
+      </w:r>
+      <m:oMath>
+        <m:r>
+          <m:t>n</m:t>
+        </m:r>
+        <m:r>
+          <m:rPr>
+            <m:sty m:val="p"/>
+          </m:rPr>
+          <m:t>≥</m:t>
+        </m:r>
+        <m:sSub>
+          <m:e>
+            <m:r>
+              <m:t>n</m:t>
+            </m:r>
+          </m:e>
+          <m:sub>
+            <m:r>
+              <m:t>0</m:t>
+            </m:r>
+          </m:sub>
+        </m:sSub>
+      </m:oMath>
+      <w:r>
+        <w:t xml:space="preserve"> </w:t>
+      </w:r>
+      <w:r>
+        <w:t xml:space="preserve">is reached</w:t>
+      </w:r>
+      <w:r>
+        <w:t xml:space="preserve"> </w:t>
+      </w:r>
+      <w:r>
+        <w:t xml:space="preserve">after</w:t>
+      </w:r>
+      <w:r>
+        <w:t xml:space="preserve"> </w:t>
+      </w:r>
+      <m:oMath>
+        <m:r>
+          <m:t>n</m:t>
+        </m:r>
+        <m:r>
+          <m:rPr>
+            <m:sty m:val="p"/>
+          </m:rPr>
+          <m:t>−</m:t>
+        </m:r>
+        <m:sSub>
+          <m:e>
+            <m:r>
+              <m:t>n</m:t>
+            </m:r>
+          </m:e>
+          <m:sub>
+            <m:r>
+              <m:t>0</m:t>
+            </m:r>
+          </m:sub>
+        </m:sSub>
+      </m:oMath>
+      <w:r>
+        <w:t xml:space="preserve"> </w:t>
+      </w:r>
+      <w:r>
+        <w:t xml:space="preserve">uses of the inductive step.</w:t>
+      </w:r>
+    </w:p>
+    <w:p>
+      <w:pPr>
+        <w:pStyle w:val="BodyText"/>
+      </w:pPr>
+      <w:r>
+        <w:t xml:space="preserve">When</w:t>
+      </w:r>
+      <w:r>
+        <w:t xml:space="preserve"> </w:t>
+      </w:r>
+      <m:oMath>
+        <m:r>
+          <m:t>P</m:t>
+        </m:r>
+        <m:r>
+          <m:rPr>
+            <m:sty m:val="p"/>
+          </m:rPr>
+          <m:t>(</m:t>
+        </m:r>
+        <m:r>
+          <m:t>n</m:t>
+        </m:r>
+        <m:r>
+          <m:rPr>
+            <m:sty m:val="p"/>
+          </m:rPr>
+          <m:t>)</m:t>
+        </m:r>
+      </m:oMath>
+      <w:r>
+        <w:t xml:space="preserve"> </w:t>
+      </w:r>
+      <w:r>
+        <w:t xml:space="preserve">is needed only for</w:t>
+      </w:r>
+      <w:r>
+        <w:t xml:space="preserve"> </w:t>
+      </w:r>
+      <m:oMath>
+        <m:sSub>
+          <m:e>
+            <m:r>
+              <m:t>n</m:t>
+            </m:r>
+          </m:e>
+          <m:sub>
+            <m:r>
+              <m:t>0</m:t>
+            </m:r>
+          </m:sub>
+        </m:sSub>
+        <m:r>
+          <m:rPr>
+            <m:sty m:val="p"/>
+          </m:rPr>
+          <m:t>≤</m:t>
+        </m:r>
+        <m:r>
+          <m:t>n</m:t>
+        </m:r>
+        <m:r>
+          <m:rPr>
+            <m:sty m:val="p"/>
+          </m:rPr>
+          <m:t>≤</m:t>
+        </m:r>
+        <m:r>
+          <m:t>r</m:t>
+        </m:r>
+      </m:oMath>
+      <w:r>
+        <w:t xml:space="preserve">,</w:t>
+      </w:r>
+      <w:r>
+        <w:t xml:space="preserve"> </w:t>
+      </w:r>
+      <w:r>
+        <w:t xml:space="preserve">it is enough to show the inductive step for</w:t>
+      </w:r>
+      <w:r>
+        <w:t xml:space="preserve"> </w:t>
+      </w:r>
+      <m:oMath>
+        <m:sSub>
+          <m:e>
+            <m:r>
+              <m:t>n</m:t>
+            </m:r>
+          </m:e>
+          <m:sub>
+            <m:r>
+              <m:t>0</m:t>
+            </m:r>
+          </m:sub>
+        </m:sSub>
+        <m:r>
+          <m:rPr>
+            <m:sty m:val="p"/>
+          </m:rPr>
+          <m:t>&lt;</m:t>
+        </m:r>
+        <m:r>
+          <m:t>n</m:t>
+        </m:r>
+        <m:r>
+          <m:rPr>
+            <m:sty m:val="p"/>
+          </m:rPr>
+          <m:t>≤</m:t>
+        </m:r>
+        <m:r>
+          <m:t>r</m:t>
+        </m:r>
+      </m:oMath>
+      <w:r>
+        <w:t xml:space="preserve">;</w:t>
+      </w:r>
+      <w:r>
+        <w:t xml:space="preserve"> </w:t>
+      </w:r>
+      <w:r>
+        <w:t xml:space="preserve">the same chain then stops at</w:t>
+      </w:r>
+      <w:r>
+        <w:t xml:space="preserve"> </w:t>
+      </w:r>
+      <m:oMath>
+        <m:r>
+          <m:t>P</m:t>
+        </m:r>
+        <m:r>
+          <m:rPr>
+            <m:sty m:val="p"/>
+          </m:rPr>
+          <m:t>(</m:t>
+        </m:r>
+        <m:r>
+          <m:t>r</m:t>
+        </m:r>
+        <m:r>
+          <m:rPr>
+            <m:sty m:val="p"/>
+          </m:rPr>
+          <m:t>)</m:t>
+        </m:r>
+      </m:oMath>
+      <w:r>
+        <w:t xml:space="preserve">.</w:t>
+      </w:r>
+    </w:p>
+    <w:bookmarkEnd w:id="24"/>
+    <w:p>
+      <w:pPr>
+        <w:pStyle w:val="BodyText"/>
+      </w:pPr>
+      <w:r>
+        <w:t xml:space="preserve">The following example uses</w:t>
+      </w:r>
+      <w:r>
+        <w:t xml:space="preserve"> </w:t>
+      </w:r>
+      <w:hyperlink r:id="rId25">
+        <w:r>
+          <w:rPr>
+            <w:rStyle w:val="Hyperlink"/>
+          </w:rPr>
+          <w:t xml:space="preserve">summation notation</w:t>
+        </w:r>
+      </w:hyperlink>
+      <w:r>
+        <w:t xml:space="preserve">.</w:t>
+      </w:r>
+    </w:p>
+    <w:bookmarkStart w:id="26" w:name="exm-induction-sum"/>
+    <w:p>
+      <w:pPr>
+        <w:pStyle w:val="BodyText"/>
+      </w:pPr>
+      <w:r>
+        <w:rPr>
+          <w:b/>
+          <w:bCs/>
+        </w:rPr>
+        <w:t xml:space="preserve">Example 2 (Sum of the first</w:t>
+      </w:r>
+      <w:r>
+        <w:rPr>
+          <w:b/>
+          <w:bCs/>
+        </w:rPr>
+        <w:t xml:space="preserve"> </w:t>
+      </w:r>
+      <m:oMath>
+        <m:r>
+          <m:t>n</m:t>
+        </m:r>
+      </m:oMath>
+      <w:r>
+        <w:rPr>
+          <w:b/>
+          <w:bCs/>
+        </w:rPr>
+        <w:t xml:space="preserve"> </w:t>
+      </w:r>
+      <w:r>
+        <w:rPr>
+          <w:b/>
+          <w:bCs/>
+        </w:rPr>
+        <w:t xml:space="preserve">natural numbers)</w:t>
+      </w:r>
+      <w:r>
+        <w:t xml:space="preserve"> </w:t>
+      </w:r>
+      <w:r>
+        <w:t xml:space="preserve">For every</w:t>
+      </w:r>
+      <w:r>
+        <w:t xml:space="preserve"> </w:t>
+      </w:r>
+      <m:oMath>
+        <m:r>
+          <m:t>n</m:t>
+        </m:r>
+        <m:r>
+          <m:rPr>
+            <m:sty m:val="p"/>
+          </m:rPr>
+          <m:t>∈</m:t>
+        </m:r>
+        <m:r>
+          <m:rPr>
+            <m:scr m:val="double-struck"/>
+            <m:sty m:val="p"/>
+          </m:rPr>
+          <m:t>N</m:t>
+        </m:r>
+      </m:oMath>
+      <w:r>
+        <w:t xml:space="preserve">,</w:t>
+      </w:r>
+    </w:p>
+    <w:p>
+      <w:pPr>
+        <w:pStyle w:val="BodyText"/>
+      </w:pPr>
+      <m:oMathPara>
+        <m:oMathParaPr>
+          <m:jc m:val="center"/>
+        </m:oMathParaPr>
+        <m:oMath>
+          <m:nary>
+            <m:naryPr>
+              <m:chr m:val="∑"/>
+              <m:limLoc m:val="undOvr"/>
+              <m:subHide m:val="off"/>
+              <m:supHide m:val="off"/>
+            </m:naryPr>
+            <m:sub>
+              <m:r>
+                <m:t>i</m:t>
+              </m:r>
+              <m:r>
+                <m:rPr>
+                  <m:sty m:val="p"/>
+                </m:rPr>
+                <m:t>=</m:t>
+              </m:r>
+              <m:r>
+                <m:t>1</m:t>
+              </m:r>
+            </m:sub>
+            <m:sup>
+              <m:r>
+                <m:t>n</m:t>
+              </m:r>
+            </m:sup>
+            <m:e>
+              <m:r>
+                <m:t>i</m:t>
+              </m:r>
+            </m:e>
+          </m:nary>
+          <m:r>
+            <m:rPr>
+              <m:sty m:val="p"/>
+            </m:rPr>
+            <m:t>=</m:t>
+          </m:r>
+          <m:f>
+            <m:fPr>
+              <m:type m:val="bar"/>
+            </m:fPr>
+            <m:num>
+              <m:r>
+                <m:t>n</m:t>
+              </m:r>
+              <m:r>
+                <m:rPr>
+                  <m:sty m:val="p"/>
+                </m:rPr>
+                <m:t>(</m:t>
+              </m:r>
+              <m:r>
+                <m:t>n</m:t>
+              </m:r>
+              <m:r>
+                <m:rPr>
+                  <m:sty m:val="p"/>
+                </m:rPr>
+                <m:t>+</m:t>
+              </m:r>
+              <m:r>
+                <m:t>1</m:t>
+              </m:r>
+              <m:r>
+                <m:rPr>
+                  <m:sty m:val="p"/>
+                </m:rPr>
+                <m:t>)</m:t>
+              </m:r>
+            </m:num>
+            <m:den>
+              <m:r>
+                <m:t>2</m:t>
+              </m:r>
+            </m:den>
+          </m:f>
+          <m:r>
+            <m:rPr>
+              <m:sty m:val="p"/>
+            </m:rPr>
+            <m:t>.</m:t>
+          </m:r>
+        </m:oMath>
+      </m:oMathPara>
+    </w:p>
+    <w:p>
+      <w:pPr>
+        <w:pStyle w:val="FirstParagraph"/>
+      </w:pPr>
+      <w:r>
+        <w:t xml:space="preserve">For example, with</w:t>
+      </w:r>
+      <w:r>
+        <w:t xml:space="preserve"> </w:t>
+      </w:r>
+      <m:oMath>
+        <m:r>
+          <m:t>n</m:t>
+        </m:r>
+        <m:r>
+          <m:rPr>
+            <m:sty m:val="p"/>
+          </m:rPr>
+          <m:t>=</m:t>
+        </m:r>
+        <m:r>
+          <m:t>3</m:t>
+        </m:r>
+      </m:oMath>
+      <w:r>
+        <w:t xml:space="preserve">,</w:t>
+      </w:r>
+      <w:r>
+        <w:t xml:space="preserve"> </w:t>
+      </w:r>
+      <m:oMath>
+        <m:r>
+          <m:t>1</m:t>
+        </m:r>
+        <m:r>
+          <m:rPr>
+            <m:sty m:val="p"/>
+          </m:rPr>
+          <m:t>+</m:t>
+        </m:r>
+        <m:r>
+          <m:t>2</m:t>
+        </m:r>
+        <m:r>
+          <m:rPr>
+            <m:sty m:val="p"/>
+          </m:rPr>
+          <m:t>+</m:t>
+        </m:r>
+        <m:r>
+          <m:t>3</m:t>
+        </m:r>
+        <m:r>
+          <m:rPr>
+            <m:sty m:val="p"/>
+          </m:rPr>
+          <m:t>=</m:t>
+        </m:r>
+        <m:r>
+          <m:t>6</m:t>
+        </m:r>
+      </m:oMath>
+      <w:r>
+        <w:t xml:space="preserve"> </w:t>
+      </w:r>
+      <w:r>
+        <w:t xml:space="preserve">and</w:t>
+      </w:r>
+      <w:r>
+        <w:t xml:space="preserve"> </w:t>
+      </w:r>
+      <m:oMath>
+        <m:f>
+          <m:fPr>
+            <m:type m:val="bar"/>
+          </m:fPr>
+          <m:num>
+            <m:r>
+              <m:t>3</m:t>
+            </m:r>
+            <m:r>
+              <m:rPr>
+                <m:sty m:val="p"/>
+              </m:rPr>
+              <m:t>⋅</m:t>
+            </m:r>
+            <m:r>
+              <m:t>4</m:t>
+            </m:r>
+          </m:num>
+          <m:den>
+            <m:r>
+              <m:t>2</m:t>
+            </m:r>
+          </m:den>
+        </m:f>
+        <m:r>
+          <m:rPr>
+            <m:sty m:val="p"/>
+          </m:rPr>
+          <m:t>=</m:t>
+        </m:r>
+        <m:r>
+          <m:t>6</m:t>
+        </m:r>
+      </m:oMath>
+      <w:r>
+        <w:t xml:space="preserve">.</w:t>
+      </w:r>
+      <w:r>
+        <w:t xml:space="preserve"> </w:t>
+      </w:r>
+      <w:r>
+        <w:t xml:space="preserve">To prove the equation for every</w:t>
+      </w:r>
+      <w:r>
+        <w:t xml:space="preserve"> </w:t>
+      </w:r>
+      <m:oMath>
+        <m:r>
+          <m:t>n</m:t>
+        </m:r>
+      </m:oMath>
+      <w:r>
+        <w:t xml:space="preserve">,</w:t>
+      </w:r>
+      <w:r>
+        <w:t xml:space="preserve"> </w:t>
+      </w:r>
+      <w:r>
+        <w:t xml:space="preserve">let</w:t>
+      </w:r>
+      <w:r>
+        <w:t xml:space="preserve"> </w:t>
+      </w:r>
+      <m:oMath>
+        <m:r>
+          <m:t>P</m:t>
+        </m:r>
+        <m:r>
+          <m:rPr>
+            <m:sty m:val="p"/>
+          </m:rPr>
+          <m:t>(</m:t>
+        </m:r>
+        <m:r>
+          <m:t>n</m:t>
+        </m:r>
+        <m:r>
+          <m:rPr>
+            <m:sty m:val="p"/>
+          </m:rPr>
+          <m:t>)</m:t>
+        </m:r>
+      </m:oMath>
+      <w:r>
+        <w:t xml:space="preserve"> </w:t>
+      </w:r>
+      <w:r>
+        <w:t xml:space="preserve">be the equation and use</w:t>
+      </w:r>
+      <w:r>
+        <w:t xml:space="preserve"> </w:t>
+      </w:r>
+      <w:hyperlink w:anchor="def-proof-by-induction">
+        <w:r>
+          <w:rPr>
+            <w:rStyle w:val="Hyperlink"/>
+          </w:rPr>
+          <w:t xml:space="preserve">Definition 2</w:t>
+        </w:r>
+      </w:hyperlink>
+      <w:r>
+        <w:t xml:space="preserve"> </w:t>
+      </w:r>
+      <w:r>
+        <w:t xml:space="preserve">with</w:t>
+      </w:r>
+      <w:r>
+        <w:t xml:space="preserve"> </w:t>
+      </w:r>
+      <m:oMath>
+        <m:sSub>
+          <m:e>
+            <m:r>
+              <m:t>n</m:t>
+            </m:r>
+          </m:e>
+          <m:sub>
+            <m:r>
+              <m:t>0</m:t>
+            </m:r>
+          </m:sub>
+        </m:sSub>
+        <m:r>
+          <m:rPr>
+            <m:sty m:val="p"/>
+          </m:rPr>
+          <m:t>=</m:t>
+        </m:r>
+        <m:r>
+          <m:t>1</m:t>
+        </m:r>
+      </m:oMath>
+      <w:r>
+        <w:t xml:space="preserve">.</w:t>
+      </w:r>
+    </w:p>
+    <w:p>
+      <w:pPr>
+        <w:pStyle w:val="BodyText"/>
+      </w:pPr>
+      <w:r>
+        <w:rPr>
+          <w:b/>
+          <w:bCs/>
+        </w:rPr>
+        <w:t xml:space="preserve">Base case,</w:t>
+      </w:r>
+      <w:r>
+        <w:rPr>
+          <w:b/>
+          <w:bCs/>
+        </w:rPr>
+        <w:t xml:space="preserve"> </w:t>
+      </w:r>
+      <m:oMath>
+        <m:r>
+          <m:t>n</m:t>
+        </m:r>
+        <m:r>
+          <m:rPr>
+            <m:sty m:val="p"/>
+          </m:rPr>
+          <m:t>=</m:t>
+        </m:r>
+        <m:r>
+          <m:t>1</m:t>
+        </m:r>
+      </m:oMath>
+      <w:r>
+        <w:rPr>
+          <w:b/>
+          <w:bCs/>
+        </w:rPr>
+        <w:t xml:space="preserve">.</w:t>
+      </w:r>
+      <w:r>
+        <w:t xml:space="preserve"> </w:t>
+      </w:r>
+      <w:r>
+        <w:t xml:space="preserve">The sum has one term:</w:t>
+      </w:r>
+    </w:p>
+    <w:p>
+      <w:pPr>
+        <w:pStyle w:val="BodyText"/>
+      </w:pPr>
+      <m:oMathPara>
+        <m:oMathParaPr>
+          <m:jc m:val="center"/>
+        </m:oMathParaPr>
+        <m:oMath>
+          <m:eqArr>
+            <m:e>
+              <m:nary>
+                <m:naryPr>
+                  <m:chr m:val="∑"/>
+                  <m:limLoc m:val="undOvr"/>
+                  <m:subHide m:val="off"/>
+                  <m:supHide m:val="off"/>
+                </m:naryPr>
+                <m:sub>
+                  <m:r>
+                    <m:t>i</m:t>
+                  </m:r>
+                  <m:r>
+                    <m:rPr>
+                      <m:sty m:val="p"/>
+                    </m:rPr>
+                    <m:t>=</m:t>
+                  </m:r>
+                  <m:r>
+                    <m:t>1</m:t>
+                  </m:r>
+                </m:sub>
+                <m:sup>
+                  <m:r>
+                    <m:t>1</m:t>
+                  </m:r>
+                </m:sup>
+                <m:e>
+                  <m:r>
+                    <m:t>i</m:t>
+                  </m:r>
+                </m:e>
+              </m:nary>
+              <m:r>
+                <m:t>&amp;</m:t>
+              </m:r>
+              <m:r>
+                <m:rPr>
+                  <m:sty m:val="p"/>
+                </m:rPr>
+                <m:t>=</m:t>
+              </m:r>
+              <m:r>
+                <m:t>1</m:t>
+              </m:r>
+              <m:r>
+                <m:t>&amp;</m:t>
+              </m:r>
+              <m:r>
+                <m:t>&amp;</m:t>
+              </m:r>
+              <m:r>
+                <m:rPr>
+                  <m:nor/>
+                  <m:sty m:val="p"/>
+                </m:rPr>
+                <m:t>(definition of a sum)</m:t>
+              </m:r>
+            </m:e>
+          </m:eqArr>
+        </m:oMath>
+      </m:oMathPara>
+    </w:p>
+    <w:p>
+      <w:pPr>
+        <w:pStyle w:val="FirstParagraph"/>
+      </w:pPr>
+      <w:r>
+        <w:t xml:space="preserve">and the right side is</w:t>
+      </w:r>
+    </w:p>
+    <w:p>
+      <w:pPr>
+        <w:pStyle w:val="BodyText"/>
+      </w:pPr>
+      <m:oMathPara>
+        <m:oMathParaPr>
+          <m:jc m:val="center"/>
+        </m:oMathParaPr>
+        <m:oMath>
+          <m:eqArr>
+            <m:e>
+              <m:f>
+                <m:fPr>
+                  <m:type m:val="bar"/>
+                </m:fPr>
+                <m:num>
+                  <m:r>
+                    <m:t>1</m:t>
+                  </m:r>
+                  <m:r>
+                    <m:t> </m:t>
+                  </m:r>
+                  <m:r>
+                    <m:rPr>
+                      <m:sty m:val="p"/>
+                    </m:rPr>
+                    <m:t>(</m:t>
+                  </m:r>
+                  <m:r>
+                    <m:t>1</m:t>
+                  </m:r>
+                  <m:r>
+                    <m:rPr>
+                      <m:sty m:val="p"/>
+                    </m:rPr>
+                    <m:t>+</m:t>
+                  </m:r>
+                  <m:r>
+                    <m:t>1</m:t>
+                  </m:r>
+                  <m:r>
+                    <m:rPr>
+                      <m:sty m:val="p"/>
+                    </m:rPr>
+                    <m:t>)</m:t>
+                  </m:r>
+                </m:num>
+                <m:den>
+                  <m:r>
+                    <m:t>2</m:t>
+                  </m:r>
+                </m:den>
+              </m:f>
+              <m:r>
+                <m:t>&amp;</m:t>
+              </m:r>
+              <m:r>
+                <m:rPr>
+                  <m:sty m:val="p"/>
+                </m:rPr>
+                <m:t>=</m:t>
+              </m:r>
+              <m:f>
+                <m:fPr>
+                  <m:type m:val="bar"/>
+                </m:fPr>
+                <m:num>
+                  <m:r>
+                    <m:t>1</m:t>
+                  </m:r>
+                  <m:r>
+                    <m:rPr>
+                      <m:sty m:val="p"/>
+                    </m:rPr>
+                    <m:t>⋅</m:t>
+                  </m:r>
+                  <m:r>
+                    <m:t>2</m:t>
+                  </m:r>
+                </m:num>
+                <m:den>
+                  <m:r>
+                    <m:t>2</m:t>
+                  </m:r>
+                </m:den>
+              </m:f>
+              <m:r>
+                <m:t>&amp;</m:t>
+              </m:r>
+              <m:r>
+                <m:t>&amp;</m:t>
+              </m:r>
+              <m:r>
+                <m:rPr>
+                  <m:nor/>
+                  <m:sty m:val="p"/>
+                </m:rPr>
+                <m:t>(</m:t>
+              </m:r>
+              <m:r>
+                <m:t>1</m:t>
+              </m:r>
+              <m:r>
+                <m:rPr>
+                  <m:sty m:val="p"/>
+                </m:rPr>
+                <m:t>+</m:t>
+              </m:r>
+              <m:r>
+                <m:t>1</m:t>
+              </m:r>
+              <m:r>
+                <m:rPr>
+                  <m:sty m:val="p"/>
+                </m:rPr>
+                <m:t>=</m:t>
+              </m:r>
+              <m:r>
+                <m:t>2</m:t>
+              </m:r>
+              <m:r>
+                <m:rPr>
+                  <m:nor/>
+                  <m:sty m:val="p"/>
+                </m:rPr>
+                <m:t>)</m:t>
+              </m:r>
+            </m:e>
+            <m:e>
+              <m:r>
+                <m:t>&amp;</m:t>
+              </m:r>
+              <m:r>
+                <m:rPr>
+                  <m:sty m:val="p"/>
+                </m:rPr>
+                <m:t>=</m:t>
+              </m:r>
+              <m:f>
+                <m:fPr>
+                  <m:type m:val="bar"/>
+                </m:fPr>
+                <m:num>
+                  <m:r>
+                    <m:t>2</m:t>
+                  </m:r>
+                </m:num>
+                <m:den>
+                  <m:r>
+                    <m:t>2</m:t>
+                  </m:r>
+                </m:den>
+              </m:f>
+              <m:r>
+                <m:t>&amp;</m:t>
+              </m:r>
+              <m:r>
+                <m:t>&amp;</m:t>
+              </m:r>
+              <m:r>
+                <m:rPr>
+                  <m:nor/>
+                  <m:sty m:val="p"/>
+                </m:rPr>
+                <m:t>(</m:t>
+              </m:r>
+              <m:r>
+                <m:t>1</m:t>
+              </m:r>
+              <m:r>
+                <m:rPr>
+                  <m:sty m:val="p"/>
+                </m:rPr>
+                <m:t>⋅</m:t>
+              </m:r>
+              <m:r>
+                <m:t>2</m:t>
+              </m:r>
+              <m:r>
+                <m:rPr>
+                  <m:sty m:val="p"/>
+                </m:rPr>
+                <m:t>=</m:t>
+              </m:r>
+              <m:r>
+                <m:t>2</m:t>
+              </m:r>
+              <m:r>
+                <m:rPr>
+                  <m:nor/>
+                  <m:sty m:val="p"/>
+                </m:rPr>
+                <m:t>)</m:t>
+              </m:r>
+            </m:e>
+            <m:e>
+              <m:r>
+                <m:t>&amp;</m:t>
+              </m:r>
+              <m:r>
+                <m:rPr>
+                  <m:sty m:val="p"/>
+                </m:rPr>
+                <m:t>=</m:t>
+              </m:r>
+              <m:r>
+                <m:t>1</m:t>
+              </m:r>
+              <m:r>
+                <m:rPr>
+                  <m:sty m:val="p"/>
+                </m:rPr>
+                <m:t>.</m:t>
+              </m:r>
+              <m:r>
+                <m:t>&amp;</m:t>
+              </m:r>
+              <m:r>
+                <m:t>&amp;</m:t>
+              </m:r>
+              <m:r>
+                <m:rPr>
+                  <m:nor/>
+                  <m:sty m:val="p"/>
+                </m:rPr>
+                <m:t>(</m:t>
+              </m:r>
+              <m:f>
+                <m:fPr>
+                  <m:type m:val="lin"/>
+                </m:fPr>
+                <m:num>
+                  <m:r>
+                    <m:t>2</m:t>
+                  </m:r>
+                </m:num>
+                <m:den>
+                  <m:r>
+                    <m:t>2</m:t>
+                  </m:r>
+                </m:den>
+              </m:f>
+              <m:r>
+                <m:rPr>
+                  <m:sty m:val="p"/>
+                </m:rPr>
+                <m:t>=</m:t>
+              </m:r>
+              <m:r>
+                <m:t>1</m:t>
+              </m:r>
+              <m:r>
+                <m:rPr>
+                  <m:nor/>
+                  <m:sty m:val="p"/>
+                </m:rPr>
+                <m:t>)</m:t>
+              </m:r>
+            </m:e>
+          </m:eqArr>
+        </m:oMath>
+      </m:oMathPara>
+    </w:p>
+    <w:p>
+      <w:pPr>
+        <w:pStyle w:val="FirstParagraph"/>
+      </w:pPr>
+      <w:r>
+        <w:t xml:space="preserve">So</w:t>
+      </w:r>
+      <w:r>
+        <w:t xml:space="preserve"> </w:t>
+      </w:r>
+      <m:oMath>
+        <m:r>
+          <m:t>P</m:t>
+        </m:r>
+        <m:r>
+          <m:rPr>
+            <m:sty m:val="p"/>
+          </m:rPr>
+          <m:t>(</m:t>
+        </m:r>
+        <m:r>
+          <m:t>1</m:t>
+        </m:r>
+        <m:r>
+          <m:rPr>
+            <m:sty m:val="p"/>
+          </m:rPr>
+          <m:t>)</m:t>
+        </m:r>
+      </m:oMath>
+      <w:r>
+        <w:t xml:space="preserve"> </w:t>
+      </w:r>
+      <w:r>
+        <w:t xml:space="preserve">holds.</w:t>
+      </w:r>
+    </w:p>
+    <w:p>
+      <w:pPr>
+        <w:pStyle w:val="BodyText"/>
+      </w:pPr>
+      <w:r>
+        <w:rPr>
+          <w:b/>
+          <w:bCs/>
+        </w:rPr>
+        <w:t xml:space="preserve">Inductive step.</w:t>
+      </w:r>
+      <w:r>
+        <w:t xml:space="preserve"> </w:t>
+      </w:r>
+      <w:r>
+        <w:t xml:space="preserve">Let</w:t>
+      </w:r>
+      <w:r>
+        <w:t xml:space="preserve"> </w:t>
+      </w:r>
+      <m:oMath>
+        <m:r>
+          <m:t>n</m:t>
+        </m:r>
+        <m:r>
+          <m:rPr>
+            <m:sty m:val="p"/>
+          </m:rPr>
+          <m:t>≥</m:t>
+        </m:r>
+        <m:r>
+          <m:t>2</m:t>
+        </m:r>
+      </m:oMath>
+      <w:r>
+        <w:t xml:space="preserve">, and suppose</w:t>
+      </w:r>
+      <w:r>
+        <w:t xml:space="preserve"> </w:t>
+      </w:r>
+      <m:oMath>
+        <m:r>
+          <m:t>P</m:t>
+        </m:r>
+        <m:r>
+          <m:rPr>
+            <m:sty m:val="p"/>
+          </m:rPr>
+          <m:t>(</m:t>
+        </m:r>
+        <m:r>
+          <m:t>n</m:t>
+        </m:r>
+        <m:r>
+          <m:rPr>
+            <m:sty m:val="p"/>
+          </m:rPr>
+          <m:t>−</m:t>
+        </m:r>
+        <m:r>
+          <m:t>1</m:t>
+        </m:r>
+        <m:r>
+          <m:rPr>
+            <m:sty m:val="p"/>
+          </m:rPr>
+          <m:t>)</m:t>
+        </m:r>
+      </m:oMath>
+      <w:r>
+        <w:t xml:space="preserve"> </w:t>
+      </w:r>
+      <w:r>
+        <w:t xml:space="preserve">holds:</w:t>
+      </w:r>
+    </w:p>
+    <w:p>
+      <w:pPr>
+        <w:pStyle w:val="BodyText"/>
+      </w:pPr>
+      <m:oMathPara>
+        <m:oMathParaPr>
+          <m:jc m:val="center"/>
+        </m:oMathParaPr>
+        <m:oMath>
+          <m:nary>
+            <m:naryPr>
+              <m:chr m:val="∑"/>
+              <m:limLoc m:val="undOvr"/>
+              <m:subHide m:val="off"/>
+              <m:supHide m:val="off"/>
+            </m:naryPr>
+            <m:sub>
+              <m:r>
+                <m:t>i</m:t>
+              </m:r>
+              <m:r>
+                <m:rPr>
+                  <m:sty m:val="p"/>
+                </m:rPr>
+                <m:t>=</m:t>
+              </m:r>
+              <m:r>
+                <m:t>1</m:t>
+              </m:r>
+            </m:sub>
+            <m:sup>
+              <m:r>
+                <m:t>n</m:t>
+              </m:r>
+              <m:r>
+                <m:rPr>
+                  <m:sty m:val="p"/>
+                </m:rPr>
+                <m:t>−</m:t>
+              </m:r>
+              <m:r>
+                <m:t>1</m:t>
+              </m:r>
+            </m:sup>
+            <m:e>
+              <m:r>
+                <m:t>i</m:t>
+              </m:r>
+            </m:e>
+          </m:nary>
+          <m:r>
+            <m:rPr>
+              <m:sty m:val="p"/>
+            </m:rPr>
+            <m:t>=</m:t>
+          </m:r>
+          <m:f>
+            <m:fPr>
+              <m:type m:val="bar"/>
+            </m:fPr>
+            <m:num>
+              <m:r>
+                <m:rPr>
+                  <m:sty m:val="p"/>
+                </m:rPr>
+                <m:t>(</m:t>
+              </m:r>
+              <m:r>
+                <m:t>n</m:t>
+              </m:r>
+              <m:r>
+                <m:rPr>
+                  <m:sty m:val="p"/>
+                </m:rPr>
+                <m:t>−</m:t>
+              </m:r>
+              <m:r>
+                <m:t>1</m:t>
+              </m:r>
+              <m:r>
+                <m:rPr>
+                  <m:sty m:val="p"/>
+                </m:rPr>
+                <m:t>)</m:t>
+              </m:r>
+              <m:r>
+                <m:t> </m:t>
+              </m:r>
+              <m:r>
+                <m:t>​</m:t>
+              </m:r>
+              <m:d>
+                <m:dPr>
+                  <m:begChr m:val="("/>
+                  <m:sepChr m:val=""/>
+                  <m:endChr m:val=")"/>
+                  <m:grow/>
+                </m:dPr>
+                <m:e>
+                  <m:r>
+                    <m:rPr>
+                      <m:sty m:val="p"/>
+                    </m:rPr>
+                    <m:t>(</m:t>
+                  </m:r>
+                  <m:r>
+                    <m:t>n</m:t>
+                  </m:r>
+                  <m:r>
+                    <m:rPr>
+                      <m:sty m:val="p"/>
+                    </m:rPr>
+                    <m:t>−</m:t>
+                  </m:r>
+                  <m:r>
+                    <m:t>1</m:t>
+                  </m:r>
+                  <m:r>
+                    <m:rPr>
+                      <m:sty m:val="p"/>
+                    </m:rPr>
+                    <m:t>)</m:t>
+                  </m:r>
+                  <m:r>
+                    <m:rPr>
+                      <m:sty m:val="p"/>
+                    </m:rPr>
+                    <m:t>+</m:t>
+                  </m:r>
+                  <m:r>
+                    <m:t>1</m:t>
+                  </m:r>
+                </m:e>
+              </m:d>
+              <m:r>
+                <m:t>​</m:t>
+              </m:r>
+            </m:num>
+            <m:den>
+              <m:r>
+                <m:t>2</m:t>
+              </m:r>
+            </m:den>
+          </m:f>
+          <m:r>
+            <m:rPr>
+              <m:sty m:val="p"/>
+            </m:rPr>
+            <m:t>.</m:t>
+          </m:r>
+        </m:oMath>
+      </m:oMathPara>
+    </w:p>
+    <w:p>
+      <w:pPr>
+        <w:pStyle w:val="FirstParagraph"/>
+      </w:pPr>
+      <w:r>
+        <w:t xml:space="preserve">Then</w:t>
+      </w:r>
+    </w:p>
+    <w:p>
+      <w:pPr>
+        <w:pStyle w:val="BodyText"/>
+      </w:pPr>
+      <m:oMathPara>
+        <m:oMathParaPr>
+          <m:jc m:val="center"/>
+        </m:oMathParaPr>
+        <m:oMath>
+          <m:eqArr>
+            <m:e>
+              <m:nary>
+                <m:naryPr>
+                  <m:chr m:val="∑"/>
+                  <m:limLoc m:val="undOvr"/>
+                  <m:subHide m:val="off"/>
+                  <m:supHide m:val="off"/>
+                </m:naryPr>
+                <m:sub>
+                  <m:r>
+                    <m:t>i</m:t>
+                  </m:r>
+                  <m:r>
+                    <m:rPr>
+                      <m:sty m:val="p"/>
+                    </m:rPr>
+                    <m:t>=</m:t>
+                  </m:r>
+                  <m:r>
+                    <m:t>1</m:t>
+                  </m:r>
+                </m:sub>
+                <m:sup>
+                  <m:r>
+                    <m:t>n</m:t>
+                  </m:r>
+                </m:sup>
+                <m:e>
+                  <m:r>
+                    <m:t>i</m:t>
+                  </m:r>
+                </m:e>
+              </m:nary>
+              <m:r>
+                <m:t>&amp;</m:t>
+              </m:r>
+              <m:r>
+                <m:rPr>
+                  <m:sty m:val="p"/>
+                </m:rPr>
+                <m:t>=</m:t>
+              </m:r>
+              <m:r>
+                <m:t>1</m:t>
+              </m:r>
+              <m:r>
+                <m:rPr>
+                  <m:sty m:val="p"/>
+                </m:rPr>
+                <m:t>+</m:t>
+              </m:r>
+              <m:r>
+                <m:t>2</m:t>
+              </m:r>
+              <m:r>
+                <m:rPr>
+                  <m:sty m:val="p"/>
+                </m:rPr>
+                <m:t>+</m:t>
+              </m:r>
+              <m:r>
+                <m:rPr>
+                  <m:sty m:val="p"/>
+                </m:rPr>
+                <m:t>⋯</m:t>
+              </m:r>
+              <m:r>
+                <m:rPr>
+                  <m:sty m:val="p"/>
+                </m:rPr>
+                <m:t>+</m:t>
+              </m:r>
+              <m:r>
+                <m:rPr>
+                  <m:sty m:val="p"/>
+                </m:rPr>
+                <m:t>(</m:t>
+              </m:r>
+              <m:r>
+                <m:t>n</m:t>
+              </m:r>
+              <m:r>
+                <m:rPr>
+                  <m:sty m:val="p"/>
+                </m:rPr>
+                <m:t>−</m:t>
+              </m:r>
+              <m:r>
+                <m:t>1</m:t>
+              </m:r>
+              <m:r>
+                <m:rPr>
+                  <m:sty m:val="p"/>
+                </m:rPr>
+                <m:t>)</m:t>
+              </m:r>
+              <m:r>
+                <m:rPr>
+                  <m:sty m:val="p"/>
+                </m:rPr>
+                <m:t>+</m:t>
+              </m:r>
+              <m:r>
+                <m:t>n</m:t>
+              </m:r>
+              <m:r>
+                <m:t>&amp;</m:t>
+              </m:r>
+              <m:r>
+                <m:t>&amp;</m:t>
+              </m:r>
+              <m:r>
+                <m:rPr>
+                  <m:nor/>
+                  <m:sty m:val="p"/>
+                </m:rPr>
+                <m:t>(definition of a sum)</m:t>
+              </m:r>
+            </m:e>
+            <m:e>
+              <m:r>
+                <m:t>&amp;</m:t>
+              </m:r>
+              <m:r>
+                <m:rPr>
+                  <m:sty m:val="p"/>
+                </m:rPr>
+                <m:t>=</m:t>
+              </m:r>
+              <m:r>
+                <m:t>​</m:t>
+              </m:r>
+              <m:d>
+                <m:dPr>
+                  <m:begChr m:val="("/>
+                  <m:sepChr m:val=""/>
+                  <m:endChr m:val=")"/>
+                  <m:grow/>
+                </m:dPr>
+                <m:e>
+                  <m:r>
+                    <m:t>1</m:t>
+                  </m:r>
+                  <m:r>
+                    <m:rPr>
+                      <m:sty m:val="p"/>
+                    </m:rPr>
+                    <m:t>+</m:t>
+                  </m:r>
+                  <m:r>
+                    <m:t>2</m:t>
+                  </m:r>
+                  <m:r>
+                    <m:rPr>
+                      <m:sty m:val="p"/>
+                    </m:rPr>
+                    <m:t>+</m:t>
+                  </m:r>
+                  <m:r>
+                    <m:rPr>
+                      <m:sty m:val="p"/>
+                    </m:rPr>
+                    <m:t>⋯</m:t>
+                  </m:r>
+                  <m:r>
+                    <m:rPr>
+                      <m:sty m:val="p"/>
+                    </m:rPr>
+                    <m:t>+</m:t>
+                  </m:r>
+                  <m:r>
+                    <m:rPr>
+                      <m:sty m:val="p"/>
+                    </m:rPr>
+                    <m:t>(</m:t>
+                  </m:r>
+                  <m:r>
+                    <m:t>n</m:t>
+                  </m:r>
+                  <m:r>
+                    <m:rPr>
+                      <m:sty m:val="p"/>
+                    </m:rPr>
+                    <m:t>−</m:t>
+                  </m:r>
+                  <m:r>
+                    <m:t>1</m:t>
+                  </m:r>
+                  <m:r>
+                    <m:rPr>
+                      <m:sty m:val="p"/>
+                    </m:rPr>
+                    <m:t>)</m:t>
+                  </m:r>
+                </m:e>
+              </m:d>
+              <m:r>
+                <m:t>​</m:t>
+              </m:r>
+              <m:r>
+                <m:rPr>
+                  <m:sty m:val="p"/>
+                </m:rPr>
+                <m:t>+</m:t>
+              </m:r>
+              <m:r>
+                <m:t>n</m:t>
+              </m:r>
+              <m:r>
+                <m:t>&amp;</m:t>
+              </m:r>
+              <m:r>
+                <m:t>&amp;</m:t>
+              </m:r>
+              <m:r>
+                <m:rPr>
+                  <m:nor/>
+                  <m:sty m:val="p"/>
+                </m:rPr>
+                <m:t>(associative law)</m:t>
+              </m:r>
+            </m:e>
+            <m:e>
+              <m:r>
+                <m:t>&amp;</m:t>
+              </m:r>
+              <m:r>
+                <m:rPr>
+                  <m:sty m:val="p"/>
+                </m:rPr>
+                <m:t>=</m:t>
+              </m:r>
+              <m:nary>
+                <m:naryPr>
+                  <m:chr m:val="∑"/>
+                  <m:limLoc m:val="undOvr"/>
+                  <m:subHide m:val="off"/>
+                  <m:supHide m:val="off"/>
+                </m:naryPr>
+                <m:sub>
+                  <m:r>
+                    <m:t>i</m:t>
+                  </m:r>
+                  <m:r>
+                    <m:rPr>
+                      <m:sty m:val="p"/>
+                    </m:rPr>
+                    <m:t>=</m:t>
+                  </m:r>
+                  <m:r>
+                    <m:t>1</m:t>
+                  </m:r>
+                </m:sub>
+                <m:sup>
+                  <m:r>
+                    <m:t>n</m:t>
+                  </m:r>
+                  <m:r>
+                    <m:rPr>
+                      <m:sty m:val="p"/>
+                    </m:rPr>
+                    <m:t>−</m:t>
+                  </m:r>
+                  <m:r>
+                    <m:t>1</m:t>
+                  </m:r>
+                </m:sup>
+                <m:e>
+                  <m:r>
+                    <m:t>i</m:t>
+                  </m:r>
+                </m:e>
+              </m:nary>
+              <m:r>
+                <m:rPr>
+                  <m:sty m:val="p"/>
+                </m:rPr>
+                <m:t>+</m:t>
+              </m:r>
+              <m:r>
+                <m:t>n</m:t>
+              </m:r>
+              <m:r>
+                <m:t>&amp;</m:t>
+              </m:r>
+              <m:r>
+                <m:t>&amp;</m:t>
+              </m:r>
+              <m:r>
+                <m:rPr>
+                  <m:nor/>
+                  <m:sty m:val="p"/>
+                </m:rPr>
+                <m:t>(definition of a sum)</m:t>
+              </m:r>
+            </m:e>
+            <m:e>
+              <m:r>
+                <m:t>&amp;</m:t>
+              </m:r>
+              <m:r>
+                <m:rPr>
+                  <m:sty m:val="p"/>
+                </m:rPr>
+                <m:t>=</m:t>
+              </m:r>
+              <m:f>
+                <m:fPr>
+                  <m:type m:val="bar"/>
+                </m:fPr>
+                <m:num>
+                  <m:r>
+                    <m:rPr>
+                      <m:sty m:val="p"/>
+                    </m:rPr>
+                    <m:t>(</m:t>
+                  </m:r>
+                  <m:r>
+                    <m:t>n</m:t>
+                  </m:r>
+                  <m:r>
+                    <m:rPr>
+                      <m:sty m:val="p"/>
+                    </m:rPr>
+                    <m:t>−</m:t>
+                  </m:r>
+                  <m:r>
+                    <m:t>1</m:t>
+                  </m:r>
+                  <m:r>
+                    <m:rPr>
+                      <m:sty m:val="p"/>
+                    </m:rPr>
+                    <m:t>)</m:t>
+                  </m:r>
+                  <m:r>
+                    <m:t> </m:t>
+                  </m:r>
+                  <m:r>
+                    <m:t>​</m:t>
+                  </m:r>
+                  <m:d>
+                    <m:dPr>
+                      <m:begChr m:val="("/>
+                      <m:sepChr m:val=""/>
+                      <m:endChr m:val=")"/>
+                      <m:grow/>
+                    </m:dPr>
+                    <m:e>
+                      <m:r>
+                        <m:rPr>
+                          <m:sty m:val="p"/>
+                        </m:rPr>
+                        <m:t>(</m:t>
+                      </m:r>
+                      <m:r>
+                        <m:t>n</m:t>
+                      </m:r>
+                      <m:r>
+                        <m:rPr>
+                          <m:sty m:val="p"/>
+                        </m:rPr>
+                        <m:t>−</m:t>
+                      </m:r>
+                      <m:r>
+                        <m:t>1</m:t>
+                      </m:r>
+                      <m:r>
+                        <m:rPr>
+                          <m:sty m:val="p"/>
+                        </m:rPr>
+                        <m:t>)</m:t>
+                      </m:r>
+                      <m:r>
+                        <m:rPr>
+                          <m:sty m:val="p"/>
+                        </m:rPr>
+                        <m:t>+</m:t>
+                      </m:r>
+                      <m:r>
+                        <m:t>1</m:t>
+                      </m:r>
+                    </m:e>
+                  </m:d>
+                  <m:r>
+                    <m:t>​</m:t>
+                  </m:r>
+                </m:num>
+                <m:den>
+                  <m:r>
+                    <m:t>2</m:t>
+                  </m:r>
+                </m:den>
+              </m:f>
+              <m:r>
+                <m:rPr>
+                  <m:sty m:val="p"/>
+                </m:rPr>
+                <m:t>+</m:t>
+              </m:r>
+              <m:r>
+                <m:t>n</m:t>
+              </m:r>
+              <m:r>
+                <m:t>&amp;</m:t>
+              </m:r>
+              <m:r>
+                <m:t>&amp;</m:t>
+              </m:r>
+              <m:r>
+                <m:rPr>
+                  <m:nor/>
+                  <m:sty m:val="p"/>
+                </m:rPr>
+                <m:t>(induction hypothesis)</m:t>
+              </m:r>
+            </m:e>
+            <m:e>
+              <m:r>
+                <m:t>&amp;</m:t>
+              </m:r>
+              <m:r>
+                <m:rPr>
+                  <m:sty m:val="p"/>
+                </m:rPr>
+                <m:t>=</m:t>
+              </m:r>
+              <m:f>
+                <m:fPr>
+                  <m:type m:val="bar"/>
+                </m:fPr>
+                <m:num>
+                  <m:r>
+                    <m:rPr>
+                      <m:sty m:val="p"/>
+                    </m:rPr>
+                    <m:t>(</m:t>
+                  </m:r>
+                  <m:r>
+                    <m:t>n</m:t>
+                  </m:r>
+                  <m:r>
+                    <m:rPr>
+                      <m:sty m:val="p"/>
+                    </m:rPr>
+                    <m:t>−</m:t>
+                  </m:r>
+                  <m:r>
+                    <m:t>1</m:t>
+                  </m:r>
+                  <m:r>
+                    <m:rPr>
+                      <m:sty m:val="p"/>
+                    </m:rPr>
+                    <m:t>)</m:t>
+                  </m:r>
+                  <m:r>
+                    <m:t> </m:t>
+                  </m:r>
+                  <m:r>
+                    <m:t>n</m:t>
+                  </m:r>
+                </m:num>
+                <m:den>
+                  <m:r>
+                    <m:t>2</m:t>
+                  </m:r>
+                </m:den>
+              </m:f>
+              <m:r>
+                <m:rPr>
+                  <m:sty m:val="p"/>
+                </m:rPr>
+                <m:t>+</m:t>
+              </m:r>
+              <m:r>
+                <m:t>n</m:t>
+              </m:r>
+              <m:r>
+                <m:t>&amp;</m:t>
+              </m:r>
+              <m:r>
+                <m:t>&amp;</m:t>
+              </m:r>
+              <m:r>
+                <m:rPr>
+                  <m:nor/>
+                  <m:sty m:val="p"/>
+                </m:rPr>
+                <m:t>(</m:t>
+              </m:r>
+              <m:r>
+                <m:rPr>
+                  <m:sty m:val="p"/>
+                </m:rPr>
+                <m:t>(</m:t>
+              </m:r>
+              <m:r>
+                <m:t>n</m:t>
+              </m:r>
+              <m:r>
+                <m:rPr>
+                  <m:sty m:val="p"/>
+                </m:rPr>
+                <m:t>−</m:t>
+              </m:r>
+              <m:r>
+                <m:t>1</m:t>
+              </m:r>
+              <m:r>
+                <m:rPr>
+                  <m:sty m:val="p"/>
+                </m:rPr>
+                <m:t>)</m:t>
+              </m:r>
+              <m:r>
+                <m:rPr>
+                  <m:sty m:val="p"/>
+                </m:rPr>
+                <m:t>+</m:t>
+              </m:r>
+              <m:r>
+                <m:t>1</m:t>
+              </m:r>
+              <m:r>
+                <m:rPr>
+                  <m:sty m:val="p"/>
+                </m:rPr>
+                <m:t>=</m:t>
+              </m:r>
+              <m:r>
+                <m:t>n</m:t>
+              </m:r>
+              <m:r>
+                <m:rPr>
+                  <m:nor/>
+                  <m:sty m:val="p"/>
+                </m:rPr>
+                <m:t>)</m:t>
+              </m:r>
+            </m:e>
+            <m:e>
+              <m:r>
+                <m:t>&amp;</m:t>
+              </m:r>
+              <m:r>
+                <m:rPr>
+                  <m:sty m:val="p"/>
+                </m:rPr>
+                <m:t>=</m:t>
+              </m:r>
+              <m:f>
+                <m:fPr>
+                  <m:type m:val="bar"/>
+                </m:fPr>
+                <m:num>
+                  <m:r>
+                    <m:rPr>
+                      <m:sty m:val="p"/>
+                    </m:rPr>
+                    <m:t>(</m:t>
+                  </m:r>
+                  <m:r>
+                    <m:t>n</m:t>
+                  </m:r>
+                  <m:r>
+                    <m:rPr>
+                      <m:sty m:val="p"/>
+                    </m:rPr>
+                    <m:t>−</m:t>
+                  </m:r>
+                  <m:r>
+                    <m:t>1</m:t>
+                  </m:r>
+                  <m:r>
+                    <m:rPr>
+                      <m:sty m:val="p"/>
+                    </m:rPr>
+                    <m:t>)</m:t>
+                  </m:r>
+                  <m:r>
+                    <m:t> </m:t>
+                  </m:r>
+                  <m:r>
+                    <m:t>n</m:t>
+                  </m:r>
+                </m:num>
+                <m:den>
+                  <m:r>
+                    <m:t>2</m:t>
+                  </m:r>
+                </m:den>
+              </m:f>
+              <m:r>
+                <m:rPr>
+                  <m:sty m:val="p"/>
+                </m:rPr>
+                <m:t>+</m:t>
+              </m:r>
+              <m:f>
+                <m:fPr>
+                  <m:type m:val="bar"/>
+                </m:fPr>
+                <m:num>
+                  <m:r>
+                    <m:t>2</m:t>
+                  </m:r>
+                  <m:r>
+                    <m:t>n</m:t>
+                  </m:r>
+                </m:num>
+                <m:den>
+                  <m:r>
+                    <m:t>2</m:t>
+                  </m:r>
+                </m:den>
+              </m:f>
+              <m:r>
+                <m:t>&amp;</m:t>
+              </m:r>
+              <m:r>
+                <m:t>&amp;</m:t>
+              </m:r>
+              <m:r>
+                <m:rPr>
+                  <m:nor/>
+                  <m:sty m:val="p"/>
+                </m:rPr>
+                <m:t>(</m:t>
+              </m:r>
+              <m:r>
+                <m:t>n</m:t>
+              </m:r>
+              <m:r>
+                <m:rPr>
+                  <m:sty m:val="p"/>
+                </m:rPr>
+                <m:t>=</m:t>
+              </m:r>
+              <m:f>
+                <m:fPr>
+                  <m:type m:val="lin"/>
+                </m:fPr>
+                <m:num>
+                  <m:r>
+                    <m:t>2</m:t>
+                  </m:r>
+                  <m:r>
+                    <m:t>n</m:t>
+                  </m:r>
+                </m:num>
+                <m:den>
+                  <m:r>
+                    <m:t>2</m:t>
+                  </m:r>
+                </m:den>
+              </m:f>
+              <m:r>
+                <m:rPr>
+                  <m:nor/>
+                  <m:sty m:val="p"/>
+                </m:rPr>
+                <m:t>)</m:t>
+              </m:r>
+            </m:e>
+            <m:e>
+              <m:r>
+                <m:t>&amp;</m:t>
+              </m:r>
+              <m:r>
+                <m:rPr>
+                  <m:sty m:val="p"/>
+                </m:rPr>
+                <m:t>=</m:t>
+              </m:r>
+              <m:f>
+                <m:fPr>
+                  <m:type m:val="bar"/>
+                </m:fPr>
+                <m:num>
+                  <m:r>
+                    <m:rPr>
+                      <m:sty m:val="p"/>
+                    </m:rPr>
+                    <m:t>(</m:t>
+                  </m:r>
+                  <m:r>
+                    <m:t>n</m:t>
+                  </m:r>
+                  <m:r>
+                    <m:rPr>
+                      <m:sty m:val="p"/>
+                    </m:rPr>
+                    <m:t>−</m:t>
+                  </m:r>
+                  <m:r>
+                    <m:t>1</m:t>
+                  </m:r>
+                  <m:r>
+                    <m:rPr>
+                      <m:sty m:val="p"/>
+                    </m:rPr>
+                    <m:t>)</m:t>
+                  </m:r>
+                  <m:r>
+                    <m:t> </m:t>
+                  </m:r>
+                  <m:r>
+                    <m:t>n</m:t>
+                  </m:r>
+                  <m:r>
+                    <m:rPr>
+                      <m:sty m:val="p"/>
+                    </m:rPr>
+                    <m:t>+</m:t>
+                  </m:r>
+                  <m:r>
+                    <m:t>2</m:t>
+                  </m:r>
+                  <m:r>
+                    <m:t>n</m:t>
+                  </m:r>
+                </m:num>
+                <m:den>
+                  <m:r>
+                    <m:t>2</m:t>
+                  </m:r>
+                </m:den>
+              </m:f>
+              <m:r>
+                <m:t>&amp;</m:t>
+              </m:r>
+              <m:r>
+                <m:t>&amp;</m:t>
+              </m:r>
+              <m:r>
+                <m:rPr>
+                  <m:nor/>
+                  <m:sty m:val="p"/>
+                </m:rPr>
+                <m:t>(common denominator)</m:t>
+              </m:r>
+            </m:e>
+            <m:e>
+              <m:r>
+                <m:t>&amp;</m:t>
+              </m:r>
+              <m:r>
+                <m:rPr>
+                  <m:sty m:val="p"/>
+                </m:rPr>
+                <m:t>=</m:t>
+              </m:r>
+              <m:f>
+                <m:fPr>
+                  <m:type m:val="bar"/>
+                </m:fPr>
+                <m:num>
+                  <m:r>
+                    <m:t>​</m:t>
+                  </m:r>
+                  <m:d>
+                    <m:dPr>
+                      <m:begChr m:val="("/>
+                      <m:sepChr m:val=""/>
+                      <m:endChr m:val=")"/>
+                      <m:grow/>
+                    </m:dPr>
+                    <m:e>
+                      <m:r>
+                        <m:rPr>
+                          <m:sty m:val="p"/>
+                        </m:rPr>
+                        <m:t>(</m:t>
+                      </m:r>
+                      <m:r>
+                        <m:t>n</m:t>
+                      </m:r>
+                      <m:r>
+                        <m:rPr>
+                          <m:sty m:val="p"/>
+                        </m:rPr>
+                        <m:t>−</m:t>
+                      </m:r>
+                      <m:r>
+                        <m:t>1</m:t>
+                      </m:r>
+                      <m:r>
+                        <m:rPr>
+                          <m:sty m:val="p"/>
+                        </m:rPr>
+                        <m:t>)</m:t>
+                      </m:r>
+                      <m:r>
+                        <m:rPr>
+                          <m:sty m:val="p"/>
+                        </m:rPr>
+                        <m:t>+</m:t>
+                      </m:r>
+                      <m:r>
+                        <m:t>2</m:t>
+                      </m:r>
+                    </m:e>
+                  </m:d>
+                  <m:r>
+                    <m:t>​</m:t>
+                  </m:r>
+                  <m:r>
+                    <m:t> </m:t>
+                  </m:r>
+                  <m:r>
+                    <m:t>n</m:t>
+                  </m:r>
+                </m:num>
+                <m:den>
+                  <m:r>
+                    <m:t>2</m:t>
+                  </m:r>
+                </m:den>
+              </m:f>
+              <m:r>
+                <m:t>&amp;</m:t>
+              </m:r>
+              <m:r>
+                <m:t>&amp;</m:t>
+              </m:r>
+              <m:r>
+                <m:rPr>
+                  <m:nor/>
+                  <m:sty m:val="p"/>
+                </m:rPr>
+                <m:t>(distributive law)</m:t>
+              </m:r>
+            </m:e>
+            <m:e>
+              <m:r>
+                <m:t>&amp;</m:t>
+              </m:r>
+              <m:r>
+                <m:rPr>
+                  <m:sty m:val="p"/>
+                </m:rPr>
+                <m:t>=</m:t>
+              </m:r>
+              <m:f>
+                <m:fPr>
+                  <m:type m:val="bar"/>
+                </m:fPr>
+                <m:num>
+                  <m:r>
+                    <m:rPr>
+                      <m:sty m:val="p"/>
+                    </m:rPr>
+                    <m:t>(</m:t>
+                  </m:r>
+                  <m:r>
+                    <m:t>n</m:t>
+                  </m:r>
+                  <m:r>
+                    <m:rPr>
+                      <m:sty m:val="p"/>
+                    </m:rPr>
+                    <m:t>+</m:t>
+                  </m:r>
+                  <m:r>
+                    <m:t>1</m:t>
+                  </m:r>
+                  <m:r>
+                    <m:rPr>
+                      <m:sty m:val="p"/>
+                    </m:rPr>
+                    <m:t>)</m:t>
+                  </m:r>
+                  <m:r>
+                    <m:t> </m:t>
+                  </m:r>
+                  <m:r>
+                    <m:t>n</m:t>
+                  </m:r>
+                </m:num>
+                <m:den>
+                  <m:r>
+                    <m:t>2</m:t>
+                  </m:r>
+                </m:den>
+              </m:f>
+              <m:r>
+                <m:t>&amp;</m:t>
+              </m:r>
+              <m:r>
+                <m:t>&amp;</m:t>
+              </m:r>
+              <m:r>
+                <m:rPr>
+                  <m:nor/>
+                  <m:sty m:val="p"/>
+                </m:rPr>
+                <m:t>(</m:t>
+              </m:r>
+              <m:r>
+                <m:rPr>
+                  <m:sty m:val="p"/>
+                </m:rPr>
+                <m:t>(</m:t>
+              </m:r>
+              <m:r>
+                <m:t>n</m:t>
+              </m:r>
+              <m:r>
+                <m:rPr>
+                  <m:sty m:val="p"/>
+                </m:rPr>
+                <m:t>−</m:t>
+              </m:r>
+              <m:r>
+                <m:t>1</m:t>
+              </m:r>
+              <m:r>
+                <m:rPr>
+                  <m:sty m:val="p"/>
+                </m:rPr>
+                <m:t>)</m:t>
+              </m:r>
+              <m:r>
+                <m:rPr>
+                  <m:sty m:val="p"/>
+                </m:rPr>
+                <m:t>+</m:t>
+              </m:r>
+              <m:r>
+                <m:t>2</m:t>
+              </m:r>
+              <m:r>
+                <m:rPr>
+                  <m:sty m:val="p"/>
+                </m:rPr>
+                <m:t>=</m:t>
+              </m:r>
+              <m:r>
+                <m:t>n</m:t>
+              </m:r>
+              <m:r>
+                <m:rPr>
+                  <m:sty m:val="p"/>
+                </m:rPr>
+                <m:t>+</m:t>
+              </m:r>
+              <m:r>
+                <m:t>1</m:t>
+              </m:r>
+              <m:r>
+                <m:rPr>
+                  <m:nor/>
+                  <m:sty m:val="p"/>
+                </m:rPr>
+                <m:t>)</m:t>
+              </m:r>
+            </m:e>
+            <m:e>
+              <m:r>
+                <m:t>&amp;</m:t>
+              </m:r>
+              <m:r>
+                <m:rPr>
+                  <m:sty m:val="p"/>
+                </m:rPr>
+                <m:t>=</m:t>
+              </m:r>
+              <m:f>
+                <m:fPr>
+                  <m:type m:val="bar"/>
+                </m:fPr>
+                <m:num>
+                  <m:r>
+                    <m:t>n</m:t>
+                  </m:r>
+                  <m:r>
+                    <m:rPr>
+                      <m:sty m:val="p"/>
+                    </m:rPr>
+                    <m:t>(</m:t>
+                  </m:r>
+                  <m:r>
+                    <m:t>n</m:t>
+                  </m:r>
+                  <m:r>
+                    <m:rPr>
+                      <m:sty m:val="p"/>
+                    </m:rPr>
+                    <m:t>+</m:t>
+                  </m:r>
+                  <m:r>
+                    <m:t>1</m:t>
+                  </m:r>
+                  <m:r>
+                    <m:rPr>
+                      <m:sty m:val="p"/>
+                    </m:rPr>
+                    <m:t>)</m:t>
+                  </m:r>
+                </m:num>
+                <m:den>
+                  <m:r>
+                    <m:t>2</m:t>
+                  </m:r>
+                </m:den>
+              </m:f>
+              <m:r>
+                <m:rPr>
+                  <m:sty m:val="p"/>
+                </m:rPr>
+                <m:t>,</m:t>
+              </m:r>
+              <m:r>
+                <m:t>&amp;</m:t>
+              </m:r>
+              <m:r>
+                <m:t>&amp;</m:t>
+              </m:r>
+              <m:r>
+                <m:rPr>
+                  <m:nor/>
+                  <m:sty m:val="p"/>
+                </m:rPr>
+                <m:t>(commutative law)</m:t>
+              </m:r>
+            </m:e>
+          </m:eqArr>
+        </m:oMath>
+      </m:oMathPara>
+    </w:p>
+    <w:p>
+      <w:pPr>
+        <w:pStyle w:val="FirstParagraph"/>
+      </w:pPr>
+      <w:r>
+        <w:t xml:space="preserve">which is</w:t>
+      </w:r>
+      <w:r>
+        <w:t xml:space="preserve"> </w:t>
+      </w:r>
+      <m:oMath>
+        <m:r>
+          <m:t>P</m:t>
+        </m:r>
+        <m:r>
+          <m:rPr>
+            <m:sty m:val="p"/>
+          </m:rPr>
+          <m:t>(</m:t>
+        </m:r>
+        <m:r>
+          <m:t>n</m:t>
+        </m:r>
+        <m:r>
+          <m:rPr>
+            <m:sty m:val="p"/>
+          </m:rPr>
+          <m:t>)</m:t>
+        </m:r>
+      </m:oMath>
+      <w:r>
+        <w:t xml:space="preserve">.</w:t>
+      </w:r>
+      <w:r>
+        <w:t xml:space="preserve"> </w:t>
+      </w:r>
+      <w:r>
+        <w:t xml:space="preserve">By</w:t>
+      </w:r>
+      <w:r>
+        <w:t xml:space="preserve"> </w:t>
+      </w:r>
+      <w:hyperlink w:anchor="def-proof-by-induction">
+        <w:r>
+          <w:rPr>
+            <w:rStyle w:val="Hyperlink"/>
+          </w:rPr>
+          <w:t xml:space="preserve">Definition 2</w:t>
+        </w:r>
+      </w:hyperlink>
+      <w:r>
+        <w:t xml:space="preserve">,</w:t>
+      </w:r>
+      <w:r>
+        <w:t xml:space="preserve"> </w:t>
+      </w:r>
+      <w:r>
+        <w:t xml:space="preserve">the equation holds for every</w:t>
+      </w:r>
+      <w:r>
+        <w:t xml:space="preserve"> </w:t>
+      </w:r>
+      <m:oMath>
+        <m:r>
+          <m:t>n</m:t>
+        </m:r>
+        <m:r>
+          <m:rPr>
+            <m:sty m:val="p"/>
+          </m:rPr>
+          <m:t>∈</m:t>
+        </m:r>
+        <m:r>
+          <m:rPr>
+            <m:scr m:val="double-struck"/>
+            <m:sty m:val="p"/>
+          </m:rPr>
+          <m:t>N</m:t>
+        </m:r>
+      </m:oMath>
+      <w:r>
+        <w:t xml:space="preserve">.</w:t>
+      </w:r>
+    </w:p>
+    <w:bookmarkEnd w:id="26"/>
+    <w:bookmarkEnd w:id="27"/>
+    <w:bookmarkStart w:id="29" w:name="sec-further-reading"/>
+    <w:p>
+      <w:pPr>
+        <w:pStyle w:val="Heading2"/>
+      </w:pPr>
+      <w:r>
+        <w:t xml:space="preserve">6 Further reading</w:t>
+      </w:r>
+    </w:p>
+    <w:p>
+      <w:pPr>
+        <w:pStyle w:val="Compact"/>
+        <w:numPr>
+          <w:ilvl w:val="0"/>
+          <w:numId w:val="1004"/>
+        </w:numPr>
+      </w:pPr>
+      <w:r>
         <w:t xml:space="preserve">Velleman (2019)</w:t>
       </w:r>
       <w:r>
@@ -3246,7 +6459,7 @@
       <w:r>
         <w:t xml:space="preserve"> </w:t>
       </w:r>
-      <w:hyperlink r:id="rId22">
+      <w:hyperlink r:id="rId28">
         <w:r>
           <w:rPr>
             <w:rStyle w:val="Hyperlink"/>
@@ -3263,7 +6476,7 @@
         <w:pStyle w:val="Compact"/>
         <w:numPr>
           <w:ilvl w:val="0"/>
-          <w:numId w:val="1003"/>
+          <w:numId w:val="1004"/>
         </w:numPr>
       </w:pPr>
       <w:r>
@@ -3276,8 +6489,8 @@
         <w:t xml:space="preserve">treats proofs as formal derivations in propositional and first-order logic.</w:t>
       </w:r>
     </w:p>
-    <w:bookmarkEnd w:id="23"/>
-    <w:bookmarkStart w:id="29" w:name="references"/>
+    <w:bookmarkEnd w:id="29"/>
+    <w:bookmarkStart w:id="35" w:name="references"/>
     <w:p>
       <w:pPr>
         <w:pStyle w:val="Heading2"/>
@@ -3286,8 +6499,8 @@
         <w:t xml:space="preserve">References</w:t>
       </w:r>
     </w:p>
-    <w:bookmarkStart w:id="28" w:name="refs"/>
-    <w:bookmarkStart w:id="25" w:name="ref-barkerplummer2011language"/>
+    <w:bookmarkStart w:id="34" w:name="refs"/>
+    <w:bookmarkStart w:id="31" w:name="ref-barkerplummer2011language"/>
     <w:p>
       <w:pPr>
         <w:pStyle w:val="Bibliography"/>
@@ -3311,7 +6524,7 @@
       <w:r>
         <w:t xml:space="preserve"> </w:t>
       </w:r>
-      <w:hyperlink r:id="rId24">
+      <w:hyperlink r:id="rId30">
         <w:r>
           <w:rPr>
             <w:rStyle w:val="Hyperlink"/>
@@ -3323,8 +6536,8 @@
         <w:t xml:space="preserve">.</w:t>
       </w:r>
     </w:p>
-    <w:bookmarkEnd w:id="25"/>
-    <w:bookmarkStart w:id="27" w:name="ref-velleman2019prove"/>
+    <w:bookmarkEnd w:id="31"/>
+    <w:bookmarkStart w:id="33" w:name="ref-velleman2019prove"/>
     <w:p>
       <w:pPr>
         <w:pStyle w:val="Bibliography"/>
@@ -3348,7 +6561,7 @@
       <w:r>
         <w:t xml:space="preserve"> </w:t>
       </w:r>
-      <w:hyperlink r:id="rId26">
+      <w:hyperlink r:id="rId32">
         <w:r>
           <w:rPr>
             <w:rStyle w:val="Hyperlink"/>
@@ -3360,9 +6573,9 @@
         <w:t xml:space="preserve">.</w:t>
       </w:r>
     </w:p>
-    <w:bookmarkEnd w:id="27"/>
-    <w:bookmarkEnd w:id="28"/>
-    <w:bookmarkEnd w:id="29"/>
+    <w:bookmarkEnd w:id="33"/>
+    <w:bookmarkEnd w:id="34"/>
+    <w:bookmarkEnd w:id="35"/>
     <w:sectPr>
       <w:footnotePr>
         <w:numRestart w:val="eachSect"/>
@@ -3698,6 +6911,36 @@
     </w:lvlOverride>
   </w:num>
   <w:num w:numId="1003">
+    <w:abstractNumId w:val="99411"/>
+    <w:lvlOverride w:ilvl="0">
+      <w:startOverride w:val="1"/>
+    </w:lvlOverride>
+    <w:lvlOverride w:ilvl="1">
+      <w:startOverride w:val="1"/>
+    </w:lvlOverride>
+    <w:lvlOverride w:ilvl="2">
+      <w:startOverride w:val="1"/>
+    </w:lvlOverride>
+    <w:lvlOverride w:ilvl="3">
+      <w:startOverride w:val="1"/>
+    </w:lvlOverride>
+    <w:lvlOverride w:ilvl="4">
+      <w:startOverride w:val="1"/>
+    </w:lvlOverride>
+    <w:lvlOverride w:ilvl="5">
+      <w:startOverride w:val="1"/>
+    </w:lvlOverride>
+    <w:lvlOverride w:ilvl="6">
+      <w:startOverride w:val="1"/>
+    </w:lvlOverride>
+    <w:lvlOverride w:ilvl="7">
+      <w:startOverride w:val="1"/>
+    </w:lvlOverride>
+    <w:lvlOverride w:ilvl="8">
+      <w:startOverride w:val="1"/>
+    </w:lvlOverride>
+  </w:num>
+  <w:num w:numId="1004">
     <w:abstractNumId w:val="991"/>
   </w:num>
 </w:numbering>

</xml_diff>

<commit_message>
Deploying to gh-pages from @ Morrison-Lab/mds@eb57f34b6ffef440c390b0bc8c52a0911a62c323 🚀
</commit_message>
<xml_diff>
--- a/proof-writing.docx
+++ b/proof-writing.docx
@@ -15,7 +15,7 @@
         <w:pStyle w:val="Date"/>
       </w:pPr>
       <w:r>
-        <w:t xml:space="preserve">Last modified: 2026-10-05 23:02:44 (PDT)</w:t>
+        <w:t xml:space="preserve">Last modified: 2026-10-05 23:27:13 (PDT)</w:t>
       </w:r>
     </w:p>
     <w:p>
@@ -1445,370 +1445,75 @@
       </w:r>
     </w:p>
     <w:bookmarkEnd w:id="17"/>
-    <w:bookmarkStart w:id="20" w:name="sec-induction"/>
+    <w:bookmarkStart w:id="18" w:name="sec-golden-rule"/>
     <w:p>
       <w:pPr>
         <w:pStyle w:val="Heading2"/>
       </w:pPr>
       <w:r>
-        <w:t xml:space="preserve">3 Proof by induction</w:t>
-      </w:r>
-    </w:p>
-    <w:bookmarkStart w:id="18" w:name="def-proof-by-induction"/>
-    <w:p>
-      <w:pPr>
-        <w:pStyle w:val="FirstParagraph"/>
-      </w:pPr>
-      <w:r>
-        <w:rPr>
-          <w:b/>
-          <w:bCs/>
-        </w:rPr>
-        <w:t xml:space="preserve">Definition 1 (Proof by induction)</w:t>
-      </w:r>
-      <w:r>
-        <w:t xml:space="preserve"> </w:t>
-      </w:r>
-      <w:r>
-        <w:t xml:space="preserve">To prove that a statement</w:t>
-      </w:r>
-      <w:r>
-        <w:t xml:space="preserve"> </w:t>
-      </w:r>
-      <m:oMath>
-        <m:r>
-          <m:t>P</m:t>
-        </m:r>
-        <m:r>
-          <m:rPr>
-            <m:sty m:val="p"/>
-          </m:rPr>
-          <m:t>(</m:t>
-        </m:r>
-        <m:r>
-          <m:t>n</m:t>
-        </m:r>
-        <m:r>
-          <m:rPr>
-            <m:sty m:val="p"/>
-          </m:rPr>
-          <m:t>)</m:t>
-        </m:r>
-      </m:oMath>
-      <w:r>
-        <w:t xml:space="preserve"> </w:t>
-      </w:r>
-      <w:r>
-        <w:t xml:space="preserve">holds for every integer</w:t>
-      </w:r>
-      <w:r>
-        <w:t xml:space="preserve"> </w:t>
-      </w:r>
-      <m:oMath>
-        <m:r>
-          <m:t>n</m:t>
-        </m:r>
-        <m:r>
-          <m:rPr>
-            <m:sty m:val="p"/>
-          </m:rPr>
-          <m:t>≥</m:t>
-        </m:r>
-        <m:sSub>
-          <m:e>
-            <m:r>
-              <m:t>n</m:t>
-            </m:r>
-          </m:e>
-          <m:sub>
-            <m:r>
-              <m:t>0</m:t>
-            </m:r>
-          </m:sub>
-        </m:sSub>
-      </m:oMath>
-      <w:r>
-        <w:t xml:space="preserve">,</w:t>
-      </w:r>
-      <w:r>
-        <w:t xml:space="preserve"> </w:t>
-      </w:r>
-      <w:r>
-        <w:t xml:space="preserve">a</w:t>
-      </w:r>
-      <w:r>
-        <w:t xml:space="preserve"> </w:t>
-      </w:r>
-      <w:r>
-        <w:rPr>
-          <w:b/>
-          <w:bCs/>
-        </w:rPr>
-        <w:t xml:space="preserve">proof by induction</w:t>
-      </w:r>
-      <w:r>
-        <w:t xml:space="preserve"> </w:t>
-      </w:r>
-      <w:r>
-        <w:t xml:space="preserve">on</w:t>
-      </w:r>
-      <w:r>
-        <w:t xml:space="preserve"> </w:t>
-      </w:r>
-      <m:oMath>
-        <m:r>
-          <m:t>n</m:t>
-        </m:r>
-      </m:oMath>
-      <w:r>
-        <w:t xml:space="preserve"> </w:t>
-      </w:r>
-      <w:r>
-        <w:t xml:space="preserve">proves two things:</w:t>
+        <w:t xml:space="preserve">3 Follow the golden rule</w:t>
       </w:r>
     </w:p>
     <w:p>
       <w:pPr>
-        <w:pStyle w:val="Compact"/>
-        <w:numPr>
-          <w:ilvl w:val="0"/>
-          <w:numId w:val="1002"/>
-        </w:numPr>
-      </w:pPr>
-      <w:r>
-        <w:t xml:space="preserve">the</w:t>
-      </w:r>
-      <w:r>
-        <w:t xml:space="preserve"> </w:t>
-      </w:r>
-      <w:r>
-        <w:rPr>
-          <w:b/>
-          <w:bCs/>
-        </w:rPr>
-        <w:t xml:space="preserve">base case</w:t>
-      </w:r>
-      <w:r>
-        <w:t xml:space="preserve">:</w:t>
-      </w:r>
-      <w:r>
-        <w:t xml:space="preserve"> </w:t>
-      </w:r>
-      <m:oMath>
-        <m:r>
-          <m:t>P</m:t>
-        </m:r>
-        <m:r>
-          <m:rPr>
-            <m:sty m:val="p"/>
-          </m:rPr>
-          <m:t>(</m:t>
-        </m:r>
-        <m:sSub>
-          <m:e>
-            <m:r>
-              <m:t>n</m:t>
-            </m:r>
-          </m:e>
-          <m:sub>
-            <m:r>
-              <m:t>0</m:t>
-            </m:r>
-          </m:sub>
-        </m:sSub>
-        <m:r>
-          <m:rPr>
-            <m:sty m:val="p"/>
-          </m:rPr>
-          <m:t>)</m:t>
-        </m:r>
-      </m:oMath>
-      <w:r>
-        <w:t xml:space="preserve"> </w:t>
-      </w:r>
-      <w:r>
-        <w:t xml:space="preserve">holds;</w:t>
+        <w:pStyle w:val="FirstParagraph"/>
+      </w:pPr>
+      <w:r>
+        <w:t xml:space="preserve">In general,</w:t>
+      </w:r>
+      <w:r>
+        <w:t xml:space="preserve"> </w:t>
+      </w:r>
+      <w:r>
+        <w:t xml:space="preserve">follow the golden rule:</w:t>
+      </w:r>
+      <w:r>
+        <w:t xml:space="preserve"> </w:t>
+      </w:r>
+      <w:r>
+        <w:t xml:space="preserve">treat your readers the way you want to be treated as a reader.</w:t>
       </w:r>
     </w:p>
     <w:p>
       <w:pPr>
-        <w:pStyle w:val="Compact"/>
-        <w:numPr>
-          <w:ilvl w:val="0"/>
-          <w:numId w:val="1002"/>
-        </w:numPr>
-      </w:pPr>
-      <w:r>
-        <w:t xml:space="preserve">the</w:t>
-      </w:r>
-      <w:r>
-        <w:t xml:space="preserve"> </w:t>
-      </w:r>
-      <w:r>
-        <w:rPr>
-          <w:b/>
-          <w:bCs/>
-        </w:rPr>
-        <w:t xml:space="preserve">inductive step</w:t>
-      </w:r>
-      <w:r>
-        <w:t xml:space="preserve">: for every</w:t>
-      </w:r>
-      <w:r>
-        <w:t xml:space="preserve"> </w:t>
-      </w:r>
-      <m:oMath>
-        <m:r>
-          <m:t>n</m:t>
-        </m:r>
-        <m:r>
-          <m:rPr>
-            <m:sty m:val="p"/>
-          </m:rPr>
-          <m:t>≥</m:t>
-        </m:r>
-        <m:sSub>
-          <m:e>
-            <m:r>
-              <m:t>n</m:t>
-            </m:r>
-          </m:e>
-          <m:sub>
-            <m:r>
-              <m:t>0</m:t>
-            </m:r>
-          </m:sub>
-        </m:sSub>
-      </m:oMath>
-      <w:r>
-        <w:t xml:space="preserve">,</w:t>
-      </w:r>
-      <w:r>
-        <w:t xml:space="preserve"> </w:t>
-      </w:r>
-      <w:r>
-        <w:t xml:space="preserve">if</w:t>
-      </w:r>
-      <w:r>
-        <w:t xml:space="preserve"> </w:t>
-      </w:r>
-      <m:oMath>
-        <m:r>
-          <m:t>P</m:t>
-        </m:r>
-        <m:r>
-          <m:rPr>
-            <m:sty m:val="p"/>
-          </m:rPr>
-          <m:t>(</m:t>
-        </m:r>
-        <m:r>
-          <m:t>n</m:t>
-        </m:r>
-        <m:r>
-          <m:rPr>
-            <m:sty m:val="p"/>
-          </m:rPr>
-          <m:t>)</m:t>
-        </m:r>
-      </m:oMath>
-      <w:r>
-        <w:t xml:space="preserve"> </w:t>
-      </w:r>
-      <w:r>
-        <w:t xml:space="preserve">holds, then</w:t>
-      </w:r>
-      <w:r>
-        <w:t xml:space="preserve"> </w:t>
-      </w:r>
-      <m:oMath>
-        <m:r>
-          <m:t>P</m:t>
-        </m:r>
-        <m:r>
-          <m:rPr>
-            <m:sty m:val="p"/>
-          </m:rPr>
-          <m:t>(</m:t>
-        </m:r>
-        <m:r>
-          <m:t>n</m:t>
-        </m:r>
-        <m:r>
-          <m:rPr>
-            <m:sty m:val="p"/>
-          </m:rPr>
-          <m:t>+</m:t>
-        </m:r>
-        <m:r>
-          <m:t>1</m:t>
-        </m:r>
-        <m:r>
-          <m:rPr>
-            <m:sty m:val="p"/>
-          </m:rPr>
-          <m:t>)</m:t>
-        </m:r>
-      </m:oMath>
-      <w:r>
-        <w:t xml:space="preserve"> </w:t>
-      </w:r>
-      <w:r>
-        <w:t xml:space="preserve">holds.</w:t>
-      </w:r>
-      <w:r>
-        <w:t xml:space="preserve"> </w:t>
-      </w:r>
-      <w:r>
-        <w:t xml:space="preserve">The assumption that</w:t>
-      </w:r>
-      <w:r>
-        <w:t xml:space="preserve"> </w:t>
-      </w:r>
-      <m:oMath>
-        <m:r>
-          <m:t>P</m:t>
-        </m:r>
-        <m:r>
-          <m:rPr>
-            <m:sty m:val="p"/>
-          </m:rPr>
-          <m:t>(</m:t>
-        </m:r>
-        <m:r>
-          <m:t>n</m:t>
-        </m:r>
-        <m:r>
-          <m:rPr>
-            <m:sty m:val="p"/>
-          </m:rPr>
-          <m:t>)</m:t>
-        </m:r>
-      </m:oMath>
-      <w:r>
-        <w:t xml:space="preserve"> </w:t>
-      </w:r>
-      <w:r>
-        <w:t xml:space="preserve">holds</w:t>
-      </w:r>
-      <w:r>
-        <w:t xml:space="preserve"> </w:t>
-      </w:r>
-      <w:r>
-        <w:t xml:space="preserve">is called the</w:t>
-      </w:r>
-      <w:r>
-        <w:t xml:space="preserve"> </w:t>
-      </w:r>
-      <w:r>
-        <w:rPr>
-          <w:b/>
-          <w:bCs/>
-        </w:rPr>
-        <w:t xml:space="preserve">induction hypothesis</w:t>
-      </w:r>
-      <w:r>
-        <w:t xml:space="preserve">.</w:t>
+        <w:pStyle w:val="BodyText"/>
+      </w:pPr>
+      <w:r>
+        <w:t xml:space="preserve">When you read someone else’s proof,</w:t>
+      </w:r>
+      <w:r>
+        <w:t xml:space="preserve"> </w:t>
+      </w:r>
+      <w:r>
+        <w:t xml:space="preserve">you want to be able to follow every step without guessing,</w:t>
+      </w:r>
+      <w:r>
+        <w:t xml:space="preserve"> </w:t>
+      </w:r>
+      <w:r>
+        <w:t xml:space="preserve">to know which result is being used at each line,</w:t>
+      </w:r>
+      <w:r>
+        <w:t xml:space="preserve"> </w:t>
+      </w:r>
+      <w:r>
+        <w:t xml:space="preserve">and to never be left wondering where a quantity came from.</w:t>
+      </w:r>
+      <w:r>
+        <w:t xml:space="preserve"> </w:t>
+      </w:r>
+      <w:r>
+        <w:t xml:space="preserve">Write your own proofs to meet that same standard.</w:t>
+      </w:r>
+    </w:p>
+    <w:bookmarkEnd w:id="18"/>
+    <w:bookmarkStart w:id="24" w:name="sec-proof-by-induction"/>
+    <w:p>
+      <w:pPr>
+        <w:pStyle w:val="Heading2"/>
+      </w:pPr>
+      <w:r>
+        <w:t xml:space="preserve">4 Proof by induction</w:t>
       </w:r>
     </w:p>
     <w:p>
@@ -1816,31 +1521,8 @@
         <w:pStyle w:val="FirstParagraph"/>
       </w:pPr>
       <w:r>
-        <w:t xml:space="preserve">Together these give</w:t>
-      </w:r>
-      <w:r>
-        <w:t xml:space="preserve"> </w:t>
-      </w:r>
-      <m:oMath>
-        <m:r>
-          <m:t>P</m:t>
-        </m:r>
-        <m:r>
-          <m:rPr>
-            <m:sty m:val="p"/>
-          </m:rPr>
-          <m:t>(</m:t>
-        </m:r>
-        <m:r>
-          <m:t>n</m:t>
-        </m:r>
-        <m:r>
-          <m:rPr>
-            <m:sty m:val="p"/>
-          </m:rPr>
-          <m:t>)</m:t>
-        </m:r>
-      </m:oMath>
+        <w:t xml:space="preserve">Many proofs in these notes show that a statement holds</w:t>
+      </w:r>
       <w:r>
         <w:t xml:space="preserve"> </w:t>
       </w:r>
@@ -1850,1393 +1532,7 @@
       <w:r>
         <w:t xml:space="preserve"> </w:t>
       </w:r>
-      <m:oMath>
-        <m:r>
-          <m:t>n</m:t>
-        </m:r>
-        <m:r>
-          <m:rPr>
-            <m:sty m:val="p"/>
-          </m:rPr>
-          <m:t>≥</m:t>
-        </m:r>
-        <m:sSub>
-          <m:e>
-            <m:r>
-              <m:t>n</m:t>
-            </m:r>
-          </m:e>
-          <m:sub>
-            <m:r>
-              <m:t>0</m:t>
-            </m:r>
-          </m:sub>
-        </m:sSub>
-      </m:oMath>
-      <w:r>
-        <w:t xml:space="preserve">:</w:t>
-      </w:r>
-      <w:r>
-        <w:t xml:space="preserve"> </w:t>
-      </w:r>
-      <w:r>
-        <w:t xml:space="preserve">the base case gives</w:t>
-      </w:r>
-      <w:r>
-        <w:t xml:space="preserve"> </w:t>
-      </w:r>
-      <m:oMath>
-        <m:r>
-          <m:t>P</m:t>
-        </m:r>
-        <m:r>
-          <m:rPr>
-            <m:sty m:val="p"/>
-          </m:rPr>
-          <m:t>(</m:t>
-        </m:r>
-        <m:sSub>
-          <m:e>
-            <m:r>
-              <m:t>n</m:t>
-            </m:r>
-          </m:e>
-          <m:sub>
-            <m:r>
-              <m:t>0</m:t>
-            </m:r>
-          </m:sub>
-        </m:sSub>
-        <m:r>
-          <m:rPr>
-            <m:sty m:val="p"/>
-          </m:rPr>
-          <m:t>)</m:t>
-        </m:r>
-      </m:oMath>
-      <w:r>
-        <w:t xml:space="preserve">,</w:t>
-      </w:r>
-      <w:r>
-        <w:t xml:space="preserve"> </w:t>
-      </w:r>
-      <w:r>
-        <w:t xml:space="preserve">the inductive step then gives</w:t>
-      </w:r>
-      <w:r>
-        <w:t xml:space="preserve"> </w:t>
-      </w:r>
-      <m:oMath>
-        <m:r>
-          <m:t>P</m:t>
-        </m:r>
-        <m:r>
-          <m:rPr>
-            <m:sty m:val="p"/>
-          </m:rPr>
-          <m:t>(</m:t>
-        </m:r>
-        <m:sSub>
-          <m:e>
-            <m:r>
-              <m:t>n</m:t>
-            </m:r>
-          </m:e>
-          <m:sub>
-            <m:r>
-              <m:t>0</m:t>
-            </m:r>
-          </m:sub>
-        </m:sSub>
-        <m:r>
-          <m:rPr>
-            <m:sty m:val="p"/>
-          </m:rPr>
-          <m:t>+</m:t>
-        </m:r>
-        <m:r>
-          <m:t>1</m:t>
-        </m:r>
-        <m:r>
-          <m:rPr>
-            <m:sty m:val="p"/>
-          </m:rPr>
-          <m:t>)</m:t>
-        </m:r>
-      </m:oMath>
-      <w:r>
-        <w:t xml:space="preserve">,</w:t>
-      </w:r>
-      <w:r>
-        <w:t xml:space="preserve"> </w:t>
-      </w:r>
-      <w:r>
-        <w:t xml:space="preserve">then</w:t>
-      </w:r>
-      <w:r>
-        <w:t xml:space="preserve"> </w:t>
-      </w:r>
-      <m:oMath>
-        <m:r>
-          <m:t>P</m:t>
-        </m:r>
-        <m:r>
-          <m:rPr>
-            <m:sty m:val="p"/>
-          </m:rPr>
-          <m:t>(</m:t>
-        </m:r>
-        <m:sSub>
-          <m:e>
-            <m:r>
-              <m:t>n</m:t>
-            </m:r>
-          </m:e>
-          <m:sub>
-            <m:r>
-              <m:t>0</m:t>
-            </m:r>
-          </m:sub>
-        </m:sSub>
-        <m:r>
-          <m:rPr>
-            <m:sty m:val="p"/>
-          </m:rPr>
-          <m:t>+</m:t>
-        </m:r>
-        <m:r>
-          <m:t>2</m:t>
-        </m:r>
-        <m:r>
-          <m:rPr>
-            <m:sty m:val="p"/>
-          </m:rPr>
-          <m:t>)</m:t>
-        </m:r>
-      </m:oMath>
-      <w:r>
-        <w:t xml:space="preserve">, and so on.</w:t>
-      </w:r>
-    </w:p>
-    <w:bookmarkEnd w:id="18"/>
-    <w:bookmarkStart w:id="19" w:name="exm-proof-by-induction"/>
-    <w:p>
-      <w:pPr>
-        <w:pStyle w:val="BodyText"/>
-      </w:pPr>
-      <w:r>
-        <w:rPr>
-          <w:b/>
-          <w:bCs/>
-        </w:rPr>
-        <w:t xml:space="preserve">Example 1 (The sum of the first</w:t>
-      </w:r>
-      <w:r>
-        <w:rPr>
-          <w:b/>
-          <w:bCs/>
-        </w:rPr>
-        <w:t xml:space="preserve"> </w:t>
-      </w:r>
-      <m:oMath>
-        <m:r>
-          <m:t>n</m:t>
-        </m:r>
-      </m:oMath>
-      <w:r>
-        <w:rPr>
-          <w:b/>
-          <w:bCs/>
-        </w:rPr>
-        <w:t xml:space="preserve"> </w:t>
-      </w:r>
-      <w:r>
-        <w:rPr>
-          <w:b/>
-          <w:bCs/>
-        </w:rPr>
-        <w:t xml:space="preserve">positive integers)</w:t>
-      </w:r>
-      <w:r>
-        <w:t xml:space="preserve"> </w:t>
-      </w:r>
-      <w:r>
-        <w:t xml:space="preserve">Claim: for every integer</w:t>
-      </w:r>
-      <w:r>
-        <w:t xml:space="preserve"> </w:t>
-      </w:r>
-      <m:oMath>
-        <m:r>
-          <m:t>n</m:t>
-        </m:r>
-        <m:r>
-          <m:rPr>
-            <m:sty m:val="p"/>
-          </m:rPr>
-          <m:t>≥</m:t>
-        </m:r>
-        <m:r>
-          <m:t>1</m:t>
-        </m:r>
-      </m:oMath>
-      <w:r>
-        <w:t xml:space="preserve">,</w:t>
-      </w:r>
-    </w:p>
-    <w:p>
-      <w:pPr>
-        <w:pStyle w:val="BodyText"/>
-      </w:pPr>
-      <m:oMathPara>
-        <m:oMathParaPr>
-          <m:jc m:val="center"/>
-        </m:oMathParaPr>
-        <m:oMath>
-          <m:nary>
-            <m:naryPr>
-              <m:chr m:val="∑"/>
-              <m:limLoc m:val="undOvr"/>
-              <m:subHide m:val="off"/>
-              <m:supHide m:val="off"/>
-            </m:naryPr>
-            <m:sub>
-              <m:r>
-                <m:t>i</m:t>
-              </m:r>
-              <m:r>
-                <m:rPr>
-                  <m:sty m:val="p"/>
-                </m:rPr>
-                <m:t>=</m:t>
-              </m:r>
-              <m:r>
-                <m:t>1</m:t>
-              </m:r>
-            </m:sub>
-            <m:sup>
-              <m:r>
-                <m:t>n</m:t>
-              </m:r>
-            </m:sup>
-            <m:e>
-              <m:r>
-                <m:t>i</m:t>
-              </m:r>
-            </m:e>
-          </m:nary>
-          <m:r>
-            <m:rPr>
-              <m:sty m:val="p"/>
-            </m:rPr>
-            <m:t>=</m:t>
-          </m:r>
-          <m:f>
-            <m:fPr>
-              <m:type m:val="bar"/>
-            </m:fPr>
-            <m:num>
-              <m:r>
-                <m:t>n</m:t>
-              </m:r>
-              <m:r>
-                <m:rPr>
-                  <m:sty m:val="p"/>
-                </m:rPr>
-                <m:t>(</m:t>
-              </m:r>
-              <m:r>
-                <m:t>n</m:t>
-              </m:r>
-              <m:r>
-                <m:rPr>
-                  <m:sty m:val="p"/>
-                </m:rPr>
-                <m:t>+</m:t>
-              </m:r>
-              <m:r>
-                <m:t>1</m:t>
-              </m:r>
-              <m:r>
-                <m:rPr>
-                  <m:sty m:val="p"/>
-                </m:rPr>
-                <m:t>)</m:t>
-              </m:r>
-            </m:num>
-            <m:den>
-              <m:r>
-                <m:t>2</m:t>
-              </m:r>
-            </m:den>
-          </m:f>
-        </m:oMath>
-      </m:oMathPara>
-    </w:p>
-    <w:p>
-      <w:pPr>
-        <w:pStyle w:val="FirstParagraph"/>
-      </w:pPr>
-      <w:r>
-        <w:rPr>
-          <w:b/>
-          <w:bCs/>
-        </w:rPr>
-        <w:t xml:space="preserve">Base case</w:t>
-      </w:r>
-      <w:r>
-        <w:t xml:space="preserve"> </w:t>
-      </w:r>
-      <w:r>
-        <w:t xml:space="preserve">(</w:t>
-      </w:r>
-      <m:oMath>
-        <m:r>
-          <m:t>n</m:t>
-        </m:r>
-        <m:r>
-          <m:rPr>
-            <m:sty m:val="p"/>
-          </m:rPr>
-          <m:t>=</m:t>
-        </m:r>
-        <m:r>
-          <m:t>1</m:t>
-        </m:r>
-      </m:oMath>
-      <w:r>
-        <w:t xml:space="preserve">): the left side is</w:t>
-      </w:r>
-      <w:r>
-        <w:t xml:space="preserve"> </w:t>
-      </w:r>
-      <m:oMath>
-        <m:r>
-          <m:t>1</m:t>
-        </m:r>
-      </m:oMath>
-      <w:r>
-        <w:t xml:space="preserve">,</w:t>
-      </w:r>
-      <w:r>
-        <w:t xml:space="preserve"> </w:t>
-      </w:r>
-      <w:r>
-        <w:t xml:space="preserve">and the right side is</w:t>
-      </w:r>
-      <w:r>
-        <w:t xml:space="preserve"> </w:t>
-      </w:r>
-      <m:oMath>
-        <m:f>
-          <m:fPr>
-            <m:type m:val="bar"/>
-          </m:fPr>
-          <m:num>
-            <m:r>
-              <m:t>1</m:t>
-            </m:r>
-            <m:r>
-              <m:rPr>
-                <m:sty m:val="p"/>
-              </m:rPr>
-              <m:t>⋅</m:t>
-            </m:r>
-            <m:r>
-              <m:t>2</m:t>
-            </m:r>
-          </m:num>
-          <m:den>
-            <m:r>
-              <m:t>2</m:t>
-            </m:r>
-          </m:den>
-        </m:f>
-        <m:r>
-          <m:rPr>
-            <m:sty m:val="p"/>
-          </m:rPr>
-          <m:t>=</m:t>
-        </m:r>
-        <m:r>
-          <m:t>1</m:t>
-        </m:r>
-      </m:oMath>
-      <w:r>
-        <w:t xml:space="preserve">.</w:t>
-      </w:r>
-    </w:p>
-    <w:p>
-      <w:pPr>
-        <w:pStyle w:val="BodyText"/>
-      </w:pPr>
-      <w:r>
-        <w:rPr>
-          <w:b/>
-          <w:bCs/>
-        </w:rPr>
-        <w:t xml:space="preserve">Inductive step</w:t>
-      </w:r>
-      <w:r>
-        <w:t xml:space="preserve">: assume the claim holds for</w:t>
-      </w:r>
-      <w:r>
-        <w:t xml:space="preserve"> </w:t>
-      </w:r>
-      <m:oMath>
-        <m:r>
-          <m:t>n</m:t>
-        </m:r>
-      </m:oMath>
-      <w:r>
-        <w:t xml:space="preserve">.</w:t>
-      </w:r>
-      <w:r>
-        <w:t xml:space="preserve"> </w:t>
-      </w:r>
-      <w:r>
-        <w:t xml:space="preserve">Then</w:t>
-      </w:r>
-    </w:p>
-    <w:p>
-      <w:pPr>
-        <w:pStyle w:val="BodyText"/>
-      </w:pPr>
-      <m:oMathPara>
-        <m:oMathParaPr>
-          <m:jc m:val="center"/>
-        </m:oMathParaPr>
-        <m:oMath>
-          <m:eqArr>
-            <m:e>
-              <m:nary>
-                <m:naryPr>
-                  <m:chr m:val="∑"/>
-                  <m:limLoc m:val="undOvr"/>
-                  <m:subHide m:val="off"/>
-                  <m:supHide m:val="off"/>
-                </m:naryPr>
-                <m:sub>
-                  <m:r>
-                    <m:t>i</m:t>
-                  </m:r>
-                  <m:r>
-                    <m:rPr>
-                      <m:sty m:val="p"/>
-                    </m:rPr>
-                    <m:t>=</m:t>
-                  </m:r>
-                  <m:r>
-                    <m:t>1</m:t>
-                  </m:r>
-                </m:sub>
-                <m:sup>
-                  <m:r>
-                    <m:t>n</m:t>
-                  </m:r>
-                  <m:r>
-                    <m:rPr>
-                      <m:sty m:val="p"/>
-                    </m:rPr>
-                    <m:t>+</m:t>
-                  </m:r>
-                  <m:r>
-                    <m:t>1</m:t>
-                  </m:r>
-                </m:sup>
-                <m:e>
-                  <m:r>
-                    <m:t>i</m:t>
-                  </m:r>
-                </m:e>
-              </m:nary>
-              <m:r>
-                <m:t>&amp;</m:t>
-              </m:r>
-              <m:r>
-                <m:rPr>
-                  <m:sty m:val="p"/>
-                </m:rPr>
-                <m:t>=</m:t>
-              </m:r>
-              <m:nary>
-                <m:naryPr>
-                  <m:chr m:val="∑"/>
-                  <m:limLoc m:val="undOvr"/>
-                  <m:subHide m:val="off"/>
-                  <m:supHide m:val="off"/>
-                </m:naryPr>
-                <m:sub>
-                  <m:r>
-                    <m:t>i</m:t>
-                  </m:r>
-                  <m:r>
-                    <m:rPr>
-                      <m:sty m:val="p"/>
-                    </m:rPr>
-                    <m:t>=</m:t>
-                  </m:r>
-                  <m:r>
-                    <m:t>1</m:t>
-                  </m:r>
-                </m:sub>
-                <m:sup>
-                  <m:r>
-                    <m:t>n</m:t>
-                  </m:r>
-                </m:sup>
-                <m:e>
-                  <m:r>
-                    <m:t>i</m:t>
-                  </m:r>
-                </m:e>
-              </m:nary>
-              <m:r>
-                <m:rPr>
-                  <m:sty m:val="p"/>
-                </m:rPr>
-                <m:t>+</m:t>
-              </m:r>
-              <m:r>
-                <m:rPr>
-                  <m:sty m:val="p"/>
-                </m:rPr>
-                <m:t>(</m:t>
-              </m:r>
-              <m:r>
-                <m:t>n</m:t>
-              </m:r>
-              <m:r>
-                <m:rPr>
-                  <m:sty m:val="p"/>
-                </m:rPr>
-                <m:t>+</m:t>
-              </m:r>
-              <m:r>
-                <m:t>1</m:t>
-              </m:r>
-              <m:r>
-                <m:rPr>
-                  <m:sty m:val="p"/>
-                </m:rPr>
-                <m:t>)</m:t>
-              </m:r>
-              <m:r>
-                <m:t>&amp;</m:t>
-              </m:r>
-              <m:r>
-                <m:t>&amp;</m:t>
-              </m:r>
-              <m:r>
-                <m:rPr>
-                  <m:nor/>
-                  <m:sty m:val="p"/>
-                </m:rPr>
-                <m:t>(split off the last term)</m:t>
-              </m:r>
-            </m:e>
-            <m:e>
-              <m:r>
-                <m:t>&amp;</m:t>
-              </m:r>
-              <m:r>
-                <m:rPr>
-                  <m:sty m:val="p"/>
-                </m:rPr>
-                <m:t>=</m:t>
-              </m:r>
-              <m:f>
-                <m:fPr>
-                  <m:type m:val="bar"/>
-                </m:fPr>
-                <m:num>
-                  <m:r>
-                    <m:t>n</m:t>
-                  </m:r>
-                  <m:r>
-                    <m:rPr>
-                      <m:sty m:val="p"/>
-                    </m:rPr>
-                    <m:t>(</m:t>
-                  </m:r>
-                  <m:r>
-                    <m:t>n</m:t>
-                  </m:r>
-                  <m:r>
-                    <m:rPr>
-                      <m:sty m:val="p"/>
-                    </m:rPr>
-                    <m:t>+</m:t>
-                  </m:r>
-                  <m:r>
-                    <m:t>1</m:t>
-                  </m:r>
-                  <m:r>
-                    <m:rPr>
-                      <m:sty m:val="p"/>
-                    </m:rPr>
-                    <m:t>)</m:t>
-                  </m:r>
-                </m:num>
-                <m:den>
-                  <m:r>
-                    <m:t>2</m:t>
-                  </m:r>
-                </m:den>
-              </m:f>
-              <m:r>
-                <m:rPr>
-                  <m:sty m:val="p"/>
-                </m:rPr>
-                <m:t>+</m:t>
-              </m:r>
-              <m:r>
-                <m:rPr>
-                  <m:sty m:val="p"/>
-                </m:rPr>
-                <m:t>(</m:t>
-              </m:r>
-              <m:r>
-                <m:t>n</m:t>
-              </m:r>
-              <m:r>
-                <m:rPr>
-                  <m:sty m:val="p"/>
-                </m:rPr>
-                <m:t>+</m:t>
-              </m:r>
-              <m:r>
-                <m:t>1</m:t>
-              </m:r>
-              <m:r>
-                <m:rPr>
-                  <m:sty m:val="p"/>
-                </m:rPr>
-                <m:t>)</m:t>
-              </m:r>
-              <m:r>
-                <m:t>&amp;</m:t>
-              </m:r>
-              <m:r>
-                <m:t>&amp;</m:t>
-              </m:r>
-              <m:r>
-                <m:rPr>
-                  <m:nor/>
-                  <m:sty m:val="p"/>
-                </m:rPr>
-                <m:t>(induction hypothesis)</m:t>
-              </m:r>
-            </m:e>
-            <m:e>
-              <m:r>
-                <m:t>&amp;</m:t>
-              </m:r>
-              <m:r>
-                <m:rPr>
-                  <m:sty m:val="p"/>
-                </m:rPr>
-                <m:t>=</m:t>
-              </m:r>
-              <m:f>
-                <m:fPr>
-                  <m:type m:val="bar"/>
-                </m:fPr>
-                <m:num>
-                  <m:r>
-                    <m:t>n</m:t>
-                  </m:r>
-                  <m:r>
-                    <m:rPr>
-                      <m:sty m:val="p"/>
-                    </m:rPr>
-                    <m:t>(</m:t>
-                  </m:r>
-                  <m:r>
-                    <m:t>n</m:t>
-                  </m:r>
-                  <m:r>
-                    <m:rPr>
-                      <m:sty m:val="p"/>
-                    </m:rPr>
-                    <m:t>+</m:t>
-                  </m:r>
-                  <m:r>
-                    <m:t>1</m:t>
-                  </m:r>
-                  <m:r>
-                    <m:rPr>
-                      <m:sty m:val="p"/>
-                    </m:rPr>
-                    <m:t>)</m:t>
-                  </m:r>
-                </m:num>
-                <m:den>
-                  <m:r>
-                    <m:t>2</m:t>
-                  </m:r>
-                </m:den>
-              </m:f>
-              <m:r>
-                <m:rPr>
-                  <m:sty m:val="p"/>
-                </m:rPr>
-                <m:t>+</m:t>
-              </m:r>
-              <m:f>
-                <m:fPr>
-                  <m:type m:val="bar"/>
-                </m:fPr>
-                <m:num>
-                  <m:r>
-                    <m:t>2</m:t>
-                  </m:r>
-                  <m:r>
-                    <m:rPr>
-                      <m:sty m:val="p"/>
-                    </m:rPr>
-                    <m:t>(</m:t>
-                  </m:r>
-                  <m:r>
-                    <m:t>n</m:t>
-                  </m:r>
-                  <m:r>
-                    <m:rPr>
-                      <m:sty m:val="p"/>
-                    </m:rPr>
-                    <m:t>+</m:t>
-                  </m:r>
-                  <m:r>
-                    <m:t>1</m:t>
-                  </m:r>
-                  <m:r>
-                    <m:rPr>
-                      <m:sty m:val="p"/>
-                    </m:rPr>
-                    <m:t>)</m:t>
-                  </m:r>
-                </m:num>
-                <m:den>
-                  <m:r>
-                    <m:t>2</m:t>
-                  </m:r>
-                </m:den>
-              </m:f>
-              <m:r>
-                <m:t>&amp;</m:t>
-              </m:r>
-              <m:r>
-                <m:t>&amp;</m:t>
-              </m:r>
-              <m:r>
-                <m:rPr>
-                  <m:nor/>
-                  <m:sty m:val="p"/>
-                </m:rPr>
-                <m:t>(write </m:t>
-              </m:r>
-              <m:r>
-                <m:t>n</m:t>
-              </m:r>
-              <m:r>
-                <m:rPr>
-                  <m:sty m:val="p"/>
-                </m:rPr>
-                <m:t>+</m:t>
-              </m:r>
-              <m:r>
-                <m:t>1</m:t>
-              </m:r>
-              <m:r>
-                <m:rPr>
-                  <m:nor/>
-                  <m:sty m:val="p"/>
-                </m:rPr>
-                <m:t> over the denominator </m:t>
-              </m:r>
-              <m:r>
-                <m:t>2</m:t>
-              </m:r>
-              <m:r>
-                <m:rPr>
-                  <m:nor/>
-                  <m:sty m:val="p"/>
-                </m:rPr>
-                <m:t>)</m:t>
-              </m:r>
-            </m:e>
-            <m:e>
-              <m:r>
-                <m:t>&amp;</m:t>
-              </m:r>
-              <m:r>
-                <m:rPr>
-                  <m:sty m:val="p"/>
-                </m:rPr>
-                <m:t>=</m:t>
-              </m:r>
-              <m:f>
-                <m:fPr>
-                  <m:type m:val="bar"/>
-                </m:fPr>
-                <m:num>
-                  <m:r>
-                    <m:t>n</m:t>
-                  </m:r>
-                  <m:r>
-                    <m:rPr>
-                      <m:sty m:val="p"/>
-                    </m:rPr>
-                    <m:t>(</m:t>
-                  </m:r>
-                  <m:r>
-                    <m:t>n</m:t>
-                  </m:r>
-                  <m:r>
-                    <m:rPr>
-                      <m:sty m:val="p"/>
-                    </m:rPr>
-                    <m:t>+</m:t>
-                  </m:r>
-                  <m:r>
-                    <m:t>1</m:t>
-                  </m:r>
-                  <m:r>
-                    <m:rPr>
-                      <m:sty m:val="p"/>
-                    </m:rPr>
-                    <m:t>)</m:t>
-                  </m:r>
-                  <m:r>
-                    <m:rPr>
-                      <m:sty m:val="p"/>
-                    </m:rPr>
-                    <m:t>+</m:t>
-                  </m:r>
-                  <m:r>
-                    <m:t>2</m:t>
-                  </m:r>
-                  <m:r>
-                    <m:rPr>
-                      <m:sty m:val="p"/>
-                    </m:rPr>
-                    <m:t>(</m:t>
-                  </m:r>
-                  <m:r>
-                    <m:t>n</m:t>
-                  </m:r>
-                  <m:r>
-                    <m:rPr>
-                      <m:sty m:val="p"/>
-                    </m:rPr>
-                    <m:t>+</m:t>
-                  </m:r>
-                  <m:r>
-                    <m:t>1</m:t>
-                  </m:r>
-                  <m:r>
-                    <m:rPr>
-                      <m:sty m:val="p"/>
-                    </m:rPr>
-                    <m:t>)</m:t>
-                  </m:r>
-                </m:num>
-                <m:den>
-                  <m:r>
-                    <m:t>2</m:t>
-                  </m:r>
-                </m:den>
-              </m:f>
-              <m:r>
-                <m:t>&amp;</m:t>
-              </m:r>
-              <m:r>
-                <m:t>&amp;</m:t>
-              </m:r>
-              <m:r>
-                <m:rPr>
-                  <m:nor/>
-                  <m:sty m:val="p"/>
-                </m:rPr>
-                <m:t>(add fractions with the same denominator)</m:t>
-              </m:r>
-            </m:e>
-            <m:e>
-              <m:r>
-                <m:t>&amp;</m:t>
-              </m:r>
-              <m:r>
-                <m:rPr>
-                  <m:sty m:val="p"/>
-                </m:rPr>
-                <m:t>=</m:t>
-              </m:r>
-              <m:f>
-                <m:fPr>
-                  <m:type m:val="bar"/>
-                </m:fPr>
-                <m:num>
-                  <m:r>
-                    <m:rPr>
-                      <m:sty m:val="p"/>
-                    </m:rPr>
-                    <m:t>(</m:t>
-                  </m:r>
-                  <m:r>
-                    <m:t>n</m:t>
-                  </m:r>
-                  <m:r>
-                    <m:rPr>
-                      <m:sty m:val="p"/>
-                    </m:rPr>
-                    <m:t>+</m:t>
-                  </m:r>
-                  <m:r>
-                    <m:t>2</m:t>
-                  </m:r>
-                  <m:r>
-                    <m:rPr>
-                      <m:sty m:val="p"/>
-                    </m:rPr>
-                    <m:t>)</m:t>
-                  </m:r>
-                  <m:r>
-                    <m:rPr>
-                      <m:sty m:val="p"/>
-                    </m:rPr>
-                    <m:t>(</m:t>
-                  </m:r>
-                  <m:r>
-                    <m:t>n</m:t>
-                  </m:r>
-                  <m:r>
-                    <m:rPr>
-                      <m:sty m:val="p"/>
-                    </m:rPr>
-                    <m:t>+</m:t>
-                  </m:r>
-                  <m:r>
-                    <m:t>1</m:t>
-                  </m:r>
-                  <m:r>
-                    <m:rPr>
-                      <m:sty m:val="p"/>
-                    </m:rPr>
-                    <m:t>)</m:t>
-                  </m:r>
-                </m:num>
-                <m:den>
-                  <m:r>
-                    <m:t>2</m:t>
-                  </m:r>
-                </m:den>
-              </m:f>
-              <m:r>
-                <m:t>&amp;</m:t>
-              </m:r>
-              <m:r>
-                <m:t>&amp;</m:t>
-              </m:r>
-              <m:r>
-                <m:rPr>
-                  <m:nor/>
-                  <m:sty m:val="p"/>
-                </m:rPr>
-                <m:t>(factor out </m:t>
-              </m:r>
-              <m:r>
-                <m:t>n</m:t>
-              </m:r>
-              <m:r>
-                <m:rPr>
-                  <m:sty m:val="p"/>
-                </m:rPr>
-                <m:t>+</m:t>
-              </m:r>
-              <m:r>
-                <m:t>1</m:t>
-              </m:r>
-              <m:r>
-                <m:rPr>
-                  <m:nor/>
-                  <m:sty m:val="p"/>
-                </m:rPr>
-                <m:t>)</m:t>
-              </m:r>
-            </m:e>
-            <m:e>
-              <m:r>
-                <m:t>&amp;</m:t>
-              </m:r>
-              <m:r>
-                <m:rPr>
-                  <m:sty m:val="p"/>
-                </m:rPr>
-                <m:t>=</m:t>
-              </m:r>
-              <m:f>
-                <m:fPr>
-                  <m:type m:val="bar"/>
-                </m:fPr>
-                <m:num>
-                  <m:r>
-                    <m:rPr>
-                      <m:sty m:val="p"/>
-                    </m:rPr>
-                    <m:t>(</m:t>
-                  </m:r>
-                  <m:r>
-                    <m:t>n</m:t>
-                  </m:r>
-                  <m:r>
-                    <m:rPr>
-                      <m:sty m:val="p"/>
-                    </m:rPr>
-                    <m:t>+</m:t>
-                  </m:r>
-                  <m:r>
-                    <m:t>1</m:t>
-                  </m:r>
-                  <m:r>
-                    <m:rPr>
-                      <m:sty m:val="p"/>
-                    </m:rPr>
-                    <m:t>)</m:t>
-                  </m:r>
-                  <m:r>
-                    <m:rPr>
-                      <m:sty m:val="p"/>
-                    </m:rPr>
-                    <m:t>(</m:t>
-                  </m:r>
-                  <m:r>
-                    <m:t>n</m:t>
-                  </m:r>
-                  <m:r>
-                    <m:rPr>
-                      <m:sty m:val="p"/>
-                    </m:rPr>
-                    <m:t>+</m:t>
-                  </m:r>
-                  <m:r>
-                    <m:t>2</m:t>
-                  </m:r>
-                  <m:r>
-                    <m:rPr>
-                      <m:sty m:val="p"/>
-                    </m:rPr>
-                    <m:t>)</m:t>
-                  </m:r>
-                </m:num>
-                <m:den>
-                  <m:r>
-                    <m:t>2</m:t>
-                  </m:r>
-                </m:den>
-              </m:f>
-              <m:r>
-                <m:t>&amp;</m:t>
-              </m:r>
-              <m:r>
-                <m:t>&amp;</m:t>
-              </m:r>
-              <m:r>
-                <m:rPr>
-                  <m:nor/>
-                  <m:sty m:val="p"/>
-                </m:rPr>
-                <m:t>(reorder the factors)</m:t>
-              </m:r>
-            </m:e>
-            <m:e>
-              <m:r>
-                <m:t>&amp;</m:t>
-              </m:r>
-              <m:r>
-                <m:rPr>
-                  <m:sty m:val="p"/>
-                </m:rPr>
-                <m:t>=</m:t>
-              </m:r>
-              <m:f>
-                <m:fPr>
-                  <m:type m:val="bar"/>
-                </m:fPr>
-                <m:num>
-                  <m:r>
-                    <m:rPr>
-                      <m:sty m:val="p"/>
-                    </m:rPr>
-                    <m:t>(</m:t>
-                  </m:r>
-                  <m:r>
-                    <m:t>n</m:t>
-                  </m:r>
-                  <m:r>
-                    <m:rPr>
-                      <m:sty m:val="p"/>
-                    </m:rPr>
-                    <m:t>+</m:t>
-                  </m:r>
-                  <m:r>
-                    <m:t>1</m:t>
-                  </m:r>
-                  <m:r>
-                    <m:rPr>
-                      <m:sty m:val="p"/>
-                    </m:rPr>
-                    <m:t>)</m:t>
-                  </m:r>
-                  <m:r>
-                    <m:t> </m:t>
-                  </m:r>
-                  <m:r>
-                    <m:rPr>
-                      <m:sty m:val="p"/>
-                    </m:rPr>
-                    <m:t>(</m:t>
-                  </m:r>
-                  <m:r>
-                    <m:rPr>
-                      <m:sty m:val="p"/>
-                    </m:rPr>
-                    <m:t>(</m:t>
-                  </m:r>
-                  <m:r>
-                    <m:t>n</m:t>
-                  </m:r>
-                  <m:r>
-                    <m:rPr>
-                      <m:sty m:val="p"/>
-                    </m:rPr>
-                    <m:t>+</m:t>
-                  </m:r>
-                  <m:r>
-                    <m:t>1</m:t>
-                  </m:r>
-                  <m:r>
-                    <m:rPr>
-                      <m:sty m:val="p"/>
-                    </m:rPr>
-                    <m:t>)</m:t>
-                  </m:r>
-                  <m:r>
-                    <m:rPr>
-                      <m:sty m:val="p"/>
-                    </m:rPr>
-                    <m:t>+</m:t>
-                  </m:r>
-                  <m:r>
-                    <m:t>1</m:t>
-                  </m:r>
-                  <m:r>
-                    <m:rPr>
-                      <m:sty m:val="p"/>
-                    </m:rPr>
-                    <m:t>)</m:t>
-                  </m:r>
-                </m:num>
-                <m:den>
-                  <m:r>
-                    <m:t>2</m:t>
-                  </m:r>
-                </m:den>
-              </m:f>
-              <m:r>
-                <m:t>&amp;</m:t>
-              </m:r>
-              <m:r>
-                <m:t>&amp;</m:t>
-              </m:r>
-              <m:r>
-                <m:rPr>
-                  <m:nor/>
-                  <m:sty m:val="p"/>
-                </m:rPr>
-                <m:t>(write </m:t>
-              </m:r>
-              <m:r>
-                <m:t>n</m:t>
-              </m:r>
-              <m:r>
-                <m:rPr>
-                  <m:sty m:val="p"/>
-                </m:rPr>
-                <m:t>+</m:t>
-              </m:r>
-              <m:r>
-                <m:t>2</m:t>
-              </m:r>
-              <m:r>
-                <m:rPr>
-                  <m:nor/>
-                  <m:sty m:val="p"/>
-                </m:rPr>
-                <m:t> as </m:t>
-              </m:r>
-              <m:r>
-                <m:rPr>
-                  <m:sty m:val="p"/>
-                </m:rPr>
-                <m:t>(</m:t>
-              </m:r>
-              <m:r>
-                <m:t>n</m:t>
-              </m:r>
-              <m:r>
-                <m:rPr>
-                  <m:sty m:val="p"/>
-                </m:rPr>
-                <m:t>+</m:t>
-              </m:r>
-              <m:r>
-                <m:t>1</m:t>
-              </m:r>
-              <m:r>
-                <m:rPr>
-                  <m:sty m:val="p"/>
-                </m:rPr>
-                <m:t>)</m:t>
-              </m:r>
-              <m:r>
-                <m:rPr>
-                  <m:sty m:val="p"/>
-                </m:rPr>
-                <m:t>+</m:t>
-              </m:r>
-              <m:r>
-                <m:t>1</m:t>
-              </m:r>
-              <m:r>
-                <m:rPr>
-                  <m:nor/>
-                  <m:sty m:val="p"/>
-                </m:rPr>
-                <m:t>)</m:t>
-              </m:r>
-            </m:e>
-          </m:eqArr>
-        </m:oMath>
-      </m:oMathPara>
-    </w:p>
-    <w:p>
-      <w:pPr>
-        <w:pStyle w:val="FirstParagraph"/>
-      </w:pPr>
-      <w:r>
-        <w:t xml:space="preserve">which is the claim for</w:t>
-      </w:r>
-      <w:r>
-        <w:t xml:space="preserve"> </w:t>
-      </w:r>
-      <m:oMath>
-        <m:r>
-          <m:t>n</m:t>
-        </m:r>
-        <m:r>
-          <m:rPr>
-            <m:sty m:val="p"/>
-          </m:rPr>
-          <m:t>+</m:t>
-        </m:r>
-        <m:r>
-          <m:t>1</m:t>
-        </m:r>
-      </m:oMath>
-      <w:r>
-        <w:t xml:space="preserve">.</w:t>
-      </w:r>
-    </w:p>
-    <w:bookmarkEnd w:id="19"/>
-    <w:bookmarkEnd w:id="20"/>
-    <w:bookmarkStart w:id="21" w:name="sec-golden-rule"/>
-    <w:p>
-      <w:pPr>
-        <w:pStyle w:val="Heading2"/>
-      </w:pPr>
-      <w:r>
-        <w:t xml:space="preserve">4 Follow the golden rule</w:t>
-      </w:r>
-    </w:p>
-    <w:p>
-      <w:pPr>
-        <w:pStyle w:val="FirstParagraph"/>
-      </w:pPr>
-      <w:r>
-        <w:t xml:space="preserve">In general,</w:t>
-      </w:r>
-      <w:r>
-        <w:t xml:space="preserve"> </w:t>
-      </w:r>
-      <w:r>
-        <w:t xml:space="preserve">follow the golden rule:</w:t>
-      </w:r>
-      <w:r>
-        <w:t xml:space="preserve"> </w:t>
-      </w:r>
-      <w:r>
-        <w:t xml:space="preserve">treat your readers the way you want to be treated as a reader.</w:t>
-      </w:r>
-    </w:p>
-    <w:p>
-      <w:pPr>
-        <w:pStyle w:val="BodyText"/>
-      </w:pPr>
-      <w:r>
-        <w:t xml:space="preserve">When you read someone else’s proof,</w:t>
-      </w:r>
-      <w:r>
-        <w:t xml:space="preserve"> </w:t>
-      </w:r>
-      <w:r>
-        <w:t xml:space="preserve">you want to be able to follow every step without guessing,</w:t>
-      </w:r>
-      <w:r>
-        <w:t xml:space="preserve"> </w:t>
-      </w:r>
-      <w:r>
-        <w:t xml:space="preserve">to know which result is being used at each line,</w:t>
-      </w:r>
-      <w:r>
-        <w:t xml:space="preserve"> </w:t>
-      </w:r>
-      <w:r>
-        <w:t xml:space="preserve">and to never be left wondering where a quantity came from.</w:t>
-      </w:r>
-      <w:r>
-        <w:t xml:space="preserve"> </w:t>
-      </w:r>
-      <w:r>
-        <w:t xml:space="preserve">Write your own proofs to meet that same standard.</w:t>
-      </w:r>
-    </w:p>
-    <w:bookmarkEnd w:id="21"/>
-    <w:bookmarkStart w:id="27" w:name="sec-proof-by-induction"/>
-    <w:p>
-      <w:pPr>
-        <w:pStyle w:val="Heading2"/>
-      </w:pPr>
-      <w:r>
-        <w:t xml:space="preserve">5 Proof by induction</w:t>
-      </w:r>
-    </w:p>
-    <w:p>
-      <w:pPr>
-        <w:pStyle w:val="FirstParagraph"/>
-      </w:pPr>
-      <w:r>
-        <w:t xml:space="preserve">Many proofs in these notes show that a statement holds</w:t>
-      </w:r>
-      <w:r>
-        <w:t xml:space="preserve"> </w:t>
-      </w:r>
-      <w:r>
-        <w:t xml:space="preserve">for every</w:t>
-      </w:r>
-      <w:r>
-        <w:t xml:space="preserve"> </w:t>
-      </w:r>
-      <w:hyperlink r:id="rId22">
+      <w:hyperlink r:id="rId19">
         <w:r>
           <w:rPr>
             <w:rStyle w:val="Hyperlink"/>
@@ -3302,7 +1598,7 @@
         <w:t xml:space="preserve">induction proves it for all of them with two arguments.</w:t>
       </w:r>
     </w:p>
-    <w:bookmarkStart w:id="23" w:name="def-proof-by-induction"/>
+    <w:bookmarkStart w:id="20" w:name="def-proof-by-induction"/>
     <w:p>
       <w:pPr>
         <w:pStyle w:val="BodyText"/>
@@ -3312,7 +1608,7 @@
           <w:b/>
           <w:bCs/>
         </w:rPr>
-        <w:t xml:space="preserve">Definition 2 (Proof by induction)</w:t>
+        <w:t xml:space="preserve">Definition 1 (Proof by induction)</w:t>
       </w:r>
       <w:r>
         <w:t xml:space="preserve"> </w:t>
@@ -3524,7 +1820,7 @@
         <w:pStyle w:val="Compact"/>
         <w:numPr>
           <w:ilvl w:val="0"/>
-          <w:numId w:val="1003"/>
+          <w:numId w:val="1002"/>
         </w:numPr>
       </w:pPr>
       <w:r>
@@ -3578,7 +1874,7 @@
         <w:pStyle w:val="Compact"/>
         <w:numPr>
           <w:ilvl w:val="0"/>
-          <w:numId w:val="1003"/>
+          <w:numId w:val="1002"/>
         </w:numPr>
       </w:pPr>
       <w:r>
@@ -3768,8 +2064,8 @@
         <w:t xml:space="preserve">.</w:t>
       </w:r>
     </w:p>
-    <w:bookmarkEnd w:id="23"/>
-    <w:bookmarkStart w:id="24" w:name="rem-induction-why"/>
+    <w:bookmarkEnd w:id="20"/>
+    <w:bookmarkStart w:id="21" w:name="rem-induction-why"/>
     <w:p>
       <w:pPr>
         <w:pStyle w:val="BodyText"/>
@@ -4238,7 +2534,7 @@
         <w:t xml:space="preserve">.</w:t>
       </w:r>
     </w:p>
-    <w:bookmarkEnd w:id="24"/>
+    <w:bookmarkEnd w:id="21"/>
     <w:p>
       <w:pPr>
         <w:pStyle w:val="BodyText"/>
@@ -4249,7 +2545,7 @@
       <w:r>
         <w:t xml:space="preserve"> </w:t>
       </w:r>
-      <w:hyperlink r:id="rId25">
+      <w:hyperlink r:id="rId22">
         <w:r>
           <w:rPr>
             <w:rStyle w:val="Hyperlink"/>
@@ -4261,7 +2557,7 @@
         <w:t xml:space="preserve">.</w:t>
       </w:r>
     </w:p>
-    <w:bookmarkStart w:id="26" w:name="exm-induction-sum"/>
+    <w:bookmarkStart w:id="23" w:name="exm-induction-sum"/>
     <w:p>
       <w:pPr>
         <w:pStyle w:val="BodyText"/>
@@ -4271,7 +2567,7 @@
           <w:b/>
           <w:bCs/>
         </w:rPr>
-        <w:t xml:space="preserve">Example 2 (Sum of the first</w:t>
+        <w:t xml:space="preserve">Example 1 (Sum of the first</w:t>
       </w:r>
       <w:r>
         <w:rPr>
@@ -4594,7 +2890,7 @@
           <w:rPr>
             <w:rStyle w:val="Hyperlink"/>
           </w:rPr>
-          <w:t xml:space="preserve">Definition 2</w:t>
+          <w:t xml:space="preserve">Definition 1</w:t>
         </w:r>
       </w:hyperlink>
       <w:r>
@@ -6385,7 +4681,7 @@
           <w:rPr>
             <w:rStyle w:val="Hyperlink"/>
           </w:rPr>
-          <w:t xml:space="preserve">Definition 2</w:t>
+          <w:t xml:space="preserve">Definition 1</w:t>
         </w:r>
       </w:hyperlink>
       <w:r>
@@ -6422,15 +4718,15 @@
         <w:t xml:space="preserve">.</w:t>
       </w:r>
     </w:p>
-    <w:bookmarkEnd w:id="26"/>
-    <w:bookmarkEnd w:id="27"/>
-    <w:bookmarkStart w:id="29" w:name="sec-further-reading"/>
+    <w:bookmarkEnd w:id="23"/>
+    <w:bookmarkEnd w:id="24"/>
+    <w:bookmarkStart w:id="26" w:name="sec-further-reading"/>
     <w:p>
       <w:pPr>
         <w:pStyle w:val="Heading2"/>
       </w:pPr>
       <w:r>
-        <w:t xml:space="preserve">6 Further reading</w:t>
+        <w:t xml:space="preserve">5 Further reading</w:t>
       </w:r>
     </w:p>
     <w:p>
@@ -6438,7 +4734,7 @@
         <w:pStyle w:val="Compact"/>
         <w:numPr>
           <w:ilvl w:val="0"/>
-          <w:numId w:val="1004"/>
+          <w:numId w:val="1003"/>
         </w:numPr>
       </w:pPr>
       <w:r>
@@ -6459,7 +4755,7 @@
       <w:r>
         <w:t xml:space="preserve"> </w:t>
       </w:r>
-      <w:hyperlink r:id="rId28">
+      <w:hyperlink r:id="rId25">
         <w:r>
           <w:rPr>
             <w:rStyle w:val="Hyperlink"/>
@@ -6476,7 +4772,7 @@
         <w:pStyle w:val="Compact"/>
         <w:numPr>
           <w:ilvl w:val="0"/>
-          <w:numId w:val="1004"/>
+          <w:numId w:val="1003"/>
         </w:numPr>
       </w:pPr>
       <w:r>
@@ -6489,8 +4785,8 @@
         <w:t xml:space="preserve">treats proofs as formal derivations in propositional and first-order logic.</w:t>
       </w:r>
     </w:p>
-    <w:bookmarkEnd w:id="29"/>
-    <w:bookmarkStart w:id="35" w:name="references"/>
+    <w:bookmarkEnd w:id="26"/>
+    <w:bookmarkStart w:id="32" w:name="references"/>
     <w:p>
       <w:pPr>
         <w:pStyle w:val="Heading2"/>
@@ -6499,8 +4795,8 @@
         <w:t xml:space="preserve">References</w:t>
       </w:r>
     </w:p>
-    <w:bookmarkStart w:id="34" w:name="refs"/>
-    <w:bookmarkStart w:id="31" w:name="ref-barkerplummer2011language"/>
+    <w:bookmarkStart w:id="31" w:name="refs"/>
+    <w:bookmarkStart w:id="28" w:name="ref-barkerplummer2011language"/>
     <w:p>
       <w:pPr>
         <w:pStyle w:val="Bibliography"/>
@@ -6524,7 +4820,7 @@
       <w:r>
         <w:t xml:space="preserve"> </w:t>
       </w:r>
-      <w:hyperlink r:id="rId30">
+      <w:hyperlink r:id="rId27">
         <w:r>
           <w:rPr>
             <w:rStyle w:val="Hyperlink"/>
@@ -6536,8 +4832,8 @@
         <w:t xml:space="preserve">.</w:t>
       </w:r>
     </w:p>
-    <w:bookmarkEnd w:id="31"/>
-    <w:bookmarkStart w:id="33" w:name="ref-velleman2019prove"/>
+    <w:bookmarkEnd w:id="28"/>
+    <w:bookmarkStart w:id="30" w:name="ref-velleman2019prove"/>
     <w:p>
       <w:pPr>
         <w:pStyle w:val="Bibliography"/>
@@ -6561,7 +4857,7 @@
       <w:r>
         <w:t xml:space="preserve"> </w:t>
       </w:r>
-      <w:hyperlink r:id="rId32">
+      <w:hyperlink r:id="rId29">
         <w:r>
           <w:rPr>
             <w:rStyle w:val="Hyperlink"/>
@@ -6573,9 +4869,9 @@
         <w:t xml:space="preserve">.</w:t>
       </w:r>
     </w:p>
-    <w:bookmarkEnd w:id="33"/>
-    <w:bookmarkEnd w:id="34"/>
-    <w:bookmarkEnd w:id="35"/>
+    <w:bookmarkEnd w:id="30"/>
+    <w:bookmarkEnd w:id="31"/>
+    <w:bookmarkEnd w:id="32"/>
     <w:sectPr>
       <w:footnotePr>
         <w:numRestart w:val="eachSect"/>
@@ -6911,36 +5207,6 @@
     </w:lvlOverride>
   </w:num>
   <w:num w:numId="1003">
-    <w:abstractNumId w:val="99411"/>
-    <w:lvlOverride w:ilvl="0">
-      <w:startOverride w:val="1"/>
-    </w:lvlOverride>
-    <w:lvlOverride w:ilvl="1">
-      <w:startOverride w:val="1"/>
-    </w:lvlOverride>
-    <w:lvlOverride w:ilvl="2">
-      <w:startOverride w:val="1"/>
-    </w:lvlOverride>
-    <w:lvlOverride w:ilvl="3">
-      <w:startOverride w:val="1"/>
-    </w:lvlOverride>
-    <w:lvlOverride w:ilvl="4">
-      <w:startOverride w:val="1"/>
-    </w:lvlOverride>
-    <w:lvlOverride w:ilvl="5">
-      <w:startOverride w:val="1"/>
-    </w:lvlOverride>
-    <w:lvlOverride w:ilvl="6">
-      <w:startOverride w:val="1"/>
-    </w:lvlOverride>
-    <w:lvlOverride w:ilvl="7">
-      <w:startOverride w:val="1"/>
-    </w:lvlOverride>
-    <w:lvlOverride w:ilvl="8">
-      <w:startOverride w:val="1"/>
-    </w:lvlOverride>
-  </w:num>
-  <w:num w:numId="1004">
     <w:abstractNumId w:val="991"/>
   </w:num>
 </w:numbering>

</xml_diff>

<commit_message>
Deploying to gh-pages from @ Morrison-Lab/mds@73b17143a7ab36ba029046c8dd991c04ab3b32b4 🚀
</commit_message>
<xml_diff>
--- a/proof-writing.docx
+++ b/proof-writing.docx
@@ -15,7 +15,7 @@
         <w:pStyle w:val="Date"/>
       </w:pPr>
       <w:r>
-        <w:t xml:space="preserve">Last modified: 2026-10-05 23:48:06 (PDT)</w:t>
+        <w:t xml:space="preserve">Last modified: 2026-10-05 23:57:28 (PDT)</w:t>
       </w:r>
     </w:p>
     <w:p>
@@ -130,12 +130,29 @@
         <w:t xml:space="preserve"> </w:t>
       </w:r>
       <w:r>
-        <w:t xml:space="preserve">The symbols for logical entailment are listed under</w:t>
+        <w:t xml:space="preserve">The symbols for</w:t>
       </w:r>
       <w:r>
         <w:t xml:space="preserve"> </w:t>
       </w:r>
       <w:hyperlink r:id="rId12">
+        <w:r>
+          <w:rPr>
+            <w:rStyle w:val="Hyperlink"/>
+          </w:rPr>
+          <w:t xml:space="preserve">logical entailment</w:t>
+        </w:r>
+      </w:hyperlink>
+      <w:r>
+        <w:t xml:space="preserve"> </w:t>
+      </w:r>
+      <w:r>
+        <w:t xml:space="preserve">are listed under</w:t>
+      </w:r>
+      <w:r>
+        <w:t xml:space="preserve"> </w:t>
+      </w:r>
+      <w:hyperlink r:id="rId13">
         <w:r>
           <w:rPr>
             <w:rStyle w:val="Hyperlink"/>
@@ -150,7 +167,7 @@
         <w:t xml:space="preserve">on the Notation page.</w:t>
       </w:r>
     </w:p>
-    <w:bookmarkStart w:id="13" w:name="sec-dont-skip-steps"/>
+    <w:bookmarkStart w:id="14" w:name="sec-dont-skip-steps"/>
     <w:p>
       <w:pPr>
         <w:pStyle w:val="Heading2"/>
@@ -305,8 +322,8 @@
         <w:t xml:space="preserve">show the step instead.</w:t>
       </w:r>
     </w:p>
-    <w:bookmarkEnd w:id="13"/>
-    <w:bookmarkStart w:id="17" w:name="sec-annotate-each-step"/>
+    <w:bookmarkEnd w:id="14"/>
+    <w:bookmarkStart w:id="20" w:name="sec-annotate-each-step"/>
     <w:p>
       <w:pPr>
         <w:pStyle w:val="Heading2"/>
@@ -377,7 +394,7 @@
       <w:r>
         <w:t xml:space="preserve"> </w:t>
       </w:r>
-      <w:hyperlink r:id="rId14">
+      <w:hyperlink r:id="rId15">
         <w:r>
           <w:rPr>
             <w:rStyle w:val="Hyperlink"/>
@@ -481,7 +498,21 @@
         <w:t xml:space="preserve"> </w:t>
       </w:r>
       <w:r>
-        <w:t xml:space="preserve">is idempotent,</w:t>
+        <w:t xml:space="preserve">is</w:t>
+      </w:r>
+      <w:r>
+        <w:t xml:space="preserve"> </w:t>
+      </w:r>
+      <w:hyperlink r:id="rId16">
+        <w:r>
+          <w:rPr>
+            <w:rStyle w:val="Hyperlink"/>
+          </w:rPr>
+          <w:t xml:space="preserve">idempotent</w:t>
+        </w:r>
+      </w:hyperlink>
+      <w:r>
+        <w:t xml:space="preserve">,</w:t>
       </w:r>
       <w:r>
         <w:t xml:space="preserve"> </w:t>
@@ -1260,7 +1291,7 @@
       <w:r>
         <w:t xml:space="preserve"> </w:t>
       </w:r>
-      <w:hyperlink r:id="rId15">
+      <w:hyperlink r:id="rId17">
         <w:r>
           <w:rPr>
             <w:rStyle w:val="Hyperlink"/>
@@ -1295,7 +1326,21 @@
         <w:t xml:space="preserve"> </w:t>
       </w:r>
       <w:r>
-        <w:t xml:space="preserve">is a projection matrix.</w:t>
+        <w:t xml:space="preserve">is a</w:t>
+      </w:r>
+      <w:r>
+        <w:t xml:space="preserve"> </w:t>
+      </w:r>
+      <w:hyperlink r:id="rId18">
+        <w:r>
+          <w:rPr>
+            <w:rStyle w:val="Hyperlink"/>
+          </w:rPr>
+          <w:t xml:space="preserve">projection matrix</w:t>
+        </w:r>
+      </w:hyperlink>
+      <w:r>
+        <w:t xml:space="preserve">.</w:t>
       </w:r>
       <w:r>
         <w:t xml:space="preserve"> </w:t>
@@ -1432,7 +1477,7 @@
       <w:r>
         <w:t xml:space="preserve"> </w:t>
       </w:r>
-      <w:hyperlink r:id="rId16">
+      <w:hyperlink r:id="rId19">
         <w:r>
           <w:rPr>
             <w:rStyle w:val="Hyperlink"/>
@@ -1444,83 +1489,1072 @@
         <w:t xml:space="preserve">.</w:t>
       </w:r>
     </w:p>
-    <w:bookmarkEnd w:id="17"/>
-    <w:bookmarkStart w:id="18" w:name="sec-golden-rule"/>
+    <w:bookmarkEnd w:id="20"/>
+    <w:bookmarkStart w:id="26" w:name="sec-direct-proof"/>
     <w:p>
       <w:pPr>
         <w:pStyle w:val="Heading2"/>
       </w:pPr>
       <w:r>
-        <w:t xml:space="preserve">3 Follow the golden rule</w:t>
+        <w:t xml:space="preserve">3 Direct proof</w:t>
+      </w:r>
+    </w:p>
+    <w:bookmarkStart w:id="22" w:name="def-direct-proof"/>
+    <w:p>
+      <w:pPr>
+        <w:pStyle w:val="FirstParagraph"/>
+      </w:pPr>
+      <w:r>
+        <w:rPr>
+          <w:b/>
+          <w:bCs/>
+        </w:rPr>
+        <w:t xml:space="preserve">Definition 1 (Direct proof)</w:t>
+      </w:r>
+      <w:r>
+        <w:t xml:space="preserve"> </w:t>
+      </w:r>
+      <w:r>
+        <w:t xml:space="preserve">A</w:t>
+      </w:r>
+      <w:r>
+        <w:t xml:space="preserve"> </w:t>
+      </w:r>
+      <w:r>
+        <w:rPr>
+          <w:b/>
+          <w:bCs/>
+        </w:rPr>
+        <w:t xml:space="preserve">direct proof</w:t>
+      </w:r>
+      <w:r>
+        <w:t xml:space="preserve"> </w:t>
+      </w:r>
+      <w:r>
+        <w:t xml:space="preserve">of a proposition</w:t>
+      </w:r>
+      <w:r>
+        <w:t xml:space="preserve"> </w:t>
+      </w:r>
+      <m:oMath>
+        <m:r>
+          <m:t>Q</m:t>
+        </m:r>
+      </m:oMath>
+      <w:r>
+        <w:t xml:space="preserve"> </w:t>
+      </w:r>
+      <w:r>
+        <w:t xml:space="preserve">starts from the assumptions that</w:t>
+      </w:r>
+      <w:r>
+        <w:t xml:space="preserve"> </w:t>
+      </w:r>
+      <m:oMath>
+        <m:r>
+          <m:t>Q</m:t>
+        </m:r>
+      </m:oMath>
+      <w:r>
+        <w:t xml:space="preserve"> </w:t>
+      </w:r>
+      <w:r>
+        <w:t xml:space="preserve">is stated under, if any,</w:t>
+      </w:r>
+      <w:r>
+        <w:t xml:space="preserve"> </w:t>
+      </w:r>
+      <w:r>
+        <w:t xml:space="preserve">and reaches</w:t>
+      </w:r>
+      <w:r>
+        <w:t xml:space="preserve"> </w:t>
+      </w:r>
+      <m:oMath>
+        <m:r>
+          <m:t>Q</m:t>
+        </m:r>
+      </m:oMath>
+      <w:r>
+        <w:t xml:space="preserve"> </w:t>
+      </w:r>
+      <w:r>
+        <w:t xml:space="preserve">through a chain of steps,</w:t>
+      </w:r>
+      <w:r>
+        <w:t xml:space="preserve"> </w:t>
+      </w:r>
+      <w:r>
+        <w:t xml:space="preserve">each of which applies a definition,</w:t>
+      </w:r>
+      <w:r>
+        <w:t xml:space="preserve"> </w:t>
+      </w:r>
+      <w:r>
+        <w:t xml:space="preserve">a previously proved result,</w:t>
+      </w:r>
+      <w:r>
+        <w:t xml:space="preserve"> </w:t>
+      </w:r>
+      <w:r>
+        <w:t xml:space="preserve">or one rule of logic or algebra</w:t>
+      </w:r>
+      <w:r>
+        <w:t xml:space="preserve"> </w:t>
+      </w:r>
+      <w:r>
+        <w:t xml:space="preserve">to the assumptions or to earlier steps.</w:t>
+      </w:r>
+      <w:r>
+        <w:t xml:space="preserve"> </w:t>
+      </w:r>
+      <w:r>
+        <w:t xml:space="preserve">A direct proof never assumes that</w:t>
+      </w:r>
+      <w:r>
+        <w:t xml:space="preserve"> </w:t>
+      </w:r>
+      <m:oMath>
+        <m:r>
+          <m:t>Q</m:t>
+        </m:r>
+      </m:oMath>
+      <w:r>
+        <w:t xml:space="preserve"> </w:t>
+      </w:r>
+      <w:r>
+        <w:t xml:space="preserve">is false;</w:t>
+      </w:r>
+      <w:r>
+        <w:t xml:space="preserve"> </w:t>
+      </w:r>
+      <w:r>
+        <w:t xml:space="preserve">compare</w:t>
+      </w:r>
+      <w:r>
+        <w:t xml:space="preserve"> </w:t>
+      </w:r>
+      <w:hyperlink r:id="rId21">
+        <w:r>
+          <w:rPr>
+            <w:rStyle w:val="Hyperlink"/>
+          </w:rPr>
+          <w:t xml:space="preserve">proof by contradiction</w:t>
+        </w:r>
+      </w:hyperlink>
+      <w:r>
+        <w:t xml:space="preserve">,</w:t>
+      </w:r>
+      <w:r>
+        <w:t xml:space="preserve"> </w:t>
+      </w:r>
+      <w:r>
+        <w:t xml:space="preserve">which does.</w:t>
+      </w:r>
+    </w:p>
+    <w:bookmarkEnd w:id="22"/>
+    <w:bookmarkStart w:id="25" w:name="exm-direct-proof"/>
+    <w:p>
+      <w:pPr>
+        <w:pStyle w:val="BodyText"/>
+      </w:pPr>
+      <w:r>
+        <w:rPr>
+          <w:b/>
+          <w:bCs/>
+        </w:rPr>
+        <w:t xml:space="preserve">Example 1 (The square of an odd integer is odd)</w:t>
+      </w:r>
+      <w:r>
+        <w:t xml:space="preserve"> </w:t>
+      </w:r>
+      <w:r>
+        <w:t xml:space="preserve">Claim: if</w:t>
+      </w:r>
+      <w:r>
+        <w:t xml:space="preserve"> </w:t>
+      </w:r>
+      <m:oMath>
+        <m:r>
+          <m:t>n</m:t>
+        </m:r>
+      </m:oMath>
+      <w:r>
+        <w:t xml:space="preserve"> </w:t>
+      </w:r>
+      <w:r>
+        <w:t xml:space="preserve">is an</w:t>
+      </w:r>
+      <w:r>
+        <w:t xml:space="preserve"> </w:t>
+      </w:r>
+      <w:hyperlink r:id="rId23">
+        <w:r>
+          <w:rPr>
+            <w:rStyle w:val="Hyperlink"/>
+          </w:rPr>
+          <w:t xml:space="preserve">odd</w:t>
+        </w:r>
+      </w:hyperlink>
+      <w:r>
+        <w:t xml:space="preserve"> </w:t>
+      </w:r>
+      <w:r>
+        <w:t xml:space="preserve">integer,</w:t>
+      </w:r>
+      <w:r>
+        <w:t xml:space="preserve"> </w:t>
+      </w:r>
+      <w:r>
+        <w:t xml:space="preserve">then</w:t>
+      </w:r>
+      <w:r>
+        <w:t xml:space="preserve"> </w:t>
+      </w:r>
+      <m:oMath>
+        <m:sSup>
+          <m:e>
+            <m:r>
+              <m:t>n</m:t>
+            </m:r>
+          </m:e>
+          <m:sup>
+            <m:r>
+              <m:t>2</m:t>
+            </m:r>
+          </m:sup>
+        </m:sSup>
+      </m:oMath>
+      <w:r>
+        <w:t xml:space="preserve"> </w:t>
+      </w:r>
+      <w:r>
+        <w:t xml:space="preserve">is odd.</w:t>
       </w:r>
     </w:p>
     <w:p>
       <w:pPr>
-        <w:pStyle w:val="FirstParagraph"/>
-      </w:pPr>
-      <w:r>
-        <w:t xml:space="preserve">In general,</w:t>
-      </w:r>
-      <w:r>
-        <w:t xml:space="preserve"> </w:t>
-      </w:r>
-      <w:r>
-        <w:t xml:space="preserve">follow the golden rule:</w:t>
-      </w:r>
-      <w:r>
-        <w:t xml:space="preserve"> </w:t>
-      </w:r>
-      <w:r>
-        <w:t xml:space="preserve">treat your readers the way you want to be treated as a reader.</w:t>
+        <w:pStyle w:val="BodyText"/>
+      </w:pPr>
+      <w:r>
+        <w:t xml:space="preserve">Since</w:t>
+      </w:r>
+      <w:r>
+        <w:t xml:space="preserve"> </w:t>
+      </w:r>
+      <m:oMath>
+        <m:r>
+          <m:t>n</m:t>
+        </m:r>
+      </m:oMath>
+      <w:r>
+        <w:t xml:space="preserve"> </w:t>
+      </w:r>
+      <w:r>
+        <w:t xml:space="preserve">is odd,</w:t>
+      </w:r>
+      <w:r>
+        <w:t xml:space="preserve"> </w:t>
+      </w:r>
+      <w:r>
+        <w:t xml:space="preserve">there is an integer</w:t>
+      </w:r>
+      <w:r>
+        <w:t xml:space="preserve"> </w:t>
+      </w:r>
+      <m:oMath>
+        <m:r>
+          <m:t>k</m:t>
+        </m:r>
+      </m:oMath>
+      <w:r>
+        <w:t xml:space="preserve"> </w:t>
+      </w:r>
+      <w:r>
+        <w:t xml:space="preserve">with</w:t>
+      </w:r>
+      <w:r>
+        <w:t xml:space="preserve"> </w:t>
+      </w:r>
+      <m:oMath>
+        <m:r>
+          <m:t>n</m:t>
+        </m:r>
+        <m:r>
+          <m:rPr>
+            <m:sty m:val="p"/>
+          </m:rPr>
+          <m:t>=</m:t>
+        </m:r>
+        <m:r>
+          <m:t>2</m:t>
+        </m:r>
+        <m:r>
+          <m:t>k</m:t>
+        </m:r>
+        <m:r>
+          <m:rPr>
+            <m:sty m:val="p"/>
+          </m:rPr>
+          <m:t>+</m:t>
+        </m:r>
+        <m:r>
+          <m:t>1</m:t>
+        </m:r>
+      </m:oMath>
+      <w:r>
+        <w:t xml:space="preserve">.</w:t>
+      </w:r>
+      <w:r>
+        <w:t xml:space="preserve"> </w:t>
+      </w:r>
+      <w:r>
+        <w:t xml:space="preserve">Then</w:t>
       </w:r>
     </w:p>
     <w:p>
       <w:pPr>
         <w:pStyle w:val="BodyText"/>
       </w:pPr>
-      <w:r>
-        <w:t xml:space="preserve">When you read someone else’s proof,</w:t>
-      </w:r>
-      <w:r>
-        <w:t xml:space="preserve"> </w:t>
-      </w:r>
-      <w:r>
-        <w:t xml:space="preserve">you want to be able to follow every step without guessing,</w:t>
-      </w:r>
-      <w:r>
-        <w:t xml:space="preserve"> </w:t>
-      </w:r>
-      <w:r>
-        <w:t xml:space="preserve">to know which result is being used at each line,</w:t>
-      </w:r>
-      <w:r>
-        <w:t xml:space="preserve"> </w:t>
-      </w:r>
-      <w:r>
-        <w:t xml:space="preserve">and to never be left wondering where a quantity came from.</w:t>
-      </w:r>
-      <w:r>
-        <w:t xml:space="preserve"> </w:t>
-      </w:r>
-      <w:r>
-        <w:t xml:space="preserve">Write your own proofs to meet that same standard.</w:t>
-      </w:r>
-    </w:p>
-    <w:bookmarkEnd w:id="18"/>
-    <w:bookmarkStart w:id="24" w:name="sec-proof-by-induction"/>
-    <w:p>
-      <w:pPr>
-        <w:pStyle w:val="Heading2"/>
-      </w:pPr>
-      <w:r>
-        <w:t xml:space="preserve">4 Proof by induction</w:t>
-      </w:r>
+      <m:oMathPara>
+        <m:oMathParaPr>
+          <m:jc m:val="center"/>
+        </m:oMathParaPr>
+        <m:oMath>
+          <m:eqArr>
+            <m:e>
+              <m:sSup>
+                <m:e>
+                  <m:r>
+                    <m:t>n</m:t>
+                  </m:r>
+                </m:e>
+                <m:sup>
+                  <m:r>
+                    <m:t>2</m:t>
+                  </m:r>
+                </m:sup>
+              </m:sSup>
+              <m:r>
+                <m:t>&amp;</m:t>
+              </m:r>
+              <m:r>
+                <m:rPr>
+                  <m:sty m:val="p"/>
+                </m:rPr>
+                <m:t>=</m:t>
+              </m:r>
+              <m:r>
+                <m:rPr>
+                  <m:sty m:val="p"/>
+                </m:rPr>
+                <m:t>(</m:t>
+              </m:r>
+              <m:r>
+                <m:t>2</m:t>
+              </m:r>
+              <m:r>
+                <m:t>k</m:t>
+              </m:r>
+              <m:r>
+                <m:rPr>
+                  <m:sty m:val="p"/>
+                </m:rPr>
+                <m:t>+</m:t>
+              </m:r>
+              <m:r>
+                <m:t>1</m:t>
+              </m:r>
+              <m:sSup>
+                <m:e>
+                  <m:r>
+                    <m:rPr>
+                      <m:sty m:val="p"/>
+                    </m:rPr>
+                    <m:t>)</m:t>
+                  </m:r>
+                </m:e>
+                <m:sup>
+                  <m:r>
+                    <m:t>2</m:t>
+                  </m:r>
+                </m:sup>
+              </m:sSup>
+              <m:r>
+                <m:t>&amp;</m:t>
+              </m:r>
+              <m:r>
+                <m:t>&amp;</m:t>
+              </m:r>
+              <m:r>
+                <m:rPr>
+                  <m:nor/>
+                  <m:sty m:val="p"/>
+                </m:rPr>
+                <m:t>(substitute </m:t>
+              </m:r>
+              <m:r>
+                <m:t>n</m:t>
+              </m:r>
+              <m:r>
+                <m:rPr>
+                  <m:sty m:val="p"/>
+                </m:rPr>
+                <m:t>=</m:t>
+              </m:r>
+              <m:r>
+                <m:t>2</m:t>
+              </m:r>
+              <m:r>
+                <m:t>k</m:t>
+              </m:r>
+              <m:r>
+                <m:rPr>
+                  <m:sty m:val="p"/>
+                </m:rPr>
+                <m:t>+</m:t>
+              </m:r>
+              <m:r>
+                <m:t>1</m:t>
+              </m:r>
+              <m:r>
+                <m:rPr>
+                  <m:nor/>
+                  <m:sty m:val="p"/>
+                </m:rPr>
+                <m:t>)</m:t>
+              </m:r>
+            </m:e>
+            <m:e>
+              <m:r>
+                <m:t>&amp;</m:t>
+              </m:r>
+              <m:r>
+                <m:rPr>
+                  <m:sty m:val="p"/>
+                </m:rPr>
+                <m:t>=</m:t>
+              </m:r>
+              <m:r>
+                <m:rPr>
+                  <m:sty m:val="p"/>
+                </m:rPr>
+                <m:t>(</m:t>
+              </m:r>
+              <m:r>
+                <m:t>2</m:t>
+              </m:r>
+              <m:r>
+                <m:t>k</m:t>
+              </m:r>
+              <m:sSup>
+                <m:e>
+                  <m:r>
+                    <m:rPr>
+                      <m:sty m:val="p"/>
+                    </m:rPr>
+                    <m:t>)</m:t>
+                  </m:r>
+                </m:e>
+                <m:sup>
+                  <m:r>
+                    <m:t>2</m:t>
+                  </m:r>
+                </m:sup>
+              </m:sSup>
+              <m:r>
+                <m:rPr>
+                  <m:sty m:val="p"/>
+                </m:rPr>
+                <m:t>+</m:t>
+              </m:r>
+              <m:r>
+                <m:t>2</m:t>
+              </m:r>
+              <m:r>
+                <m:rPr>
+                  <m:sty m:val="p"/>
+                </m:rPr>
+                <m:t>⋅</m:t>
+              </m:r>
+              <m:r>
+                <m:t>2</m:t>
+              </m:r>
+              <m:r>
+                <m:t>k</m:t>
+              </m:r>
+              <m:r>
+                <m:rPr>
+                  <m:sty m:val="p"/>
+                </m:rPr>
+                <m:t>⋅</m:t>
+              </m:r>
+              <m:r>
+                <m:t>1</m:t>
+              </m:r>
+              <m:r>
+                <m:rPr>
+                  <m:sty m:val="p"/>
+                </m:rPr>
+                <m:t>+</m:t>
+              </m:r>
+              <m:sSup>
+                <m:e>
+                  <m:r>
+                    <m:t>1</m:t>
+                  </m:r>
+                </m:e>
+                <m:sup>
+                  <m:r>
+                    <m:t>2</m:t>
+                  </m:r>
+                </m:sup>
+              </m:sSup>
+              <m:r>
+                <m:t>&amp;</m:t>
+              </m:r>
+              <m:r>
+                <m:t>&amp;</m:t>
+              </m:r>
+              <m:r>
+                <m:rPr>
+                  <m:nor/>
+                  <m:sty m:val="p"/>
+                </m:rPr>
+                <m:t>(square of a sum)</m:t>
+              </m:r>
+            </m:e>
+            <m:e>
+              <m:r>
+                <m:t>&amp;</m:t>
+              </m:r>
+              <m:r>
+                <m:rPr>
+                  <m:sty m:val="p"/>
+                </m:rPr>
+                <m:t>=</m:t>
+              </m:r>
+              <m:r>
+                <m:t>4</m:t>
+              </m:r>
+              <m:sSup>
+                <m:e>
+                  <m:r>
+                    <m:t>k</m:t>
+                  </m:r>
+                </m:e>
+                <m:sup>
+                  <m:r>
+                    <m:t>2</m:t>
+                  </m:r>
+                </m:sup>
+              </m:sSup>
+              <m:r>
+                <m:rPr>
+                  <m:sty m:val="p"/>
+                </m:rPr>
+                <m:t>+</m:t>
+              </m:r>
+              <m:r>
+                <m:t>4</m:t>
+              </m:r>
+              <m:r>
+                <m:t>k</m:t>
+              </m:r>
+              <m:r>
+                <m:rPr>
+                  <m:sty m:val="p"/>
+                </m:rPr>
+                <m:t>+</m:t>
+              </m:r>
+              <m:r>
+                <m:t>1</m:t>
+              </m:r>
+              <m:r>
+                <m:t>&amp;</m:t>
+              </m:r>
+              <m:r>
+                <m:t>&amp;</m:t>
+              </m:r>
+              <m:r>
+                <m:rPr>
+                  <m:nor/>
+                  <m:sty m:val="p"/>
+                </m:rPr>
+                <m:t>(arithmetic)</m:t>
+              </m:r>
+            </m:e>
+            <m:e>
+              <m:r>
+                <m:t>&amp;</m:t>
+              </m:r>
+              <m:r>
+                <m:rPr>
+                  <m:sty m:val="p"/>
+                </m:rPr>
+                <m:t>=</m:t>
+              </m:r>
+              <m:r>
+                <m:t>2</m:t>
+              </m:r>
+              <m:r>
+                <m:rPr>
+                  <m:sty m:val="p"/>
+                </m:rPr>
+                <m:t>(</m:t>
+              </m:r>
+              <m:r>
+                <m:t>2</m:t>
+              </m:r>
+              <m:sSup>
+                <m:e>
+                  <m:r>
+                    <m:t>k</m:t>
+                  </m:r>
+                </m:e>
+                <m:sup>
+                  <m:r>
+                    <m:t>2</m:t>
+                  </m:r>
+                </m:sup>
+              </m:sSup>
+              <m:r>
+                <m:rPr>
+                  <m:sty m:val="p"/>
+                </m:rPr>
+                <m:t>+</m:t>
+              </m:r>
+              <m:r>
+                <m:t>2</m:t>
+              </m:r>
+              <m:r>
+                <m:t>k</m:t>
+              </m:r>
+              <m:r>
+                <m:rPr>
+                  <m:sty m:val="p"/>
+                </m:rPr>
+                <m:t>)</m:t>
+              </m:r>
+              <m:r>
+                <m:rPr>
+                  <m:sty m:val="p"/>
+                </m:rPr>
+                <m:t>+</m:t>
+              </m:r>
+              <m:r>
+                <m:t>1</m:t>
+              </m:r>
+              <m:r>
+                <m:t>&amp;</m:t>
+              </m:r>
+              <m:r>
+                <m:t>&amp;</m:t>
+              </m:r>
+              <m:r>
+                <m:rPr>
+                  <m:nor/>
+                  <m:sty m:val="p"/>
+                </m:rPr>
+                <m:t>(distributive law, read from right to left)</m:t>
+              </m:r>
+            </m:e>
+          </m:eqArr>
+        </m:oMath>
+      </m:oMathPara>
     </w:p>
     <w:p>
       <w:pPr>
         <w:pStyle w:val="FirstParagraph"/>
       </w:pPr>
       <w:r>
+        <w:t xml:space="preserve">and</w:t>
+      </w:r>
+      <w:r>
+        <w:t xml:space="preserve"> </w:t>
+      </w:r>
+      <m:oMath>
+        <m:r>
+          <m:t>2</m:t>
+        </m:r>
+        <m:sSup>
+          <m:e>
+            <m:r>
+              <m:t>k</m:t>
+            </m:r>
+          </m:e>
+          <m:sup>
+            <m:r>
+              <m:t>2</m:t>
+            </m:r>
+          </m:sup>
+        </m:sSup>
+        <m:r>
+          <m:rPr>
+            <m:sty m:val="p"/>
+          </m:rPr>
+          <m:t>+</m:t>
+        </m:r>
+        <m:r>
+          <m:t>2</m:t>
+        </m:r>
+        <m:r>
+          <m:t>k</m:t>
+        </m:r>
+      </m:oMath>
+      <w:r>
+        <w:t xml:space="preserve"> </w:t>
+      </w:r>
+      <w:r>
+        <w:t xml:space="preserve">is an integer,</w:t>
+      </w:r>
+      <w:r>
+        <w:t xml:space="preserve"> </w:t>
+      </w:r>
+      <w:r>
+        <w:t xml:space="preserve">because sums and products of integers are integers.</w:t>
+      </w:r>
+      <w:r>
+        <w:t xml:space="preserve"> </w:t>
+      </w:r>
+      <w:r>
+        <w:t xml:space="preserve">So</w:t>
+      </w:r>
+      <w:r>
+        <w:t xml:space="preserve"> </w:t>
+      </w:r>
+      <m:oMath>
+        <m:sSup>
+          <m:e>
+            <m:r>
+              <m:t>n</m:t>
+            </m:r>
+          </m:e>
+          <m:sup>
+            <m:r>
+              <m:t>2</m:t>
+            </m:r>
+          </m:sup>
+        </m:sSup>
+        <m:r>
+          <m:rPr>
+            <m:sty m:val="p"/>
+          </m:rPr>
+          <m:t>=</m:t>
+        </m:r>
+        <m:r>
+          <m:t>2</m:t>
+        </m:r>
+        <m:r>
+          <m:rPr>
+            <m:sty m:val="p"/>
+          </m:rPr>
+          <m:t>⋅</m:t>
+        </m:r>
+        <m:r>
+          <m:rPr>
+            <m:sty m:val="p"/>
+          </m:rPr>
+          <m:t>(</m:t>
+        </m:r>
+        <m:r>
+          <m:rPr>
+            <m:nor/>
+            <m:sty m:val="p"/>
+          </m:rPr>
+          <m:t>an integer</m:t>
+        </m:r>
+        <m:r>
+          <m:rPr>
+            <m:sty m:val="p"/>
+          </m:rPr>
+          <m:t>)</m:t>
+        </m:r>
+        <m:r>
+          <m:rPr>
+            <m:sty m:val="p"/>
+          </m:rPr>
+          <m:t>+</m:t>
+        </m:r>
+        <m:r>
+          <m:t>1</m:t>
+        </m:r>
+      </m:oMath>
+      <w:r>
+        <w:t xml:space="preserve">, which is the definition of odd.</w:t>
+      </w:r>
+      <w:r>
+        <w:t xml:space="preserve"> </w:t>
+      </w:r>
+      <w:r>
+        <w:t xml:space="preserve">For example,</w:t>
+      </w:r>
+      <w:r>
+        <w:t xml:space="preserve"> </w:t>
+      </w:r>
+      <m:oMath>
+        <m:r>
+          <m:t>n</m:t>
+        </m:r>
+        <m:r>
+          <m:rPr>
+            <m:sty m:val="p"/>
+          </m:rPr>
+          <m:t>=</m:t>
+        </m:r>
+        <m:r>
+          <m:t>7</m:t>
+        </m:r>
+        <m:r>
+          <m:rPr>
+            <m:sty m:val="p"/>
+          </m:rPr>
+          <m:t>=</m:t>
+        </m:r>
+        <m:r>
+          <m:t>2</m:t>
+        </m:r>
+        <m:r>
+          <m:rPr>
+            <m:sty m:val="p"/>
+          </m:rPr>
+          <m:t>⋅</m:t>
+        </m:r>
+        <m:r>
+          <m:t>3</m:t>
+        </m:r>
+        <m:r>
+          <m:rPr>
+            <m:sty m:val="p"/>
+          </m:rPr>
+          <m:t>+</m:t>
+        </m:r>
+        <m:r>
+          <m:t>1</m:t>
+        </m:r>
+      </m:oMath>
+      <w:r>
+        <w:t xml:space="preserve"> </w:t>
+      </w:r>
+      <w:r>
+        <w:t xml:space="preserve">gives</w:t>
+      </w:r>
+      <w:r>
+        <w:t xml:space="preserve"> </w:t>
+      </w:r>
+      <m:oMath>
+        <m:sSup>
+          <m:e>
+            <m:r>
+              <m:t>n</m:t>
+            </m:r>
+          </m:e>
+          <m:sup>
+            <m:r>
+              <m:t>2</m:t>
+            </m:r>
+          </m:sup>
+        </m:sSup>
+        <m:r>
+          <m:rPr>
+            <m:sty m:val="p"/>
+          </m:rPr>
+          <m:t>=</m:t>
+        </m:r>
+        <m:r>
+          <m:t>49</m:t>
+        </m:r>
+        <m:r>
+          <m:rPr>
+            <m:sty m:val="p"/>
+          </m:rPr>
+          <m:t>=</m:t>
+        </m:r>
+        <m:r>
+          <m:t>2</m:t>
+        </m:r>
+        <m:r>
+          <m:rPr>
+            <m:sty m:val="p"/>
+          </m:rPr>
+          <m:t>⋅</m:t>
+        </m:r>
+        <m:r>
+          <m:t>24</m:t>
+        </m:r>
+        <m:r>
+          <m:rPr>
+            <m:sty m:val="p"/>
+          </m:rPr>
+          <m:t>+</m:t>
+        </m:r>
+        <m:r>
+          <m:t>1</m:t>
+        </m:r>
+      </m:oMath>
+      <w:r>
+        <w:t xml:space="preserve">, and</w:t>
+      </w:r>
+      <w:r>
+        <w:t xml:space="preserve"> </w:t>
+      </w:r>
+      <m:oMath>
+        <m:r>
+          <m:t>2</m:t>
+        </m:r>
+        <m:r>
+          <m:rPr>
+            <m:sty m:val="p"/>
+          </m:rPr>
+          <m:t>⋅</m:t>
+        </m:r>
+        <m:sSup>
+          <m:e>
+            <m:r>
+              <m:t>3</m:t>
+            </m:r>
+          </m:e>
+          <m:sup>
+            <m:r>
+              <m:t>2</m:t>
+            </m:r>
+          </m:sup>
+        </m:sSup>
+        <m:r>
+          <m:rPr>
+            <m:sty m:val="p"/>
+          </m:rPr>
+          <m:t>+</m:t>
+        </m:r>
+        <m:r>
+          <m:t>2</m:t>
+        </m:r>
+        <m:r>
+          <m:rPr>
+            <m:sty m:val="p"/>
+          </m:rPr>
+          <m:t>⋅</m:t>
+        </m:r>
+        <m:r>
+          <m:t>3</m:t>
+        </m:r>
+        <m:r>
+          <m:rPr>
+            <m:sty m:val="p"/>
+          </m:rPr>
+          <m:t>=</m:t>
+        </m:r>
+        <m:r>
+          <m:t>24</m:t>
+        </m:r>
+      </m:oMath>
+      <w:r>
+        <w:t xml:space="preserve">.</w:t>
+      </w:r>
+    </w:p>
+    <w:p>
+      <w:pPr>
+        <w:pStyle w:val="BodyText"/>
+      </w:pPr>
+      <w:r>
+        <w:t xml:space="preserve">The notation page’s proof that</w:t>
+      </w:r>
+      <w:r>
+        <w:t xml:space="preserve"> </w:t>
+      </w:r>
+      <w:hyperlink r:id="rId24">
+        <w:r>
+          <w:rPr>
+            <w:rStyle w:val="Hyperlink"/>
+          </w:rPr>
+          <w:t xml:space="preserve">the sum of two even integers is even</w:t>
+        </w:r>
+      </w:hyperlink>
+      <w:r>
+        <w:t xml:space="preserve"> </w:t>
+      </w:r>
+      <w:r>
+        <w:t xml:space="preserve">is also a direct proof.</w:t>
+      </w:r>
+    </w:p>
+    <w:bookmarkEnd w:id="25"/>
+    <w:bookmarkEnd w:id="26"/>
+    <w:bookmarkStart w:id="27" w:name="sec-golden-rule"/>
+    <w:p>
+      <w:pPr>
+        <w:pStyle w:val="Heading2"/>
+      </w:pPr>
+      <w:r>
+        <w:t xml:space="preserve">4 Follow the golden rule</w:t>
+      </w:r>
+    </w:p>
+    <w:p>
+      <w:pPr>
+        <w:pStyle w:val="FirstParagraph"/>
+      </w:pPr>
+      <w:r>
+        <w:t xml:space="preserve">In general,</w:t>
+      </w:r>
+      <w:r>
+        <w:t xml:space="preserve"> </w:t>
+      </w:r>
+      <w:r>
+        <w:t xml:space="preserve">follow the golden rule:</w:t>
+      </w:r>
+      <w:r>
+        <w:t xml:space="preserve"> </w:t>
+      </w:r>
+      <w:r>
+        <w:t xml:space="preserve">treat your readers the way you want to be treated as a reader.</w:t>
+      </w:r>
+    </w:p>
+    <w:p>
+      <w:pPr>
+        <w:pStyle w:val="BodyText"/>
+      </w:pPr>
+      <w:r>
+        <w:t xml:space="preserve">When you read someone else’s proof,</w:t>
+      </w:r>
+      <w:r>
+        <w:t xml:space="preserve"> </w:t>
+      </w:r>
+      <w:r>
+        <w:t xml:space="preserve">you want to be able to follow every step without guessing,</w:t>
+      </w:r>
+      <w:r>
+        <w:t xml:space="preserve"> </w:t>
+      </w:r>
+      <w:r>
+        <w:t xml:space="preserve">to know which result is being used at each line,</w:t>
+      </w:r>
+      <w:r>
+        <w:t xml:space="preserve"> </w:t>
+      </w:r>
+      <w:r>
+        <w:t xml:space="preserve">and to never be left wondering where a quantity came from.</w:t>
+      </w:r>
+      <w:r>
+        <w:t xml:space="preserve"> </w:t>
+      </w:r>
+      <w:r>
+        <w:t xml:space="preserve">Write your own proofs to meet that same standard.</w:t>
+      </w:r>
+    </w:p>
+    <w:bookmarkEnd w:id="27"/>
+    <w:bookmarkStart w:id="35" w:name="sec-proof-by-induction"/>
+    <w:p>
+      <w:pPr>
+        <w:pStyle w:val="Heading2"/>
+      </w:pPr>
+      <w:r>
+        <w:t xml:space="preserve">5 Proof by induction</w:t>
+      </w:r>
+    </w:p>
+    <w:p>
+      <w:pPr>
+        <w:pStyle w:val="FirstParagraph"/>
+      </w:pPr>
+      <w:r>
         <w:t xml:space="preserve">Many proofs in these notes show that a statement holds</w:t>
       </w:r>
       <w:r>
@@ -1532,7 +2566,7 @@
       <w:r>
         <w:t xml:space="preserve"> </w:t>
       </w:r>
-      <w:hyperlink r:id="rId19">
+      <w:hyperlink r:id="rId28">
         <w:r>
           <w:rPr>
             <w:rStyle w:val="Hyperlink"/>
@@ -1598,7 +2632,7 @@
         <w:t xml:space="preserve">induction proves it for all of them with two arguments.</w:t>
       </w:r>
     </w:p>
-    <w:bookmarkStart w:id="20" w:name="def-proof-by-induction"/>
+    <w:bookmarkStart w:id="31" w:name="def-proof-by-induction"/>
     <w:p>
       <w:pPr>
         <w:pStyle w:val="BodyText"/>
@@ -1608,7 +2642,7 @@
           <w:b/>
           <w:bCs/>
         </w:rPr>
-        <w:t xml:space="preserve">Definition 1 (Proof by induction)</w:t>
+        <w:t xml:space="preserve">Definition 2 (Proof by induction)</w:t>
       </w:r>
       <w:r>
         <w:t xml:space="preserve"> </w:t>
@@ -1637,13 +2671,73 @@
         <w:t xml:space="preserve"> </w:t>
       </w:r>
       <w:r>
-        <w:t xml:space="preserve">be an integer,</w:t>
-      </w:r>
-      <w:r>
-        <w:t xml:space="preserve"> </w:t>
-      </w:r>
-      <w:r>
-        <w:t xml:space="preserve">and for each integer</w:t>
+        <w:t xml:space="preserve">be an</w:t>
+      </w:r>
+      <w:r>
+        <w:t xml:space="preserve"> </w:t>
+      </w:r>
+      <w:hyperlink r:id="rId29">
+        <w:r>
+          <w:rPr>
+            <w:rStyle w:val="Hyperlink"/>
+          </w:rPr>
+          <w:t xml:space="preserve">integer</w:t>
+        </w:r>
+      </w:hyperlink>
+      <w:r>
+        <w:t xml:space="preserve">,</w:t>
+      </w:r>
+      <w:r>
+        <w:t xml:space="preserve"> </w:t>
+      </w:r>
+      <w:r>
+        <w:t xml:space="preserve">and let</w:t>
+      </w:r>
+      <w:r>
+        <w:t xml:space="preserve"> </w:t>
+      </w:r>
+      <m:oMath>
+        <m:r>
+          <m:t>P</m:t>
+        </m:r>
+        <m:r>
+          <m:rPr>
+            <m:sty m:val="p"/>
+          </m:rPr>
+          <m:t>(</m:t>
+        </m:r>
+        <m:r>
+          <m:t>n</m:t>
+        </m:r>
+        <m:r>
+          <m:rPr>
+            <m:sty m:val="p"/>
+          </m:rPr>
+          <m:t>)</m:t>
+        </m:r>
+      </m:oMath>
+      <w:r>
+        <w:t xml:space="preserve"> </w:t>
+      </w:r>
+      <w:r>
+        <w:t xml:space="preserve">be a</w:t>
+      </w:r>
+      <w:r>
+        <w:t xml:space="preserve"> </w:t>
+      </w:r>
+      <w:hyperlink r:id="rId30">
+        <w:r>
+          <w:rPr>
+            <w:rStyle w:val="Hyperlink"/>
+          </w:rPr>
+          <w:t xml:space="preserve">predicate</w:t>
+        </w:r>
+      </w:hyperlink>
+      <w:r>
+        <w:t xml:space="preserve"> </w:t>
+      </w:r>
+      <w:r>
+        <w:t xml:space="preserve">about the integers</w:t>
       </w:r>
       <w:r>
         <w:t xml:space="preserve"> </w:t>
@@ -1672,49 +2766,6 @@
         </m:sSub>
       </m:oMath>
       <w:r>
-        <w:t xml:space="preserve"> </w:t>
-      </w:r>
-      <w:r>
-        <w:t xml:space="preserve">let</w:t>
-      </w:r>
-      <w:r>
-        <w:t xml:space="preserve"> </w:t>
-      </w:r>
-      <m:oMath>
-        <m:r>
-          <m:t>P</m:t>
-        </m:r>
-        <m:r>
-          <m:rPr>
-            <m:sty m:val="p"/>
-          </m:rPr>
-          <m:t>(</m:t>
-        </m:r>
-        <m:r>
-          <m:t>n</m:t>
-        </m:r>
-        <m:r>
-          <m:rPr>
-            <m:sty m:val="p"/>
-          </m:rPr>
-          <m:t>)</m:t>
-        </m:r>
-      </m:oMath>
-      <w:r>
-        <w:t xml:space="preserve"> </w:t>
-      </w:r>
-      <w:r>
-        <w:t xml:space="preserve">be a statement about</w:t>
-      </w:r>
-      <w:r>
-        <w:t xml:space="preserve"> </w:t>
-      </w:r>
-      <m:oMath>
-        <m:r>
-          <m:t>n</m:t>
-        </m:r>
-      </m:oMath>
-      <w:r>
         <w:t xml:space="preserve">.</w:t>
       </w:r>
       <w:r>
@@ -2064,8 +3115,8 @@
         <w:t xml:space="preserve">.</w:t>
       </w:r>
     </w:p>
-    <w:bookmarkEnd w:id="20"/>
-    <w:bookmarkStart w:id="21" w:name="rem-induction-why"/>
+    <w:bookmarkEnd w:id="31"/>
+    <w:bookmarkStart w:id="32" w:name="rem-induction-why"/>
     <w:p>
       <w:pPr>
         <w:pStyle w:val="BodyText"/>
@@ -2534,7 +3585,7 @@
         <w:t xml:space="preserve">.</w:t>
       </w:r>
     </w:p>
-    <w:bookmarkEnd w:id="21"/>
+    <w:bookmarkEnd w:id="32"/>
     <w:p>
       <w:pPr>
         <w:pStyle w:val="BodyText"/>
@@ -2545,7 +3596,7 @@
       <w:r>
         <w:t xml:space="preserve"> </w:t>
       </w:r>
-      <w:hyperlink r:id="rId22">
+      <w:hyperlink r:id="rId33">
         <w:r>
           <w:rPr>
             <w:rStyle w:val="Hyperlink"/>
@@ -2557,7 +3608,7 @@
         <w:t xml:space="preserve">.</w:t>
       </w:r>
     </w:p>
-    <w:bookmarkStart w:id="23" w:name="exm-induction-sum"/>
+    <w:bookmarkStart w:id="34" w:name="exm-induction-sum"/>
     <w:p>
       <w:pPr>
         <w:pStyle w:val="BodyText"/>
@@ -2567,7 +3618,7 @@
           <w:b/>
           <w:bCs/>
         </w:rPr>
-        <w:t xml:space="preserve">Example 1 (Sum of the first</w:t>
+        <w:t xml:space="preserve">Example 2 (Sum of the first</w:t>
       </w:r>
       <w:r>
         <w:rPr>
@@ -2890,7 +3941,7 @@
           <w:rPr>
             <w:rStyle w:val="Hyperlink"/>
           </w:rPr>
-          <w:t xml:space="preserve">Definition 1</w:t>
+          <w:t xml:space="preserve">Definition 2</w:t>
         </w:r>
       </w:hyperlink>
       <w:r>
@@ -4681,7 +5732,7 @@
           <w:rPr>
             <w:rStyle w:val="Hyperlink"/>
           </w:rPr>
-          <w:t xml:space="preserve">Definition 1</w:t>
+          <w:t xml:space="preserve">Definition 2</w:t>
         </w:r>
       </w:hyperlink>
       <w:r>
@@ -4718,15 +5769,548 @@
         <w:t xml:space="preserve">.</w:t>
       </w:r>
     </w:p>
-    <w:bookmarkEnd w:id="23"/>
-    <w:bookmarkEnd w:id="24"/>
-    <w:bookmarkStart w:id="26" w:name="sec-further-reading"/>
+    <w:bookmarkEnd w:id="34"/>
+    <w:bookmarkEnd w:id="35"/>
+    <w:bookmarkStart w:id="46" w:name="sec-formal-logic"/>
     <w:p>
       <w:pPr>
         <w:pStyle w:val="Heading2"/>
       </w:pPr>
       <w:r>
-        <w:t xml:space="preserve">5 Further reading</w:t>
+        <w:t xml:space="preserve">6 Formal logic</w:t>
+      </w:r>
+    </w:p>
+    <w:bookmarkStart w:id="38" w:name="def-propositional-logic"/>
+    <w:p>
+      <w:pPr>
+        <w:pStyle w:val="FirstParagraph"/>
+      </w:pPr>
+      <w:r>
+        <w:rPr>
+          <w:b/>
+          <w:bCs/>
+        </w:rPr>
+        <w:t xml:space="preserve">Definition 3 (Propositional logic)</w:t>
+      </w:r>
+      <w:r>
+        <w:t xml:space="preserve"> </w:t>
+      </w:r>
+      <w:r>
+        <w:rPr>
+          <w:b/>
+          <w:bCs/>
+        </w:rPr>
+        <w:t xml:space="preserve">Propositional logic</w:t>
+      </w:r>
+      <w:r>
+        <w:t xml:space="preserve"> </w:t>
+      </w:r>
+      <w:r>
+        <w:t xml:space="preserve">is the study of</w:t>
+      </w:r>
+      <w:r>
+        <w:t xml:space="preserve"> </w:t>
+      </w:r>
+      <w:hyperlink r:id="rId12">
+        <w:r>
+          <w:rPr>
+            <w:rStyle w:val="Hyperlink"/>
+          </w:rPr>
+          <w:t xml:space="preserve">logical entailment</w:t>
+        </w:r>
+      </w:hyperlink>
+      <w:r>
+        <w:t xml:space="preserve"> </w:t>
+      </w:r>
+      <w:r>
+        <w:t xml:space="preserve">among</w:t>
+      </w:r>
+      <w:r>
+        <w:t xml:space="preserve"> </w:t>
+      </w:r>
+      <w:hyperlink r:id="rId36">
+        <w:r>
+          <w:rPr>
+            <w:rStyle w:val="Hyperlink"/>
+          </w:rPr>
+          <w:t xml:space="preserve">propositions</w:t>
+        </w:r>
+      </w:hyperlink>
+      <w:r>
+        <w:t xml:space="preserve"> </w:t>
+      </w:r>
+      <w:r>
+        <w:t xml:space="preserve">built from basic propositions</w:t>
+      </w:r>
+      <w:r>
+        <w:t xml:space="preserve"> </w:t>
+      </w:r>
+      <m:oMath>
+        <m:r>
+          <m:t>P</m:t>
+        </m:r>
+        <m:r>
+          <m:rPr>
+            <m:sty m:val="p"/>
+          </m:rPr>
+          <m:t>,</m:t>
+        </m:r>
+        <m:r>
+          <m:t>Q</m:t>
+        </m:r>
+        <m:r>
+          <m:rPr>
+            <m:sty m:val="p"/>
+          </m:rPr>
+          <m:t>,</m:t>
+        </m:r>
+        <m:r>
+          <m:t>R</m:t>
+        </m:r>
+        <m:r>
+          <m:rPr>
+            <m:sty m:val="p"/>
+          </m:rPr>
+          <m:t>,</m:t>
+        </m:r>
+        <m:r>
+          <m:rPr>
+            <m:sty m:val="p"/>
+          </m:rPr>
+          <m:t>…</m:t>
+        </m:r>
+      </m:oMath>
+      <w:r>
+        <w:t xml:space="preserve"> </w:t>
+      </w:r>
+      <w:r>
+        <w:t xml:space="preserve">using only the</w:t>
+      </w:r>
+      <w:r>
+        <w:t xml:space="preserve"> </w:t>
+      </w:r>
+      <w:hyperlink r:id="rId37">
+        <w:r>
+          <w:rPr>
+            <w:rStyle w:val="Hyperlink"/>
+          </w:rPr>
+          <w:t xml:space="preserve">logical connectives</w:t>
+        </w:r>
+      </w:hyperlink>
+      <w:r>
+        <w:t xml:space="preserve">.</w:t>
+      </w:r>
+      <w:r>
+        <w:t xml:space="preserve"> </w:t>
+      </w:r>
+      <w:r>
+        <w:t xml:space="preserve">Whether such propositions entail one another</w:t>
+      </w:r>
+      <w:r>
+        <w:t xml:space="preserve"> </w:t>
+      </w:r>
+      <w:r>
+        <w:t xml:space="preserve">depends only on the truth values of the basic propositions,</w:t>
+      </w:r>
+      <w:r>
+        <w:t xml:space="preserve"> </w:t>
+      </w:r>
+      <w:r>
+        <w:t xml:space="preserve">not on what the basic propositions say.</w:t>
+      </w:r>
+    </w:p>
+    <w:bookmarkEnd w:id="38"/>
+    <w:bookmarkStart w:id="39" w:name="exm-propositional-logic"/>
+    <w:p>
+      <w:pPr>
+        <w:pStyle w:val="BodyText"/>
+      </w:pPr>
+      <w:r>
+        <w:rPr>
+          <w:b/>
+          <w:bCs/>
+        </w:rPr>
+        <w:t xml:space="preserve">Example 3 (</w:t>
+      </w:r>
+      <m:oMath>
+        <m:r>
+          <m:t>P</m:t>
+        </m:r>
+      </m:oMath>
+      <w:r>
+        <w:rPr>
+          <w:b/>
+          <w:bCs/>
+        </w:rPr>
+        <w:t xml:space="preserve"> </w:t>
+      </w:r>
+      <w:r>
+        <w:rPr>
+          <w:b/>
+          <w:bCs/>
+        </w:rPr>
+        <w:t xml:space="preserve">and</w:t>
+      </w:r>
+      <w:r>
+        <w:rPr>
+          <w:b/>
+          <w:bCs/>
+        </w:rPr>
+        <w:t xml:space="preserve"> </w:t>
+      </w:r>
+      <m:oMath>
+        <m:r>
+          <m:t>P</m:t>
+        </m:r>
+        <m:r>
+          <m:rPr>
+            <m:sty m:val="p"/>
+          </m:rPr>
+          <m:t>⇒</m:t>
+        </m:r>
+        <m:r>
+          <m:t>Q</m:t>
+        </m:r>
+      </m:oMath>
+      <w:r>
+        <w:rPr>
+          <w:b/>
+          <w:bCs/>
+        </w:rPr>
+        <w:t xml:space="preserve"> </w:t>
+      </w:r>
+      <w:r>
+        <w:rPr>
+          <w:b/>
+          <w:bCs/>
+        </w:rPr>
+        <w:t xml:space="preserve">entail</w:t>
+      </w:r>
+      <w:r>
+        <w:rPr>
+          <w:b/>
+          <w:bCs/>
+        </w:rPr>
+        <w:t xml:space="preserve"> </w:t>
+      </w:r>
+      <m:oMath>
+        <m:r>
+          <m:t>Q</m:t>
+        </m:r>
+      </m:oMath>
+      <w:r>
+        <w:rPr>
+          <w:b/>
+          <w:bCs/>
+        </w:rPr>
+        <w:t xml:space="preserve">)</w:t>
+      </w:r>
+      <w:r>
+        <w:t xml:space="preserve"> </w:t>
+      </w:r>
+      <w:r>
+        <w:t xml:space="preserve">Suppose</w:t>
+      </w:r>
+      <w:r>
+        <w:t xml:space="preserve"> </w:t>
+      </w:r>
+      <m:oMath>
+        <m:r>
+          <m:t>P</m:t>
+        </m:r>
+      </m:oMath>
+      <w:r>
+        <w:t xml:space="preserve"> </w:t>
+      </w:r>
+      <w:r>
+        <w:t xml:space="preserve">is true and</w:t>
+      </w:r>
+      <w:r>
+        <w:t xml:space="preserve"> </w:t>
+      </w:r>
+      <m:oMath>
+        <m:r>
+          <m:t>P</m:t>
+        </m:r>
+        <m:r>
+          <m:rPr>
+            <m:sty m:val="p"/>
+          </m:rPr>
+          <m:t>⇒</m:t>
+        </m:r>
+        <m:r>
+          <m:t>Q</m:t>
+        </m:r>
+      </m:oMath>
+      <w:r>
+        <w:t xml:space="preserve"> </w:t>
+      </w:r>
+      <w:r>
+        <w:t xml:space="preserve">is true.</w:t>
+      </w:r>
+      <w:r>
+        <w:t xml:space="preserve"> </w:t>
+      </w:r>
+      <w:r>
+        <w:t xml:space="preserve">If</w:t>
+      </w:r>
+      <w:r>
+        <w:t xml:space="preserve"> </w:t>
+      </w:r>
+      <m:oMath>
+        <m:r>
+          <m:t>Q</m:t>
+        </m:r>
+      </m:oMath>
+      <w:r>
+        <w:t xml:space="preserve"> </w:t>
+      </w:r>
+      <w:r>
+        <w:t xml:space="preserve">were false,</w:t>
+      </w:r>
+      <w:r>
+        <w:t xml:space="preserve"> </w:t>
+      </w:r>
+      <w:r>
+        <w:t xml:space="preserve">then</w:t>
+      </w:r>
+      <w:r>
+        <w:t xml:space="preserve"> </w:t>
+      </w:r>
+      <m:oMath>
+        <m:r>
+          <m:t>P</m:t>
+        </m:r>
+        <m:r>
+          <m:rPr>
+            <m:sty m:val="p"/>
+          </m:rPr>
+          <m:t>⇒</m:t>
+        </m:r>
+        <m:r>
+          <m:t>Q</m:t>
+        </m:r>
+      </m:oMath>
+      <w:r>
+        <w:t xml:space="preserve"> </w:t>
+      </w:r>
+      <w:r>
+        <w:t xml:space="preserve">would have a true</w:t>
+      </w:r>
+      <w:r>
+        <w:t xml:space="preserve"> </w:t>
+      </w:r>
+      <m:oMath>
+        <m:r>
+          <m:t>P</m:t>
+        </m:r>
+      </m:oMath>
+      <w:r>
+        <w:t xml:space="preserve"> </w:t>
+      </w:r>
+      <w:r>
+        <w:t xml:space="preserve">and a false</w:t>
+      </w:r>
+      <w:r>
+        <w:t xml:space="preserve"> </w:t>
+      </w:r>
+      <m:oMath>
+        <m:r>
+          <m:t>Q</m:t>
+        </m:r>
+      </m:oMath>
+      <w:r>
+        <w:t xml:space="preserve">,</w:t>
+      </w:r>
+      <w:r>
+        <w:t xml:space="preserve"> </w:t>
+      </w:r>
+      <w:r>
+        <w:t xml:space="preserve">so</w:t>
+      </w:r>
+      <w:r>
+        <w:t xml:space="preserve"> </w:t>
+      </w:r>
+      <m:oMath>
+        <m:r>
+          <m:t>P</m:t>
+        </m:r>
+        <m:r>
+          <m:rPr>
+            <m:sty m:val="p"/>
+          </m:rPr>
+          <m:t>⇒</m:t>
+        </m:r>
+        <m:r>
+          <m:t>Q</m:t>
+        </m:r>
+      </m:oMath>
+      <w:r>
+        <w:t xml:space="preserve"> </w:t>
+      </w:r>
+      <w:r>
+        <w:t xml:space="preserve">would be false,</w:t>
+      </w:r>
+      <w:r>
+        <w:t xml:space="preserve"> </w:t>
+      </w:r>
+      <w:r>
+        <w:t xml:space="preserve">which contradicts the assumption.</w:t>
+      </w:r>
+      <w:r>
+        <w:t xml:space="preserve"> </w:t>
+      </w:r>
+      <w:r>
+        <w:t xml:space="preserve">So</w:t>
+      </w:r>
+      <w:r>
+        <w:t xml:space="preserve"> </w:t>
+      </w:r>
+      <m:oMath>
+        <m:r>
+          <m:t>Q</m:t>
+        </m:r>
+      </m:oMath>
+      <w:r>
+        <w:t xml:space="preserve"> </w:t>
+      </w:r>
+      <w:r>
+        <w:t xml:space="preserve">is true.</w:t>
+      </w:r>
+      <w:r>
+        <w:t xml:space="preserve"> </w:t>
+      </w:r>
+      <w:r>
+        <w:t xml:space="preserve">This holds whatever</w:t>
+      </w:r>
+      <w:r>
+        <w:t xml:space="preserve"> </w:t>
+      </w:r>
+      <m:oMath>
+        <m:r>
+          <m:t>P</m:t>
+        </m:r>
+      </m:oMath>
+      <w:r>
+        <w:t xml:space="preserve"> </w:t>
+      </w:r>
+      <w:r>
+        <w:t xml:space="preserve">and</w:t>
+      </w:r>
+      <w:r>
+        <w:t xml:space="preserve"> </w:t>
+      </w:r>
+      <m:oMath>
+        <m:r>
+          <m:t>Q</m:t>
+        </m:r>
+      </m:oMath>
+      <w:r>
+        <w:t xml:space="preserve"> </w:t>
+      </w:r>
+      <w:r>
+        <w:t xml:space="preserve">say,</w:t>
+      </w:r>
+      <w:r>
+        <w:t xml:space="preserve"> </w:t>
+      </w:r>
+      <w:r>
+        <w:t xml:space="preserve">so</w:t>
+      </w:r>
+      <w:r>
+        <w:t xml:space="preserve"> </w:t>
+      </w:r>
+      <m:oMath>
+        <m:r>
+          <m:t>P</m:t>
+        </m:r>
+      </m:oMath>
+      <w:r>
+        <w:t xml:space="preserve"> </w:t>
+      </w:r>
+      <w:r>
+        <w:t xml:space="preserve">and</w:t>
+      </w:r>
+      <w:r>
+        <w:t xml:space="preserve"> </w:t>
+      </w:r>
+      <m:oMath>
+        <m:r>
+          <m:t>P</m:t>
+        </m:r>
+        <m:r>
+          <m:rPr>
+            <m:sty m:val="p"/>
+          </m:rPr>
+          <m:t>⇒</m:t>
+        </m:r>
+        <m:r>
+          <m:t>Q</m:t>
+        </m:r>
+      </m:oMath>
+      <w:r>
+        <w:t xml:space="preserve"> </w:t>
+      </w:r>
+      <w:r>
+        <w:t xml:space="preserve">logically entail</w:t>
+      </w:r>
+      <w:r>
+        <w:t xml:space="preserve"> </w:t>
+      </w:r>
+      <m:oMath>
+        <m:r>
+          <m:t>Q</m:t>
+        </m:r>
+      </m:oMath>
+      <w:r>
+        <w:t xml:space="preserve">.</w:t>
+      </w:r>
+    </w:p>
+    <w:bookmarkEnd w:id="39"/>
+    <w:bookmarkStart w:id="42" w:name="def-first-order-logic"/>
+    <w:p>
+      <w:pPr>
+        <w:pStyle w:val="BodyText"/>
+      </w:pPr>
+      <w:r>
+        <w:rPr>
+          <w:b/>
+          <w:bCs/>
+        </w:rPr>
+        <w:t xml:space="preserve">Definition 4 (First-order logic)</w:t>
+      </w:r>
+      <w:r>
+        <w:t xml:space="preserve"> </w:t>
+      </w:r>
+      <w:r>
+        <w:rPr>
+          <w:b/>
+          <w:bCs/>
+        </w:rPr>
+        <w:t xml:space="preserve">First-order logic</w:t>
+      </w:r>
+      <w:r>
+        <w:t xml:space="preserve"> </w:t>
+      </w:r>
+      <w:r>
+        <w:t xml:space="preserve">extends propositional logic (</w:t>
+      </w:r>
+      <w:hyperlink w:anchor="def-propositional-logic">
+        <w:r>
+          <w:rPr>
+            <w:rStyle w:val="Hyperlink"/>
+          </w:rPr>
+          <w:t xml:space="preserve">Definition 3</w:t>
+        </w:r>
+      </w:hyperlink>
+      <w:r>
+        <w:t xml:space="preserve">)</w:t>
+      </w:r>
+      <w:r>
+        <w:t xml:space="preserve"> </w:t>
+      </w:r>
+      <w:r>
+        <w:t xml:space="preserve">by also allowing:</w:t>
       </w:r>
     </w:p>
     <w:p>
@@ -4738,6 +6322,967 @@
         </w:numPr>
       </w:pPr>
       <w:r>
+        <w:t xml:space="preserve">variables</w:t>
+      </w:r>
+      <w:r>
+        <w:t xml:space="preserve"> </w:t>
+      </w:r>
+      <m:oMath>
+        <m:r>
+          <m:t>x</m:t>
+        </m:r>
+        <m:r>
+          <m:rPr>
+            <m:sty m:val="p"/>
+          </m:rPr>
+          <m:t>,</m:t>
+        </m:r>
+        <m:r>
+          <m:t>y</m:t>
+        </m:r>
+        <m:r>
+          <m:rPr>
+            <m:sty m:val="p"/>
+          </m:rPr>
+          <m:t>,</m:t>
+        </m:r>
+        <m:r>
+          <m:rPr>
+            <m:sty m:val="p"/>
+          </m:rPr>
+          <m:t>…</m:t>
+        </m:r>
+      </m:oMath>
+      <w:r>
+        <w:t xml:space="preserve"> </w:t>
+      </w:r>
+      <w:r>
+        <w:t xml:space="preserve">that stand for elements of a set;</w:t>
+      </w:r>
+    </w:p>
+    <w:p>
+      <w:pPr>
+        <w:pStyle w:val="Compact"/>
+        <w:numPr>
+          <w:ilvl w:val="0"/>
+          <w:numId w:val="1003"/>
+        </w:numPr>
+      </w:pPr>
+      <w:hyperlink r:id="rId30">
+        <w:r>
+          <w:rPr>
+            <w:rStyle w:val="Hyperlink"/>
+          </w:rPr>
+          <w:t xml:space="preserve">predicates</w:t>
+        </w:r>
+      </w:hyperlink>
+      <w:r>
+        <w:t xml:space="preserve"> </w:t>
+      </w:r>
+      <w:r>
+        <w:t xml:space="preserve">of one or more of those variables,</w:t>
+      </w:r>
+      <w:r>
+        <w:t xml:space="preserve"> </w:t>
+      </w:r>
+      <w:r>
+        <w:t xml:space="preserve">such as</w:t>
+      </w:r>
+      <w:r>
+        <w:t xml:space="preserve"> </w:t>
+      </w:r>
+      <m:oMath>
+        <m:r>
+          <m:t>P</m:t>
+        </m:r>
+        <m:r>
+          <m:rPr>
+            <m:sty m:val="p"/>
+          </m:rPr>
+          <m:t>(</m:t>
+        </m:r>
+        <m:r>
+          <m:t>x</m:t>
+        </m:r>
+        <m:r>
+          <m:rPr>
+            <m:sty m:val="p"/>
+          </m:rPr>
+          <m:t>)</m:t>
+        </m:r>
+      </m:oMath>
+      <w:r>
+        <w:t xml:space="preserve"> </w:t>
+      </w:r>
+      <w:r>
+        <w:t xml:space="preserve">or</w:t>
+      </w:r>
+      <w:r>
+        <w:t xml:space="preserve"> </w:t>
+      </w:r>
+      <m:oMath>
+        <m:r>
+          <m:t>x</m:t>
+        </m:r>
+        <m:r>
+          <m:rPr>
+            <m:sty m:val="p"/>
+          </m:rPr>
+          <m:t>&lt;</m:t>
+        </m:r>
+        <m:r>
+          <m:t>y</m:t>
+        </m:r>
+      </m:oMath>
+      <w:r>
+        <w:t xml:space="preserve">;</w:t>
+      </w:r>
+    </w:p>
+    <w:p>
+      <w:pPr>
+        <w:pStyle w:val="Compact"/>
+        <w:numPr>
+          <w:ilvl w:val="0"/>
+          <w:numId w:val="1003"/>
+        </w:numPr>
+      </w:pPr>
+      <w:hyperlink r:id="rId40">
+        <w:r>
+          <w:rPr>
+            <w:rStyle w:val="Hyperlink"/>
+          </w:rPr>
+          <w:t xml:space="preserve">functions</w:t>
+        </w:r>
+      </w:hyperlink>
+      <w:r>
+        <w:t xml:space="preserve"> </w:t>
+      </w:r>
+      <w:r>
+        <w:t xml:space="preserve">of them, such as</w:t>
+      </w:r>
+      <w:r>
+        <w:t xml:space="preserve"> </w:t>
+      </w:r>
+      <m:oMath>
+        <m:r>
+          <m:t>x</m:t>
+        </m:r>
+        <m:r>
+          <m:rPr>
+            <m:sty m:val="p"/>
+          </m:rPr>
+          <m:t>+</m:t>
+        </m:r>
+        <m:r>
+          <m:t>y</m:t>
+        </m:r>
+      </m:oMath>
+      <w:r>
+        <w:t xml:space="preserve">;</w:t>
+      </w:r>
+    </w:p>
+    <w:p>
+      <w:pPr>
+        <w:pStyle w:val="Compact"/>
+        <w:numPr>
+          <w:ilvl w:val="0"/>
+          <w:numId w:val="1003"/>
+        </w:numPr>
+      </w:pPr>
+      <w:r>
+        <w:t xml:space="preserve">equality between them;</w:t>
+      </w:r>
+    </w:p>
+    <w:p>
+      <w:pPr>
+        <w:pStyle w:val="Compact"/>
+        <w:numPr>
+          <w:ilvl w:val="0"/>
+          <w:numId w:val="1003"/>
+        </w:numPr>
+      </w:pPr>
+      <w:hyperlink r:id="rId41">
+        <w:r>
+          <w:rPr>
+            <w:rStyle w:val="Hyperlink"/>
+          </w:rPr>
+          <w:t xml:space="preserve">quantifiers</w:t>
+        </w:r>
+      </w:hyperlink>
+      <w:r>
+        <w:t xml:space="preserve"> </w:t>
+      </w:r>
+      <m:oMath>
+        <m:r>
+          <m:rPr>
+            <m:sty m:val="p"/>
+          </m:rPr>
+          <m:t>∀</m:t>
+        </m:r>
+      </m:oMath>
+      <w:r>
+        <w:t xml:space="preserve"> </w:t>
+      </w:r>
+      <w:r>
+        <w:t xml:space="preserve">and</w:t>
+      </w:r>
+      <w:r>
+        <w:t xml:space="preserve"> </w:t>
+      </w:r>
+      <m:oMath>
+        <m:r>
+          <m:rPr>
+            <m:sty m:val="p"/>
+          </m:rPr>
+          <m:t>∃</m:t>
+        </m:r>
+      </m:oMath>
+      <w:r>
+        <w:t xml:space="preserve"> </w:t>
+      </w:r>
+      <w:r>
+        <w:t xml:space="preserve">over them.</w:t>
+      </w:r>
+    </w:p>
+    <w:bookmarkEnd w:id="42"/>
+    <w:bookmarkStart w:id="43" w:name="exm-first-order-logic"/>
+    <w:p>
+      <w:pPr>
+        <w:pStyle w:val="FirstParagraph"/>
+      </w:pPr>
+      <w:r>
+        <w:rPr>
+          <w:b/>
+          <w:bCs/>
+        </w:rPr>
+        <w:t xml:space="preserve">Example 4 (From</w:t>
+      </w:r>
+      <w:r>
+        <w:rPr>
+          <w:b/>
+          <w:bCs/>
+        </w:rPr>
+        <w:t xml:space="preserve"> </w:t>
+      </w:r>
+      <w:r>
+        <w:rPr>
+          <w:b/>
+          <w:bCs/>
+        </w:rPr>
+        <w:t xml:space="preserve">“for all”</w:t>
+      </w:r>
+      <w:r>
+        <w:rPr>
+          <w:b/>
+          <w:bCs/>
+        </w:rPr>
+        <w:t xml:space="preserve"> </w:t>
+      </w:r>
+      <w:r>
+        <w:rPr>
+          <w:b/>
+          <w:bCs/>
+        </w:rPr>
+        <w:t xml:space="preserve">to one element)</w:t>
+      </w:r>
+      <w:r>
+        <w:t xml:space="preserve"> </w:t>
+      </w:r>
+      <w:r>
+        <w:t xml:space="preserve">Let</w:t>
+      </w:r>
+      <w:r>
+        <w:t xml:space="preserve"> </w:t>
+      </w:r>
+      <m:oMath>
+        <m:r>
+          <m:t>P</m:t>
+        </m:r>
+        <m:r>
+          <m:rPr>
+            <m:sty m:val="p"/>
+          </m:rPr>
+          <m:t>(</m:t>
+        </m:r>
+        <m:r>
+          <m:t>x</m:t>
+        </m:r>
+        <m:r>
+          <m:rPr>
+            <m:sty m:val="p"/>
+          </m:rPr>
+          <m:t>)</m:t>
+        </m:r>
+      </m:oMath>
+      <w:r>
+        <w:t xml:space="preserve"> </w:t>
+      </w:r>
+      <w:r>
+        <w:t xml:space="preserve">be a predicate about the elements of a set</w:t>
+      </w:r>
+      <w:r>
+        <w:t xml:space="preserve"> </w:t>
+      </w:r>
+      <m:oMath>
+        <m:r>
+          <m:t>S</m:t>
+        </m:r>
+      </m:oMath>
+      <w:r>
+        <w:t xml:space="preserve">,</w:t>
+      </w:r>
+      <w:r>
+        <w:t xml:space="preserve"> </w:t>
+      </w:r>
+      <w:r>
+        <w:t xml:space="preserve">and let</w:t>
+      </w:r>
+      <w:r>
+        <w:t xml:space="preserve"> </w:t>
+      </w:r>
+      <m:oMath>
+        <m:r>
+          <m:t>a</m:t>
+        </m:r>
+        <m:r>
+          <m:rPr>
+            <m:sty m:val="p"/>
+          </m:rPr>
+          <m:t>∈</m:t>
+        </m:r>
+        <m:r>
+          <m:t>S</m:t>
+        </m:r>
+      </m:oMath>
+      <w:r>
+        <w:t xml:space="preserve">.</w:t>
+      </w:r>
+      <w:r>
+        <w:t xml:space="preserve"> </w:t>
+      </w:r>
+      <w:r>
+        <w:t xml:space="preserve">The propositions</w:t>
+      </w:r>
+      <w:r>
+        <w:t xml:space="preserve"> </w:t>
+      </w:r>
+      <m:oMath>
+        <m:r>
+          <m:rPr>
+            <m:sty m:val="p"/>
+          </m:rPr>
+          <m:t>∀</m:t>
+        </m:r>
+        <m:r>
+          <m:t>x</m:t>
+        </m:r>
+        <m:r>
+          <m:rPr>
+            <m:sty m:val="p"/>
+          </m:rPr>
+          <m:t>∈</m:t>
+        </m:r>
+        <m:r>
+          <m:t>S</m:t>
+        </m:r>
+        <m:r>
+          <m:rPr>
+            <m:sty m:val="p"/>
+          </m:rPr>
+          <m:t>,</m:t>
+        </m:r>
+        <m:r>
+          <m:t>P</m:t>
+        </m:r>
+        <m:r>
+          <m:rPr>
+            <m:sty m:val="p"/>
+          </m:rPr>
+          <m:t>(</m:t>
+        </m:r>
+        <m:r>
+          <m:t>x</m:t>
+        </m:r>
+        <m:r>
+          <m:rPr>
+            <m:sty m:val="p"/>
+          </m:rPr>
+          <m:t>)</m:t>
+        </m:r>
+      </m:oMath>
+      <w:r>
+        <w:t xml:space="preserve"> </w:t>
+      </w:r>
+      <w:r>
+        <w:t xml:space="preserve">and</w:t>
+      </w:r>
+      <w:r>
+        <w:t xml:space="preserve"> </w:t>
+      </w:r>
+      <m:oMath>
+        <m:r>
+          <m:t>a</m:t>
+        </m:r>
+        <m:r>
+          <m:rPr>
+            <m:sty m:val="p"/>
+          </m:rPr>
+          <m:t>∈</m:t>
+        </m:r>
+        <m:r>
+          <m:t>S</m:t>
+        </m:r>
+      </m:oMath>
+      <w:r>
+        <w:t xml:space="preserve"> </w:t>
+      </w:r>
+      <w:r>
+        <w:t xml:space="preserve">logically entail</w:t>
+      </w:r>
+      <w:r>
+        <w:t xml:space="preserve"> </w:t>
+      </w:r>
+      <m:oMath>
+        <m:r>
+          <m:t>P</m:t>
+        </m:r>
+        <m:r>
+          <m:rPr>
+            <m:sty m:val="p"/>
+          </m:rPr>
+          <m:t>(</m:t>
+        </m:r>
+        <m:r>
+          <m:t>a</m:t>
+        </m:r>
+        <m:r>
+          <m:rPr>
+            <m:sty m:val="p"/>
+          </m:rPr>
+          <m:t>)</m:t>
+        </m:r>
+      </m:oMath>
+      <w:r>
+        <w:t xml:space="preserve">:</w:t>
+      </w:r>
+      <w:r>
+        <w:t xml:space="preserve"> </w:t>
+      </w:r>
+      <w:r>
+        <w:t xml:space="preserve">if</w:t>
+      </w:r>
+      <w:r>
+        <w:t xml:space="preserve"> </w:t>
+      </w:r>
+      <m:oMath>
+        <m:r>
+          <m:t>P</m:t>
+        </m:r>
+        <m:r>
+          <m:rPr>
+            <m:sty m:val="p"/>
+          </m:rPr>
+          <m:t>(</m:t>
+        </m:r>
+        <m:r>
+          <m:t>x</m:t>
+        </m:r>
+        <m:r>
+          <m:rPr>
+            <m:sty m:val="p"/>
+          </m:rPr>
+          <m:t>)</m:t>
+        </m:r>
+      </m:oMath>
+      <w:r>
+        <w:t xml:space="preserve"> </w:t>
+      </w:r>
+      <w:r>
+        <w:t xml:space="preserve">is true for every element</w:t>
+      </w:r>
+      <w:r>
+        <w:t xml:space="preserve"> </w:t>
+      </w:r>
+      <m:oMath>
+        <m:r>
+          <m:t>x</m:t>
+        </m:r>
+      </m:oMath>
+      <w:r>
+        <w:t xml:space="preserve"> </w:t>
+      </w:r>
+      <w:r>
+        <w:t xml:space="preserve">of</w:t>
+      </w:r>
+      <w:r>
+        <w:t xml:space="preserve"> </w:t>
+      </w:r>
+      <m:oMath>
+        <m:r>
+          <m:t>S</m:t>
+        </m:r>
+      </m:oMath>
+      <w:r>
+        <w:t xml:space="preserve">,</w:t>
+      </w:r>
+      <w:r>
+        <w:t xml:space="preserve"> </w:t>
+      </w:r>
+      <w:r>
+        <w:t xml:space="preserve">then it is true for the element</w:t>
+      </w:r>
+      <w:r>
+        <w:t xml:space="preserve"> </w:t>
+      </w:r>
+      <m:oMath>
+        <m:r>
+          <m:t>a</m:t>
+        </m:r>
+      </m:oMath>
+      <w:r>
+        <w:t xml:space="preserve">.</w:t>
+      </w:r>
+      <w:r>
+        <w:t xml:space="preserve"> </w:t>
+      </w:r>
+      <w:r>
+        <w:t xml:space="preserve">For example,</w:t>
+      </w:r>
+      <w:r>
+        <w:t xml:space="preserve"> </w:t>
+      </w:r>
+      <m:oMath>
+        <m:r>
+          <m:rPr>
+            <m:sty m:val="p"/>
+          </m:rPr>
+          <m:t>∀</m:t>
+        </m:r>
+        <m:r>
+          <m:t>x</m:t>
+        </m:r>
+        <m:r>
+          <m:rPr>
+            <m:sty m:val="p"/>
+          </m:rPr>
+          <m:t>∈</m:t>
+        </m:r>
+        <m:r>
+          <m:rPr>
+            <m:scr m:val="double-struck"/>
+            <m:sty m:val="p"/>
+          </m:rPr>
+          <m:t>Z</m:t>
+        </m:r>
+        <m:r>
+          <m:rPr>
+            <m:sty m:val="p"/>
+          </m:rPr>
+          <m:t>,</m:t>
+        </m:r>
+        <m:sSup>
+          <m:e>
+            <m:r>
+              <m:t>x</m:t>
+            </m:r>
+          </m:e>
+          <m:sup>
+            <m:r>
+              <m:t>2</m:t>
+            </m:r>
+          </m:sup>
+        </m:sSup>
+        <m:r>
+          <m:rPr>
+            <m:sty m:val="p"/>
+          </m:rPr>
+          <m:t>≥</m:t>
+        </m:r>
+        <m:r>
+          <m:t>0</m:t>
+        </m:r>
+      </m:oMath>
+      <w:r>
+        <w:t xml:space="preserve"> </w:t>
+      </w:r>
+      <w:r>
+        <w:t xml:space="preserve">entails</w:t>
+      </w:r>
+      <w:r>
+        <w:t xml:space="preserve"> </w:t>
+      </w:r>
+      <m:oMath>
+        <m:sSup>
+          <m:e>
+            <m:r>
+              <m:t>3</m:t>
+            </m:r>
+          </m:e>
+          <m:sup>
+            <m:r>
+              <m:t>2</m:t>
+            </m:r>
+          </m:sup>
+        </m:sSup>
+        <m:r>
+          <m:rPr>
+            <m:sty m:val="p"/>
+          </m:rPr>
+          <m:t>≥</m:t>
+        </m:r>
+        <m:r>
+          <m:t>0</m:t>
+        </m:r>
+      </m:oMath>
+      <w:r>
+        <w:t xml:space="preserve">.</w:t>
+      </w:r>
+      <w:r>
+        <w:t xml:space="preserve"> </w:t>
+      </w:r>
+      <w:r>
+        <w:t xml:space="preserve">Propositional logic alone cannot express this entailment,</w:t>
+      </w:r>
+      <w:r>
+        <w:t xml:space="preserve"> </w:t>
+      </w:r>
+      <w:r>
+        <w:t xml:space="preserve">because it has no way to refer to the elements of</w:t>
+      </w:r>
+      <w:r>
+        <w:t xml:space="preserve"> </w:t>
+      </w:r>
+      <m:oMath>
+        <m:r>
+          <m:t>S</m:t>
+        </m:r>
+      </m:oMath>
+      <w:r>
+        <w:t xml:space="preserve">.</w:t>
+      </w:r>
+    </w:p>
+    <w:bookmarkEnd w:id="43"/>
+    <w:bookmarkStart w:id="44" w:name="def-formal-proof"/>
+    <w:p>
+      <w:pPr>
+        <w:pStyle w:val="BodyText"/>
+      </w:pPr>
+      <w:r>
+        <w:rPr>
+          <w:b/>
+          <w:bCs/>
+        </w:rPr>
+        <w:t xml:space="preserve">Definition 5 (Formal proof)</w:t>
+      </w:r>
+      <w:r>
+        <w:t xml:space="preserve"> </w:t>
+      </w:r>
+      <w:r>
+        <w:t xml:space="preserve">A</w:t>
+      </w:r>
+      <w:r>
+        <w:t xml:space="preserve"> </w:t>
+      </w:r>
+      <w:r>
+        <w:rPr>
+          <w:b/>
+          <w:bCs/>
+        </w:rPr>
+        <w:t xml:space="preserve">formal proof</w:t>
+      </w:r>
+      <w:r>
+        <w:t xml:space="preserve"> </w:t>
+      </w:r>
+      <w:r>
+        <w:t xml:space="preserve">is a</w:t>
+      </w:r>
+      <w:r>
+        <w:t xml:space="preserve"> </w:t>
+      </w:r>
+      <w:hyperlink r:id="rId9">
+        <w:r>
+          <w:rPr>
+            <w:rStyle w:val="Hyperlink"/>
+          </w:rPr>
+          <w:t xml:space="preserve">proof</w:t>
+        </w:r>
+      </w:hyperlink>
+      <w:r>
+        <w:t xml:space="preserve"> </w:t>
+      </w:r>
+      <w:r>
+        <w:t xml:space="preserve">written in propositional logic (</w:t>
+      </w:r>
+      <w:hyperlink w:anchor="def-propositional-logic">
+        <w:r>
+          <w:rPr>
+            <w:rStyle w:val="Hyperlink"/>
+          </w:rPr>
+          <w:t xml:space="preserve">Definition 3</w:t>
+        </w:r>
+      </w:hyperlink>
+      <w:r>
+        <w:t xml:space="preserve">)</w:t>
+      </w:r>
+      <w:r>
+        <w:t xml:space="preserve"> </w:t>
+      </w:r>
+      <w:r>
+        <w:t xml:space="preserve">or first-order logic (</w:t>
+      </w:r>
+      <w:hyperlink w:anchor="def-first-order-logic">
+        <w:r>
+          <w:rPr>
+            <w:rStyle w:val="Hyperlink"/>
+          </w:rPr>
+          <w:t xml:space="preserve">Definition 4</w:t>
+        </w:r>
+      </w:hyperlink>
+      <w:r>
+        <w:t xml:space="preserve">)</w:t>
+      </w:r>
+      <w:r>
+        <w:t xml:space="preserve"> </w:t>
+      </w:r>
+      <w:r>
+        <w:t xml:space="preserve">in which each step is an assumption</w:t>
+      </w:r>
+      <w:r>
+        <w:t xml:space="preserve"> </w:t>
+      </w:r>
+      <w:r>
+        <w:t xml:space="preserve">or follows from earlier steps by one rule</w:t>
+      </w:r>
+      <w:r>
+        <w:t xml:space="preserve"> </w:t>
+      </w:r>
+      <w:r>
+        <w:t xml:space="preserve">taken from a fixed list of allowed rules,</w:t>
+      </w:r>
+      <w:r>
+        <w:t xml:space="preserve"> </w:t>
+      </w:r>
+      <w:r>
+        <w:t xml:space="preserve">so that checking the proof needs no understanding of what its propositions mean.</w:t>
+      </w:r>
+    </w:p>
+    <w:bookmarkEnd w:id="44"/>
+    <w:bookmarkStart w:id="45" w:name="exm-formal-proof"/>
+    <w:p>
+      <w:pPr>
+        <w:pStyle w:val="BodyText"/>
+      </w:pPr>
+      <w:r>
+        <w:rPr>
+          <w:b/>
+          <w:bCs/>
+        </w:rPr>
+        <w:t xml:space="preserve">Example 5 (A three-step formal proof)</w:t>
+      </w:r>
+      <w:r>
+        <w:t xml:space="preserve"> </w:t>
+      </w:r>
+      <w:r>
+        <w:t xml:space="preserve">Suppose the allowed rules include</w:t>
+      </w:r>
+      <w:r>
+        <w:t xml:space="preserve"> </w:t>
+      </w:r>
+      <w:r>
+        <w:t xml:space="preserve">“from</w:t>
+      </w:r>
+      <w:r>
+        <w:t xml:space="preserve"> </w:t>
+      </w:r>
+      <m:oMath>
+        <m:r>
+          <m:t>P</m:t>
+        </m:r>
+      </m:oMath>
+      <w:r>
+        <w:t xml:space="preserve"> </w:t>
+      </w:r>
+      <w:r>
+        <w:t xml:space="preserve">and</w:t>
+      </w:r>
+      <w:r>
+        <w:t xml:space="preserve"> </w:t>
+      </w:r>
+      <m:oMath>
+        <m:r>
+          <m:t>P</m:t>
+        </m:r>
+        <m:r>
+          <m:rPr>
+            <m:sty m:val="p"/>
+          </m:rPr>
+          <m:t>⇒</m:t>
+        </m:r>
+        <m:r>
+          <m:t>Q</m:t>
+        </m:r>
+      </m:oMath>
+      <w:r>
+        <w:t xml:space="preserve">, conclude</w:t>
+      </w:r>
+      <w:r>
+        <w:t xml:space="preserve"> </w:t>
+      </w:r>
+      <m:oMath>
+        <m:r>
+          <m:t>Q</m:t>
+        </m:r>
+      </m:oMath>
+      <w:r>
+        <w:t xml:space="preserve">”</w:t>
+      </w:r>
+      <w:r>
+        <w:t xml:space="preserve">.</w:t>
+      </w:r>
+      <w:r>
+        <w:t xml:space="preserve"> </w:t>
+      </w:r>
+      <w:r>
+        <w:t xml:space="preserve">Then this is a formal proof of</w:t>
+      </w:r>
+      <w:r>
+        <w:t xml:space="preserve"> </w:t>
+      </w:r>
+      <m:oMath>
+        <m:r>
+          <m:t>Q</m:t>
+        </m:r>
+      </m:oMath>
+      <w:r>
+        <w:t xml:space="preserve"> </w:t>
+      </w:r>
+      <w:r>
+        <w:t xml:space="preserve">from the assumptions</w:t>
+      </w:r>
+      <w:r>
+        <w:t xml:space="preserve"> </w:t>
+      </w:r>
+      <m:oMath>
+        <m:r>
+          <m:t>P</m:t>
+        </m:r>
+      </m:oMath>
+      <w:r>
+        <w:t xml:space="preserve"> </w:t>
+      </w:r>
+      <w:r>
+        <w:t xml:space="preserve">and</w:t>
+      </w:r>
+      <w:r>
+        <w:t xml:space="preserve"> </w:t>
+      </w:r>
+      <m:oMath>
+        <m:r>
+          <m:t>P</m:t>
+        </m:r>
+        <m:r>
+          <m:rPr>
+            <m:sty m:val="p"/>
+          </m:rPr>
+          <m:t>⇒</m:t>
+        </m:r>
+        <m:r>
+          <m:t>Q</m:t>
+        </m:r>
+      </m:oMath>
+      <w:r>
+        <w:t xml:space="preserve">:</w:t>
+      </w:r>
+    </w:p>
+    <w:p>
+      <w:pPr>
+        <w:pStyle w:val="Compact"/>
+        <w:numPr>
+          <w:ilvl w:val="0"/>
+          <w:numId w:val="1004"/>
+        </w:numPr>
+      </w:pPr>
+      <m:oMath>
+        <m:r>
+          <m:t>P</m:t>
+        </m:r>
+      </m:oMath>
+      <w:r>
+        <w:t xml:space="preserve"> </w:t>
+      </w:r>
+      <w:r>
+        <w:t xml:space="preserve">(assumption)</w:t>
+      </w:r>
+    </w:p>
+    <w:p>
+      <w:pPr>
+        <w:pStyle w:val="Compact"/>
+        <w:numPr>
+          <w:ilvl w:val="0"/>
+          <w:numId w:val="1004"/>
+        </w:numPr>
+      </w:pPr>
+      <m:oMath>
+        <m:r>
+          <m:t>P</m:t>
+        </m:r>
+        <m:r>
+          <m:rPr>
+            <m:sty m:val="p"/>
+          </m:rPr>
+          <m:t>⇒</m:t>
+        </m:r>
+        <m:r>
+          <m:t>Q</m:t>
+        </m:r>
+      </m:oMath>
+      <w:r>
+        <w:t xml:space="preserve"> </w:t>
+      </w:r>
+      <w:r>
+        <w:t xml:space="preserve">(assumption)</w:t>
+      </w:r>
+    </w:p>
+    <w:p>
+      <w:pPr>
+        <w:pStyle w:val="Compact"/>
+        <w:numPr>
+          <w:ilvl w:val="0"/>
+          <w:numId w:val="1004"/>
+        </w:numPr>
+      </w:pPr>
+      <m:oMath>
+        <m:r>
+          <m:t>Q</m:t>
+        </m:r>
+      </m:oMath>
+      <w:r>
+        <w:t xml:space="preserve"> </w:t>
+      </w:r>
+      <w:r>
+        <w:t xml:space="preserve">(from steps 1 and 2, by the rule above)</w:t>
+      </w:r>
+    </w:p>
+    <w:bookmarkEnd w:id="45"/>
+    <w:bookmarkEnd w:id="46"/>
+    <w:bookmarkStart w:id="47" w:name="sec-further-reading"/>
+    <w:p>
+      <w:pPr>
+        <w:pStyle w:val="Heading2"/>
+      </w:pPr>
+      <w:r>
+        <w:t xml:space="preserve">7 Further reading</w:t>
+      </w:r>
+    </w:p>
+    <w:p>
+      <w:pPr>
+        <w:pStyle w:val="Compact"/>
+        <w:numPr>
+          <w:ilvl w:val="0"/>
+          <w:numId w:val="1005"/>
+        </w:numPr>
+      </w:pPr>
+      <w:r>
         <w:t xml:space="preserve">Velleman (2019)</w:t>
       </w:r>
       <w:r>
@@ -4750,12 +7295,26 @@
         <w:t xml:space="preserve"> </w:t>
       </w:r>
       <w:r>
-        <w:t xml:space="preserve">such as direct proof,</w:t>
-      </w:r>
-      <w:r>
-        <w:t xml:space="preserve"> </w:t>
-      </w:r>
-      <w:hyperlink r:id="rId25">
+        <w:t xml:space="preserve">such as</w:t>
+      </w:r>
+      <w:r>
+        <w:t xml:space="preserve"> </w:t>
+      </w:r>
+      <w:hyperlink w:anchor="def-direct-proof">
+        <w:r>
+          <w:rPr>
+            <w:rStyle w:val="Hyperlink"/>
+          </w:rPr>
+          <w:t xml:space="preserve">direct proof</w:t>
+        </w:r>
+      </w:hyperlink>
+      <w:r>
+        <w:t xml:space="preserve">,</w:t>
+      </w:r>
+      <w:r>
+        <w:t xml:space="preserve"> </w:t>
+      </w:r>
+      <w:hyperlink r:id="rId21">
         <w:r>
           <w:rPr>
             <w:rStyle w:val="Hyperlink"/>
@@ -4772,7 +7331,7 @@
         <w:pStyle w:val="Compact"/>
         <w:numPr>
           <w:ilvl w:val="0"/>
-          <w:numId w:val="1003"/>
+          <w:numId w:val="1005"/>
         </w:numPr>
       </w:pPr>
       <w:r>
@@ -4782,11 +7341,59 @@
         <w:t xml:space="preserve"> </w:t>
       </w:r>
       <w:r>
-        <w:t xml:space="preserve">treats proofs as formal derivations in propositional and first-order logic.</w:t>
+        <w:t xml:space="preserve">treats proofs as</w:t>
+      </w:r>
+      <w:r>
+        <w:t xml:space="preserve"> </w:t>
+      </w:r>
+      <w:hyperlink w:anchor="def-formal-proof">
+        <w:r>
+          <w:rPr>
+            <w:rStyle w:val="Hyperlink"/>
+          </w:rPr>
+          <w:t xml:space="preserve">formal proofs</w:t>
+        </w:r>
+      </w:hyperlink>
+      <w:r>
+        <w:t xml:space="preserve"> </w:t>
+      </w:r>
+      <w:r>
+        <w:t xml:space="preserve">in</w:t>
+      </w:r>
+      <w:r>
+        <w:t xml:space="preserve"> </w:t>
+      </w:r>
+      <w:hyperlink w:anchor="def-propositional-logic">
+        <w:r>
+          <w:rPr>
+            <w:rStyle w:val="Hyperlink"/>
+          </w:rPr>
+          <w:t xml:space="preserve">propositional logic</w:t>
+        </w:r>
+      </w:hyperlink>
+      <w:r>
+        <w:t xml:space="preserve"> </w:t>
+      </w:r>
+      <w:r>
+        <w:t xml:space="preserve">and</w:t>
+      </w:r>
+      <w:r>
+        <w:t xml:space="preserve"> </w:t>
+      </w:r>
+      <w:hyperlink w:anchor="def-first-order-logic">
+        <w:r>
+          <w:rPr>
+            <w:rStyle w:val="Hyperlink"/>
+          </w:rPr>
+          <w:t xml:space="preserve">first-order logic</w:t>
+        </w:r>
+      </w:hyperlink>
+      <w:r>
+        <w:t xml:space="preserve">.</w:t>
       </w:r>
     </w:p>
-    <w:bookmarkEnd w:id="26"/>
-    <w:bookmarkStart w:id="32" w:name="references"/>
+    <w:bookmarkEnd w:id="47"/>
+    <w:bookmarkStart w:id="53" w:name="references"/>
     <w:p>
       <w:pPr>
         <w:pStyle w:val="Heading2"/>
@@ -4795,8 +7402,8 @@
         <w:t xml:space="preserve">References</w:t>
       </w:r>
     </w:p>
-    <w:bookmarkStart w:id="31" w:name="refs"/>
-    <w:bookmarkStart w:id="28" w:name="ref-barkerplummer2011language"/>
+    <w:bookmarkStart w:id="52" w:name="refs"/>
+    <w:bookmarkStart w:id="49" w:name="ref-barkerplummer2011language"/>
     <w:p>
       <w:pPr>
         <w:pStyle w:val="Bibliography"/>
@@ -4820,7 +7427,7 @@
       <w:r>
         <w:t xml:space="preserve"> </w:t>
       </w:r>
-      <w:hyperlink r:id="rId27">
+      <w:hyperlink r:id="rId48">
         <w:r>
           <w:rPr>
             <w:rStyle w:val="Hyperlink"/>
@@ -4832,8 +7439,8 @@
         <w:t xml:space="preserve">.</w:t>
       </w:r>
     </w:p>
-    <w:bookmarkEnd w:id="28"/>
-    <w:bookmarkStart w:id="30" w:name="ref-velleman2019prove"/>
+    <w:bookmarkEnd w:id="49"/>
+    <w:bookmarkStart w:id="51" w:name="ref-velleman2019prove"/>
     <w:p>
       <w:pPr>
         <w:pStyle w:val="Bibliography"/>
@@ -4857,7 +7464,7 @@
       <w:r>
         <w:t xml:space="preserve"> </w:t>
       </w:r>
-      <w:hyperlink r:id="rId29">
+      <w:hyperlink r:id="rId50">
         <w:r>
           <w:rPr>
             <w:rStyle w:val="Hyperlink"/>
@@ -4869,9 +7476,9 @@
         <w:t xml:space="preserve">.</w:t>
       </w:r>
     </w:p>
-    <w:bookmarkEnd w:id="30"/>
-    <w:bookmarkEnd w:id="31"/>
-    <w:bookmarkEnd w:id="32"/>
+    <w:bookmarkEnd w:id="51"/>
+    <w:bookmarkEnd w:id="52"/>
+    <w:bookmarkEnd w:id="53"/>
     <w:sectPr>
       <w:footnotePr>
         <w:numRestart w:val="eachSect"/>
@@ -5207,6 +7814,39 @@
     </w:lvlOverride>
   </w:num>
   <w:num w:numId="1003">
+    <w:abstractNumId w:val="991"/>
+  </w:num>
+  <w:num w:numId="1004">
+    <w:abstractNumId w:val="99411"/>
+    <w:lvlOverride w:ilvl="0">
+      <w:startOverride w:val="1"/>
+    </w:lvlOverride>
+    <w:lvlOverride w:ilvl="1">
+      <w:startOverride w:val="1"/>
+    </w:lvlOverride>
+    <w:lvlOverride w:ilvl="2">
+      <w:startOverride w:val="1"/>
+    </w:lvlOverride>
+    <w:lvlOverride w:ilvl="3">
+      <w:startOverride w:val="1"/>
+    </w:lvlOverride>
+    <w:lvlOverride w:ilvl="4">
+      <w:startOverride w:val="1"/>
+    </w:lvlOverride>
+    <w:lvlOverride w:ilvl="5">
+      <w:startOverride w:val="1"/>
+    </w:lvlOverride>
+    <w:lvlOverride w:ilvl="6">
+      <w:startOverride w:val="1"/>
+    </w:lvlOverride>
+    <w:lvlOverride w:ilvl="7">
+      <w:startOverride w:val="1"/>
+    </w:lvlOverride>
+    <w:lvlOverride w:ilvl="8">
+      <w:startOverride w:val="1"/>
+    </w:lvlOverride>
+  </w:num>
+  <w:num w:numId="1005">
     <w:abstractNumId w:val="991"/>
   </w:num>
 </w:numbering>

</xml_diff>

<commit_message>
Deploying to gh-pages from @ Morrison-Lab/mds@7185fc8ce7e35bc1dca3331a68474c5564749ffe 🚀
</commit_message>
<xml_diff>
--- a/proof-writing.docx
+++ b/proof-writing.docx
@@ -15,7 +15,7 @@
         <w:pStyle w:val="Date"/>
       </w:pPr>
       <w:r>
-        <w:t xml:space="preserve">Last modified: 2026-10-15 12:42:30 (PDT)</w:t>
+        <w:t xml:space="preserve">Last modified: 2026-10-15 13:39:21 (PDT)</w:t>
       </w:r>
     </w:p>
     <w:p>
@@ -224,7 +224,7 @@
         <w:t xml:space="preserve"> </w:t>
       </w:r>
       <w:r>
-        <w:t xml:space="preserve">is a sentence that is either true or false.</w:t>
+        <w:t xml:space="preserve">is a declarative sentence that is either true or false.</w:t>
       </w:r>
     </w:p>
     <w:bookmarkEnd w:id="9"/>
@@ -494,7 +494,7 @@
         <w:t xml:space="preserve"> </w:t>
       </w:r>
       <w:r>
-        <w:t xml:space="preserve">is a sentence about a variable</w:t>
+        <w:t xml:space="preserve">is a declarative sentence about a variable</w:t>
       </w:r>
       <w:r>
         <w:t xml:space="preserve"> </w:t>
@@ -23647,7 +23647,7 @@
     </w:p>
     <w:bookmarkEnd w:id="100"/>
     <w:bookmarkEnd w:id="101"/>
-    <w:bookmarkStart w:id="103" w:name="sec-further-reading"/>
+    <w:bookmarkStart w:id="106" w:name="sec-further-reading"/>
     <w:p>
       <w:pPr>
         <w:pStyle w:val="Heading2"/>
@@ -23774,8 +23774,115 @@
         <w:t xml:space="preserve">.</w:t>
       </w:r>
     </w:p>
-    <w:bookmarkEnd w:id="103"/>
-    <w:bookmarkStart w:id="109" w:name="references"/>
+    <w:p>
+      <w:pPr>
+        <w:pStyle w:val="FirstParagraph"/>
+      </w:pPr>
+      <w:r>
+        <w:t xml:space="preserve">Free course materials on formal logic:</w:t>
+      </w:r>
+    </w:p>
+    <w:p>
+      <w:pPr>
+        <w:pStyle w:val="Compact"/>
+        <w:numPr>
+          <w:ilvl w:val="0"/>
+          <w:numId w:val="1027"/>
+        </w:numPr>
+      </w:pPr>
+      <w:r>
+        <w:t xml:space="preserve">Thomas Icard’s</w:t>
+      </w:r>
+      <w:r>
+        <w:t xml:space="preserve"> </w:t>
+      </w:r>
+      <w:hyperlink r:id="rId103">
+        <w:r>
+          <w:rPr>
+            <w:rStyle w:val="Hyperlink"/>
+          </w:rPr>
+          <w:t xml:space="preserve">Phil 150/250, Mathematical Logic course notes</w:t>
+        </w:r>
+      </w:hyperlink>
+      <w:r>
+        <w:t xml:space="preserve"> </w:t>
+      </w:r>
+      <w:r>
+        <w:t xml:space="preserve">(Stanford) review sets, relations and functions,</w:t>
+      </w:r>
+      <w:r>
+        <w:t xml:space="preserve"> </w:t>
+      </w:r>
+      <w:r>
+        <w:t xml:space="preserve">then cover propositional, modal and first-order logic.</w:t>
+      </w:r>
+    </w:p>
+    <w:p>
+      <w:pPr>
+        <w:pStyle w:val="Compact"/>
+        <w:numPr>
+          <w:ilvl w:val="0"/>
+          <w:numId w:val="1027"/>
+        </w:numPr>
+      </w:pPr>
+      <w:r>
+        <w:t xml:space="preserve">John Wilcox’s</w:t>
+      </w:r>
+      <w:r>
+        <w:t xml:space="preserve"> </w:t>
+      </w:r>
+      <w:hyperlink r:id="rId104">
+        <w:r>
+          <w:rPr>
+            <w:rStyle w:val="Hyperlink"/>
+          </w:rPr>
+          <w:t xml:space="preserve">logic handouts</w:t>
+        </w:r>
+      </w:hyperlink>
+      <w:r>
+        <w:t xml:space="preserve"> </w:t>
+      </w:r>
+      <w:r>
+        <w:t xml:space="preserve">supplement the same Stanford course,</w:t>
+      </w:r>
+      <w:r>
+        <w:t xml:space="preserve"> </w:t>
+      </w:r>
+      <w:r>
+        <w:t xml:space="preserve">with a handout per week on the syntax and semantics of propositional and first-order logic, natural deduction and metalogic.</w:t>
+      </w:r>
+    </w:p>
+    <w:p>
+      <w:pPr>
+        <w:pStyle w:val="Compact"/>
+        <w:numPr>
+          <w:ilvl w:val="0"/>
+          <w:numId w:val="1027"/>
+        </w:numPr>
+      </w:pPr>
+      <w:r>
+        <w:t xml:space="preserve">Eric Pacuit’s</w:t>
+      </w:r>
+      <w:r>
+        <w:t xml:space="preserve"> </w:t>
+      </w:r>
+      <w:hyperlink r:id="rId105">
+        <w:r>
+          <w:rPr>
+            <w:rStyle w:val="Hyperlink"/>
+          </w:rPr>
+          <w:t xml:space="preserve">Phil 151: First Order Logic</w:t>
+        </w:r>
+      </w:hyperlink>
+      <w:r>
+        <w:t xml:space="preserve"> </w:t>
+      </w:r>
+      <w:r>
+        <w:t xml:space="preserve">(Stanford, Winter 2009) posts a syllabus, a modal logic study guide and problem sets.</w:t>
+      </w:r>
+    </w:p>
+    <w:bookmarkEnd w:id="106"/>
+    <w:bookmarkStart w:id="112" w:name="references"/>
     <w:p>
       <w:pPr>
         <w:pStyle w:val="Heading2"/>
@@ -23784,8 +23891,8 @@
         <w:t xml:space="preserve">References</w:t>
       </w:r>
     </w:p>
-    <w:bookmarkStart w:id="108" w:name="refs"/>
-    <w:bookmarkStart w:id="105" w:name="ref-barkerplummer2011language"/>
+    <w:bookmarkStart w:id="111" w:name="refs"/>
+    <w:bookmarkStart w:id="108" w:name="ref-barkerplummer2011language"/>
     <w:p>
       <w:pPr>
         <w:pStyle w:val="Bibliography"/>
@@ -23809,7 +23916,7 @@
       <w:r>
         <w:t xml:space="preserve"> </w:t>
       </w:r>
-      <w:hyperlink r:id="rId104">
+      <w:hyperlink r:id="rId107">
         <w:r>
           <w:rPr>
             <w:rStyle w:val="Hyperlink"/>
@@ -23821,8 +23928,8 @@
         <w:t xml:space="preserve">.</w:t>
       </w:r>
     </w:p>
-    <w:bookmarkEnd w:id="105"/>
-    <w:bookmarkStart w:id="107" w:name="ref-velleman2019prove"/>
+    <w:bookmarkEnd w:id="108"/>
+    <w:bookmarkStart w:id="110" w:name="ref-velleman2019prove"/>
     <w:p>
       <w:pPr>
         <w:pStyle w:val="Bibliography"/>
@@ -23846,7 +23953,7 @@
       <w:r>
         <w:t xml:space="preserve"> </w:t>
       </w:r>
-      <w:hyperlink r:id="rId106">
+      <w:hyperlink r:id="rId109">
         <w:r>
           <w:rPr>
             <w:rStyle w:val="Hyperlink"/>
@@ -23858,9 +23965,9 @@
         <w:t xml:space="preserve">.</w:t>
       </w:r>
     </w:p>
-    <w:bookmarkEnd w:id="107"/>
-    <w:bookmarkEnd w:id="108"/>
-    <w:bookmarkEnd w:id="109"/>
+    <w:bookmarkEnd w:id="110"/>
+    <w:bookmarkEnd w:id="111"/>
+    <w:bookmarkEnd w:id="112"/>
     <w:sectPr>
       <w:footnotePr>
         <w:numRestart w:val="eachSect"/>
@@ -24319,6 +24426,9 @@
     </w:lvlOverride>
   </w:num>
   <w:num w:numId="1026">
+    <w:abstractNumId w:val="991"/>
+  </w:num>
+  <w:num w:numId="1027">
     <w:abstractNumId w:val="991"/>
   </w:num>
 </w:numbering>

</xml_diff>